<commit_message>
Revisões: versões MDPI e do orientador da revisão de humor no handebol
Mesmo texto e mesmos dados da versão ABNT, nos leiautes da revisão de
mapeamento; a versão ABNT é regravada com as entidades HTML do Crossref
desfeitas nas referências.

Co-Authored-By: Claude Opus 5.5 <noreply@anthropic.com>
Claude-Session: https://claude.ai/code/session_01YXxWHB8jopLfGkYhcAQesG
</commit_message>
<xml_diff>
--- a/data/revisoes/handebol/atualizacao_humor_2026-10/revisao_sistematica_humor_handebol_atualizada.docx
+++ b/data/revisoes/handebol/atualizacao_humor_2026-10/revisao_sistematica_humor_handebol_atualizada.docx
@@ -256,7 +256,7 @@
           <w:i w:val="0"/>
           <w:sz w:val="24"/>
         </w:rPr>
-        <w:t>Apesar dessa relevância, a evidência sobre humor no handebol permanece dispersa. A revisão de mapeamento conduzida em paralelo por esta equipe identificou o humor e o afeto entre os domínios psicológicos investigados na modalidade, com estudos que relacionaram o humor ao horário do dia (ESSID et al., 2022), ao ciclo menstrual (MIRALLES-AMORÓS et al., 2023), à carga da temporada (BATALLA-GAVALDA et al., 2025) e ao estado endócrino (RATZ-SULYOK et al., 2026a). Há revisões sistemáticas sobre humor em contextos esportivos específicos, como a perda rápida de peso no judô (LAKICEVIC et al., 2024), mas não foram identificadas revisões que reúnam, com critérios explícitos, a evidência sobre estados de humor em atletas de handebol nem que avaliem a qualidade metodológica desses estudos.</w:t>
+        <w:t>Apesar dessa relevância, a evidência sobre humor no handebol permanece dispersa. A revisão de mapeamento conduzida em paralelo por esta equipe identificou o humor e o afeto entre os domínios psicológicos investigados na modalidade, com estudos que relacionaram o humor ao horário do dia (ESSID et al., 2022), ao ciclo menstrual (MIRALLES-AMORÓS et al., 2023), à carga da temporada (BATALLA-GAVALDA et al., 2025) e ao estado endócrino (RATZ-SULYOK et al., 2026b). Há revisões sistemáticas sobre humor em contextos esportivos específicos, como a perda rápida de peso no judô (LAKICEVIC et al., 2024), mas não foram identificadas revisões que reúnam, com critérios explícitos, a evidência sobre estados de humor em atletas de handebol nem que avaliem a qualidade metodológica desses estudos.</w:t>
       </w:r>
     </w:p>
     <w:p>
@@ -11263,7 +11263,7 @@
                 <w:i w:val="0"/>
                 <w:sz w:val="16"/>
               </w:rPr>
-              <w:t>Ratz-Sulyok et al. (2026a)</w:t>
+              <w:t>Ratz-Sulyok et al. (2026b)</w:t>
             </w:r>
           </w:p>
         </w:tc>
@@ -11695,7 +11695,7 @@
                 <w:i w:val="0"/>
                 <w:sz w:val="16"/>
               </w:rPr>
-              <w:t>Ratz-Sulyok et al. (2026b)</w:t>
+              <w:t>Ratz-Sulyok et al. (2026a)</w:t>
             </w:r>
           </w:p>
         </w:tc>
@@ -14977,7 +14977,7 @@
           <w:b/>
           <w:sz w:val="24"/>
         </w:rPr>
-        <w:t>Medicine &amp;amp; Science in Sports &amp;amp; Exercise</w:t>
+        <w:t>Medicine &amp; Science in Sports &amp; Exercise</w:t>
       </w:r>
       <w:r>
         <w:rPr>
@@ -15628,7 +15628,7 @@
           <w:b/>
           <w:sz w:val="24"/>
         </w:rPr>
-        <w:t>Science &amp;amp; Sports</w:t>
+        <w:t>Science &amp; Sports</w:t>
       </w:r>
       <w:r>
         <w:rPr>
@@ -16117,7 +16117,7 @@
           <w:i w:val="0"/>
           <w:sz w:val="24"/>
         </w:rPr>
-        <w:t>, v. 14, n. 7, e289, 2026a. DOI: https://doi.org/10.3390/sports14070289.</w:t>
+        <w:t>, v. 14, n. 7, e289, 2026b. DOI: https://doi.org/10.3390/sports14070289.</w:t>
       </w:r>
     </w:p>
     <w:p>
@@ -25589,7 +25589,7 @@
                 <w:i w:val="0"/>
                 <w:sz w:val="14"/>
               </w:rPr>
-              <w:t>Ratz-Sulyok et al. (2026a)</w:t>
+              <w:t>Ratz-Sulyok et al. (2026b)</w:t>
             </w:r>
           </w:p>
         </w:tc>
@@ -26071,7 +26071,7 @@
                 <w:i w:val="0"/>
                 <w:sz w:val="14"/>
               </w:rPr>
-              <w:t>Ratz-Sulyok et al. (2026b)</w:t>
+              <w:t>Ratz-Sulyok et al. (2026a)</w:t>
             </w:r>
           </w:p>
         </w:tc>

</xml_diff>

<commit_message>
Revisões: introdução e discussão da revisão de humor com literatura de 2021 a 2026
43 citações novas (consenso do COI de 2026, metanálises de sono, sexo, música,
ciclo menstrual e COVID-19, carga no futebol e no rúgbi, clima motivacional e
encorajamento verbal), conferidas no Crossref e ligadas ao trecho do resumo
que sustenta cada afirmação; versões ABNT, MDPI e do orientador regravadas.

Co-Authored-By: Claude Opus 5.5 <noreply@anthropic.com>
Claude-Session: https://claude.ai/code/session_01YXxWHB8jopLfGkYhcAQesG
</commit_message>
<xml_diff>
--- a/data/revisoes/handebol/atualizacao_humor_2026-10/revisao_sistematica_humor_handebol_atualizada.docx
+++ b/data/revisoes/handebol/atualizacao_humor_2026-10/revisao_sistematica_humor_handebol_atualizada.docx
@@ -196,7 +196,7 @@
           <w:i w:val="0"/>
           <w:sz w:val="24"/>
         </w:rPr>
-        <w:t>O estado de humor designa uma disposição afetiva difusa, de intensidade moderada e duração variável, que persiste além do evento desencadeador e influencia a avaliação dos acontecimentos subsequentes (BEEDIE; TERRY; LANE, 2005; LAZARUS, 2000). Essa propriedade distingue o humor da emoção, que responde a um objeto identificável e se extingue com ele, e justifica sua medida em dimensões separadas, como tensão, depressão, raiva, vigor, fadiga e confusão, em vez de um escore único de bem-estar (LANE; TERRY, 2000; MEYERS; TAMIR, 2024). No esporte, o humor ocupa posição particular entre as medidas psicológicas: situa-se entre a resposta transitória à carga e o sinal precoce de sofrimento mental, condição que o tornou indicador de bem-estar e de tolerância ao treinamento (GOUTTEBARGE et al., 2019; REARDON et al., 2019; TERRY; PARSONS-SMITH, 2021).</w:t>
+        <w:t>O estado de humor designa uma disposição afetiva difusa, de intensidade moderada e duração variável, que persiste além do evento desencadeador e influencia a avaliação dos acontecimentos subsequentes (BEEDIE; TERRY; LANE, 2005; LAZARUS, 2000). Essa propriedade distingue o humor da emoção, que responde a um objeto identificável e se extingue com ele, e justifica sua medida em dimensões separadas, como tensão, depressão, raiva, vigor, fadiga e confusão, em vez de um escore único de bem-estar (LANE; TERRY, 2000; MEYERS; TAMIR, 2024). Na atividade física, distingue-se ainda a resposta afetiva ao exercício do afeto incidental, sem relação com o comportamento-alvo (STEVENS et al., 2020), e o modelo circumplexo avalia a valência e a ativação afetivas, embora com inconsistências quanto aos momentos e aos métodos de medida (EVMENENKO; TEIXEIRA, 2022).</w:t>
       </w:r>
     </w:p>
     <w:p>
@@ -211,7 +211,7 @@
           <w:i w:val="0"/>
           <w:sz w:val="24"/>
         </w:rPr>
-        <w:t>Essa dupla função originou-se de um problema aplicado. O acompanhamento psicométrico de atletas submetidos a variação programada da carga mostrou que a perturbação do perfil de humor acompanha o aumento da carga e regride com a recuperação (MORGAN et al., 1987; RAGLIN, 2001). A consolidação instrumental ocorreu depois, com valores normativos para amostras atléticas (TERRY; LANE, 2000), a versão abreviada validada para adultos, a Brunel Mood Scale (TERRY; LANE; FOGARTY, 2003), sua adaptação brasileira (ROHLFS et al., 2008) e validações transculturais recentes (HAN; PARSONS-SMITH; TERRY, 2020; TERRY et al., 2022). Outras famílias de instrumentos ocupam espaços próprios, como as escalas de afeto positivo e negativo (WATSON; CLARK; TELLEGEN, 1988) e as escalas de valência afetiva durante o esforço (EKKEKAKIS; BRAND, 2019; HARDY; REJESKI, 1989), e tratá-las como equivalentes compromete a síntese.</w:t>
+        <w:t>No esporte, o humor situa-se entre a resposta transitória à carga e o sinal precoce de sofrimento mental, condição que o tornou indicador de bem-estar e de tolerância ao treinamento (GOUTTEBARGE et al., 2019; REARDON et al., 2019; TERRY; PARSONS-SMITH, 2021). O consenso atualizado do Comitê Olímpico Internacional reafirmou que sintomas e transtornos mentais são comuns em atletas de elite e podem afetar o desempenho, e recomendou seu monitoramento rotineiro com instrumentos validados (REARDON et al., 2026). Nessa população, as prevalências de sintomas autorrelatados variaram de 4%, para o uso indevido de drogas, a 33%, para o sofrimento psíquico (GOUTTEBARGE et al., 2026).</w:t>
       </w:r>
     </w:p>
     <w:p>
@@ -226,7 +226,7 @@
           <w:i w:val="0"/>
           <w:sz w:val="24"/>
         </w:rPr>
-        <w:t>A relação entre humor e desempenho, por sua vez, permanece em debate. Metanálises clássicas e recentes associaram vigor elevado e baixos escores de tensão, depressão, raiva, fadiga e confusão a melhor desempenho, com efeitos de magnitude pequena a moderada, dependentes do tipo de esporte e do momento da medida (BEEDIE; TERRY; LANE, 2000; LOCHBAUM et al., 2021). A identificação de perfis de humor, que agrupa atletas segundo a configuração das seis dimensões, ampliou o uso aplicado da medida e revelou padrões de risco em atletas de elite e de formação (DE MIRANDA ROHLFS et al., 2024; PARSONS-SMITH; TERRY; MACHIN, 2017). No monitoramento da carga, as medidas autorrelatadas de humor e de recuperação mostraram-se mais sensíveis que muitos marcadores objetivos (KELLMANN et al., 2018; SAW; MAIN; GASTIN, 2016), e intervenções sobre o sono, por exemplo, produzem efeitos mensuráveis no humor de atletas (GWYTHER et al., 2022).</w:t>
+        <w:t>A função do humor no monitoramento originou-se de um problema aplicado. O acompanhamento psicométrico de atletas submetidos a variação programada da carga mostrou que a perturbação do perfil de humor acompanha o aumento da carga e regride com a recuperação (MORGAN et al., 1987; RAGLIN, 2001). A consolidação instrumental ocorreu depois, com valores normativos para amostras atléticas (TERRY; LANE, 2000), a versão abreviada validada para adultos, a Brunel Mood Scale (TERRY; LANE; FOGARTY, 2003), sua adaptação brasileira (ROHLFS et al., 2008) e validações transculturais recentes (HAN; PARSONS-SMITH; TERRY, 2020; TERRY et al., 2022; VLACHOPOULOS; LANE; TERRY, 2023). Outras famílias de instrumentos ocupam espaços próprios, como as escalas de afeto positivo e negativo (WATSON; CLARK; TELLEGEN, 1988) e as escalas de valência afetiva durante o esforço (EKKEKAKIS; BRAND, 2019; HARDY; REJESKI, 1989), e tratá-las como equivalentes compromete a síntese. No monitoramento da carga, as medidas autorrelatadas de humor e de recuperação mostraram-se mais sensíveis que muitos marcadores objetivos (KELLMANN et al., 2018; SAW; MAIN; GASTIN, 2016). Os itens únicos mais usados na ciência do esporte, contudo, não foram validados (JEFFRIES et al., 2020), e os métodos de amostragem de experiência surgem como alternativa que reduz o viés retrospectivo (MAJER et al., 2026).</w:t>
       </w:r>
     </w:p>
     <w:p>
@@ -241,7 +241,7 @@
           <w:i w:val="0"/>
           <w:sz w:val="24"/>
         </w:rPr>
-        <w:t>No handebol, essas questões assumem forma específica. A modalidade é intermitente, de alta intensidade e de contato constante (MICHALSIK; AAGAARD; MADSEN, 2012; PÓVOAS et al., 2012), com demandas que variam conforme a posição e o sistema defensivo (SAAL et al., 2026; WAGNER; RADIC; HINZ, 2025). O regulamento impõe situações de pressão contínua, como o ataque com goleiro substituído (GÜMÜŞ; GENÇOĞLU, 2020; MACEDO et al., 2025), a inferioridade numérica nas exclusões (TREJO-SILVA et al., 2025) e o tempo técnico em jogos equilibrados (JETZKE; WINTER, 2022), e o jogador decide em frações de segundo sob oposição direta do adversário (HINZ et al., 2022; RAAB; JOHNSON, 2007). Além disso, o clima criado pelo treinador e as interações do grupo modulam as emoções dos atletas (ROBAZZA et al., 2022; TAMMINEN et al., 2019). Nesse cenário, o humor interessa tanto como resposta à carga física e ao calendário quanto como estado que antecede e acompanha decisões sob pressão.</w:t>
+        <w:t>A relação entre humor e desempenho, por sua vez, permanece em debate. Metanálises clássicas e recentes associaram vigor elevado e baixos escores de tensão, depressão, raiva, fadiga e confusão a melhor desempenho, com efeitos de magnitude pequena a moderada, dependentes do tipo de esporte e do momento da medida (BEEDIE; TERRY; LANE, 2000; LOCHBAUM et al., 2021). Em síntese de 30 metanálises, variáveis consideradas prejudiciais, como a ansiedade cognitiva e a depressão, tiveram efeito negativo pequeno sobre o desempenho (d = −0,21) (LOCHBAUM et al., 2022). Os perfis de humor ampliaram o uso aplicado da medida e revelaram padrões de risco em atletas de elite e de formação (DE MIRANDA ROHLFS et al., 2024; PARSONS-SMITH; TERRY; MACHIN, 2017), mas o humor como sinal de sobrecarga carece de confirmação: nenhum estudo documentou a transição até a síndrome de overtraining com evidência objetiva de queda prolongada do desempenho (WEAKLEY; HALSON; MUJIKA, 2022). Em contrapartida, intervenções sobre o sono, por exemplo, produzem efeitos mensuráveis no humor de atletas (GWYTHER et al., 2022).</w:t>
       </w:r>
     </w:p>
     <w:p>
@@ -256,7 +256,22 @@
           <w:i w:val="0"/>
           <w:sz w:val="24"/>
         </w:rPr>
-        <w:t>Apesar dessa relevância, a evidência sobre humor no handebol permanece dispersa. A revisão de mapeamento conduzida em paralelo por esta equipe identificou o humor e o afeto entre os domínios psicológicos investigados na modalidade, com estudos que relacionaram o humor ao horário do dia (ESSID et al., 2022), ao ciclo menstrual (MIRALLES-AMORÓS et al., 2023), à carga da temporada (BATALLA-GAVALDA et al., 2025) e ao estado endócrino (RATZ-SULYOK et al., 2026b). Há revisões sistemáticas sobre humor em contextos esportivos específicos, como a perda rápida de peso no judô (LAKICEVIC et al., 2024), mas não foram identificadas revisões que reúnam, com critérios explícitos, a evidência sobre estados de humor em atletas de handebol nem que avaliem a qualidade metodológica desses estudos.</w:t>
+        <w:t>No handebol, essas questões assumem forma específica. A modalidade é intermitente, de alta intensidade e de contato constante (MICHALSIK; AAGAARD; MADSEN, 2012; PÓVOAS et al., 2012), com perfis físicos e técnicos distintos entre armadores, pontas e pivôs (GARCÍA-SÁNCHEZ et al., 2023) e demandas que variam conforme a posição e o sistema defensivo (SAAL et al., 2026; WAGNER; RADIC; HINZ, 2025). No handebol de praia juvenil, as medidas objetivas e subjetivas de carga interna relacionaram-se com a carga externa (IANNACCONE et al., 2022). O regulamento impõe situações de pressão contínua, como o ataque com goleiro substituído (GÜMÜŞ; GENÇOĞLU, 2020; MACEDO et al., 2025), cujo uso depende do placar e do momento do jogo (PRUDENTE et al., 2024), a inferioridade numérica nas exclusões (TREJO-SILVA et al., 2025) e o tempo técnico em jogos equilibrados (JETZKE; WINTER, 2022), e o jogador decide em frações de segundo sob oposição direta do adversário (HINZ et al., 2022; RAAB; JOHNSON, 2007). Além disso, o clima criado pelo treinador e as interações do grupo modulam as emoções dos atletas (ROBAZZA et al., 2022; TAMMINEN et al., 2019). Em handebolistas jovens, o comportamento controlador percebido do treinador predisse mais ansiedade (WANG et al., 2024), e o clima orientado à tarefa associou-se a menos sintomas de ansiedade, depressão e estresse (GREBLO JURAKIĆ; BOJIĆ-ĆAĆIĆ; LJUBIČIĆ, 2026); em jogadores de elite, a intervenção baseada em mindfulness reduziu a frustração percebida (STAIANO et al., 2026). Nesse cenário, o humor interessa tanto como resposta à carga física e ao calendário quanto como estado que antecede e acompanha decisões sob pressão.</w:t>
+      </w:r>
+    </w:p>
+    <w:p>
+      <w:pPr>
+        <w:spacing w:before="0" w:after="0" w:line="360" w:lineRule="auto"/>
+        <w:ind w:left="0" w:firstLine="709"/>
+        <w:jc w:val="both"/>
+      </w:pPr>
+      <w:r>
+        <w:rPr>
+          <w:rFonts w:ascii="Times New Roman" w:hAnsi="Times New Roman"/>
+          <w:i w:val="0"/>
+          <w:sz w:val="24"/>
+        </w:rPr>
+        <w:t>Apesar dessa relevância, a evidência sobre humor no handebol permanece dispersa. A revisão de mapeamento conduzida em paralelo por esta equipe identificou o humor e o afeto entre os domínios psicológicos investigados na modalidade, com estudos que relacionaram o humor ao horário do dia (ESSID et al., 2022), ao ciclo menstrual (MIRALLES-AMORÓS et al., 2023), à carga da temporada (BATALLA-GAVALDA et al., 2025) e ao estado endócrino (RATZ-SULYOK et al., 2026b). Há revisões sobre humor em contextos específicos, como a perda rápida de peso no judô (LAKICEVIC et al., 2024) e o futebol (SELMI et al., 2023), mas não foram identificadas revisões que reúnam, com critérios explícitos, a evidência sobre estados de humor em atletas de handebol nem que avaliem a qualidade metodológica desses estudos.</w:t>
       </w:r>
     </w:p>
     <w:p>
@@ -13150,7 +13165,7 @@
           <w:i w:val="0"/>
           <w:sz w:val="24"/>
         </w:rPr>
-        <w:t>A produção sobre o tema é recente e reduzida, com menos de dois estudos por ano. O predomínio de amostras femininas contrasta com o desequilíbrio usual das ciências do esporte e reproduz o padrão da revisão de mapeamento paralela, mas convive com amostras pequenas, com mediana de 25 participantes, e com a omissão do sexo em parte dos estudos. Como o humor varia com a fase do ciclo menstrual (GHAZEL et al., 2022; LISENCHUK et al., 2019), ainda que um estudo com oito jogadoras não tenha detectado diferença (MORENAS-AGUILAR et al., 2023), a amostra mista sem separação por sexo impede justamente a comparação de interesse. A concentração na Espanha, na Tunísia e no Brasil, somada a estudos do Irã, do Iraque e da Jordânia, revela um campo internacional, porém apoiado em versões traduzidas dos instrumentos, cuja equivalência transcultural nem sempre foi verificada (HAN; PARSONS-SMITH; TERRY, 2020; TERRY et al., 2022).</w:t>
+        <w:t>A produção sobre o tema é recente e reduzida, com menos de dois estudos por ano. O predomínio de amostras femininas contrasta com o desequilíbrio usual das ciências do esporte e reproduz o padrão da revisão de mapeamento paralela, mas convive com amostras pequenas, com mediana de 25 participantes, e com a omissão do sexo em parte dos estudos. Essa omissão é relevante, pois atletas de elite do sexo feminino relatam mais ansiedade e depressão que os do sexo masculino (KEW et al., 2025; KUO et al., 2025). Como o humor varia com a fase do ciclo menstrual (GHAZEL et al., 2022; LISENCHUK et al., 2019), ainda que um estudo com oito jogadoras não tenha detectado diferença (MORENAS-AGUILAR et al., 2023), a amostra mista sem separação por sexo impede justamente a comparação de interesse. A divergência repete a literatura geral, em que apenas estudos isolados relataram efeitos do ciclo sobre o humor (PALUDO et al., 2022) e em que os efeitos do ciclo sobre o desempenho de atletas de elite permanecem inconclusivos (MEIGNIÉ et al., 2021). A concentração na Espanha, na Tunísia e no Brasil, somada a estudos do Irã, do Iraque e da Jordânia, revela um campo internacional, porém apoiado em versões traduzidas dos instrumentos, cuja equivalência transcultural nem sempre foi verificada (HAN; PARSONS-SMITH; TERRY, 2020; TERRY et al., 2022), verificação necessária, pois o POMS abreviado não manteve sua estrutura original em atletas chineses (TAN et al., 2024).</w:t>
       </w:r>
     </w:p>
     <w:p>
@@ -13181,7 +13196,22 @@
           <w:i w:val="0"/>
           <w:sz w:val="24"/>
         </w:rPr>
-        <w:t>O POMS respondeu por mais da metade dos estudos, em versões de 30 a 65 itens, o que dificulta a comparação direta dos escores. Sua versão abreviada, a Brunel Mood Scale, foi concebida para a aplicação repetida no treinamento (ROHLFS et al., 2008; TERRY; LANE; FOGARTY, 2003), mas apareceu em apenas três estudos. As escalas de afeto, como o PANAS e a Feeling Scale, medem outro construto, a valência afetiva geral ou momentânea (EKKEKAKIS; BRAND, 2019; HARDY; REJESKI, 1989; WATSON; CLARK; TELLEGEN, 1988), e não devem ser somadas ao perfil de humor. O ponto mais crítico é o momento da medida. Um mesmo escore de vigor tem significados distintos antes de um jogo decisivo, após uma sessão de carga elevada ou em um dia de descanso, e a ausência dessa informação em parte dos estudos limita a leitura do conjunto (BEEDIE; TERRY; LANE, 2000; LOCHBAUM et al., 2021).</w:t>
+        <w:t>O POMS respondeu por mais da metade dos estudos, em versões de 30 a 65 itens, o que dificulta a comparação direta dos escores. Sua versão abreviada, a Brunel Mood Scale, foi concebida para a aplicação repetida no treinamento (ROHLFS et al., 2008; TERRY; LANE; FOGARTY, 2003), mas apareceu em apenas três estudos. As escalas de múltiplos itens têm, em grande parte, propriedades de medida aceitáveis, ao passo que os itens únicos mais usados não foram validados (JEFFRIES et al., 2020). As escalas de afeto, como o PANAS e a Feeling Scale, medem outro construto, a valência afetiva geral ou momentânea (EKKEKAKIS; BRAND, 2019; HARDY; REJESKI, 1989; WATSON; CLARK; TELLEGEN, 1988), e não devem ser somadas ao perfil de humor; além disso, o momento de aplicação da Feeling Scale não é padronizado (BASTOS et al., 2023).</w:t>
+      </w:r>
+    </w:p>
+    <w:p>
+      <w:pPr>
+        <w:spacing w:before="0" w:after="0" w:line="360" w:lineRule="auto"/>
+        <w:ind w:left="0" w:firstLine="709"/>
+        <w:jc w:val="both"/>
+      </w:pPr>
+      <w:r>
+        <w:rPr>
+          <w:rFonts w:ascii="Times New Roman" w:hAnsi="Times New Roman"/>
+          <w:i w:val="0"/>
+          <w:sz w:val="24"/>
+        </w:rPr>
+        <w:t>O ponto mais crítico é o momento da medida. Um mesmo escore de vigor tem significados distintos antes de um jogo decisivo, após uma sessão de carga elevada ou em um dia de descanso, e a ausência dessa informação em parte dos estudos limita a leitura do conjunto (BEEDIE; TERRY; LANE, 2000; LOCHBAUM et al., 2021). O horário integra esse problema: no handebol, jogadores de elite tiveram mais estados negativos pela manhã (ESSID et al., 2022), e o desempenho neuromuscular em esportes coletivos foi maior no fim da tarde ou no início da noite (MARTIN-LÓPEZ et al., 2025), mas os sinais do horário do exercício sobre o humor ainda não sustentam recomendações definitivas (HU; CHEN, 2026).</w:t>
       </w:r>
     </w:p>
     <w:p>
@@ -13212,7 +13242,22 @@
           <w:i w:val="0"/>
           <w:sz w:val="24"/>
         </w:rPr>
-        <w:t>Os estudos de temporada mostraram variações de dimensões isoladas, como a fadiga, a raiva, o vigor e a tensão, sem alteração da perturbação total do humor (BRESCIANI et al., 2010; MONTES; GOMES, 2014; PADILHAS et al., 2018). Esse padrão é coerente com o uso clássico do perfil de humor no monitoramento da carga (MORGAN et al., 1987; RAGLIN, 2001) e com a superioridade das medidas autorrelatadas na detecção de respostas ao treinamento (KELLMANN et al., 2018; SAW; MAIN; GASTIN, 2016). Sugere, ainda, que o escore total pode ocultar mudanças relevantes em dimensões específicas, razão pela qual a leitura do perfil tem sido preferida à da soma (LANE; TERRY, 2000; PARSONS-SMITH; TERRY; MACHIN, 2017). A relação com o desempenho físico foi pouco explorada, e a ausência de correlação entre a variação da condição física e o humor (MONTES; GOMES, 2014) não permite conclusões, dado o tamanho das amostras. O acompanhamento mensal de 37 jovens jogadores reforça essa cautela, pois o POMS teve sensibilidade inferior a 20% para mudanças do desempenho físico (BUCHHEIT, 2015), resultado compatível com a insuficiência da frequência mensal para captar a resposta à carga. Em contrapartida, medidas repetidas em cada sessão revelaram associação entre o prazer e a carga física em jogadoras adolescentes (BUGTEN et al., 2026), o que indica que a resolução temporal da medida condiciona o achado.</w:t>
+        <w:t>Os estudos de temporada mostraram variações de dimensões isoladas, como a fadiga, a raiva, o vigor e a tensão, sem alteração da perturbação total do humor (BRESCIANI et al., 2010; MONTES; GOMES, 2014; PADILHAS et al., 2018). Esse padrão é coerente com o uso clássico do perfil de humor no monitoramento da carga (MORGAN et al., 1987; RAGLIN, 2001) e com a superioridade das medidas autorrelatadas na detecção de respostas ao treinamento (KELLMANN et al., 2018; SAW; MAIN; GASTIN, 2016). Converge também com o futebol, em que os escores do POMS se relacionaram à variação da carga (SELMI et al., 2023), e com o rúgbi de elite, em que cargas diárias predisseram queda do humor com defasagens variáveis (CREWTHER et al., 2025). Sugere, ainda, que o escore total pode ocultar mudanças relevantes em dimensões específicas, razão pela qual a leitura do perfil tem sido preferida à da soma (LANE; TERRY, 2000; PARSONS-SMITH; TERRY; MACHIN, 2017). Convém notar, porém, que as alterações de humor em atletas de elite com overreaching não funcional ou overtraining apoiam-se em evidência limitada e heterogênea (VALDESALICI et al., 2026), e nenhum estudo documentou a transição até o overtraining com queda prolongada do desempenho (WEAKLEY; HALSON; MUJIKA, 2022).</w:t>
+      </w:r>
+    </w:p>
+    <w:p>
+      <w:pPr>
+        <w:spacing w:before="0" w:after="0" w:line="360" w:lineRule="auto"/>
+        <w:ind w:left="0" w:firstLine="709"/>
+        <w:jc w:val="both"/>
+      </w:pPr>
+      <w:r>
+        <w:rPr>
+          <w:rFonts w:ascii="Times New Roman" w:hAnsi="Times New Roman"/>
+          <w:i w:val="0"/>
+          <w:sz w:val="24"/>
+        </w:rPr>
+        <w:t>A relação com o desempenho físico foi pouco explorada, e a ausência de correlação entre a variação da condição física e o humor (MONTES; GOMES, 2014) não permite conclusões, dado o tamanho das amostras. O acompanhamento mensal de 37 jovens jogadores reforça essa cautela, pois o POMS teve sensibilidade inferior a 20% para mudanças do desempenho físico (BUCHHEIT, 2015), resultado compatível com a insuficiência da frequência mensal para captar a resposta à carga. Em contrapartida, medidas repetidas em cada sessão revelaram associação entre o prazer e a carga física em jogadoras adolescentes (BUGTEN et al., 2026), o que indica que a resolução temporal da medida condiciona o achado. A frequência, contudo, não basta, pois itens únicos de bem-estar, entre eles o humor, associaram-se de modo predominantemente trivial a moderado à carga (DUIGNAN et al., 2020).</w:t>
       </w:r>
     </w:p>
     <w:p>
@@ -13243,7 +13288,22 @@
           <w:i w:val="0"/>
           <w:sz w:val="24"/>
         </w:rPr>
-        <w:t>A competição oficial revelou o humor como estado sensível ao resultado e ao significado do jogo. A vitória associou-se a humor mais positivo, e esse estado explicou parte das diferenças cognitivas observadas após a partida (LAGNER et al., 2015), o que conecta o humor às exigências de atenção e de memória de uma modalidade decidida sob pressão do adversário. O jogo oficial produziu perfil de humor menos perturbado que testes máximos de laboratório e de campo (BATALLA-GAVALDA et al., 2025, 2026), achado que evidencia a especificidade do contexto competitivo e questiona a extrapolação de respostas afetivas obtidas em testes padronizados. A variação da fadiga e do vigor após a partida, associada ao limiar de dor no ombro (OBREGÓN SIBÓN et al., 2017), sugere ainda que o perfil de humor pós-jogo acompanha o estado físico do atleta. Em atletas de praia, as habilidades psicológicas e a autoconfiança associaram-se a humor mais favorável na véspera da competição (REIGAL et al., 2020), em consonância com os modelos que vinculam a regulação emocional e o clima social ao estado afetivo dos atletas (MEYERS; TAMIR, 2024; ROBAZZA et al., 2022; TAMMINEN et al., 2019). O confinamento pela pandemia, situação extrema de privação do treino coletivo e da competição, elevou a perturbação do humor de jogadoras jovens acima da observada em atletas de modalidade individual (BATALLA-GAVALDA et al., 2021), e a solidão explicou parte do afeto de jogadores juniores (IVANOVIĆ; IVANOVIĆ, 2023). Esses achados reforçam o papel do convívio da equipe no estado afetivo.</w:t>
+        <w:t>A competição oficial revelou o humor como estado sensível ao resultado e ao significado do jogo. A vitória associou-se a humor mais positivo, e esse estado explicou parte das diferenças cognitivas observadas após a partida (LAGNER et al., 2015), o que conecta o humor às exigências de atenção e de memória de uma modalidade decidida sob pressão do adversário. No futebol profissional, a vitória também se associou a mais prazer e melhor bem-estar (FESSI; MOALLA, 2018), e, no basquetebol 3 × 3, a derrota e o jogo equilibrado associaram-se a maior percepção de esforço (SANSONE et al., 2025). No handebol, o bem-estar no dia do jogo interagiu com o tipo de partida sobre o resultado da equipe, embora medido por questionário não validado (HENZE et al., 2026). O jogo oficial produziu perfil de humor menos perturbado que testes máximos de laboratório e de campo (BATALLA-GAVALDA et al., 2025, 2026), achado que evidencia a especificidade do contexto competitivo e questiona a extrapolação de respostas afetivas obtidas em testes padronizados. A variação da fadiga e do vigor após a partida, associada ao limiar de dor no ombro (OBREGÓN SIBÓN et al., 2017), sugere ainda que o perfil de humor pós-jogo acompanha o estado físico do atleta. Em atletas de praia, as habilidades psicológicas e a autoconfiança associaram-se a humor mais favorável na véspera da competição (REIGAL et al., 2020), em consonância com os modelos que vinculam a regulação emocional e o clima social ao estado afetivo dos atletas (MEYERS; TAMIR, 2024; ROBAZZA et al., 2022; TAMMINEN et al., 2019).</w:t>
+      </w:r>
+    </w:p>
+    <w:p>
+      <w:pPr>
+        <w:spacing w:before="0" w:after="0" w:line="360" w:lineRule="auto"/>
+        <w:ind w:left="0" w:firstLine="709"/>
+        <w:jc w:val="both"/>
+      </w:pPr>
+      <w:r>
+        <w:rPr>
+          <w:rFonts w:ascii="Times New Roman" w:hAnsi="Times New Roman"/>
+          <w:i w:val="0"/>
+          <w:sz w:val="24"/>
+        </w:rPr>
+        <w:t>O confinamento pela pandemia, situação extrema de privação do treino coletivo e da competição, elevou a perturbação do humor de jogadoras jovens acima da observada em atletas de modalidade individual (BATALLA-GAVALDA et al., 2021), e a solidão explicou parte do afeto de jogadores juniores (IVANOVIĆ; IVANOVIĆ, 2023). Esses achados reforçam o papel do convívio da equipe no estado afetivo e convergem com a pior saúde mental de atletas na pandemia, atenuada pelo treino domiciliar (JIA et al., 2023), com a associação do apoio social a menos ansiedade e depressão (LUO et al., 2025) e com a solidão como preditora de burnout em atletas adolescentes (PACEWICZ; SMITH; FRANK, 2025).</w:t>
       </w:r>
     </w:p>
     <w:p>
@@ -13274,7 +13334,22 @@
           <w:i w:val="0"/>
           <w:sz w:val="24"/>
         </w:rPr>
-        <w:t>As intervenções mais consistentes foram de natureza social e verbal. O encorajamento verbal individual e o encorajamento combinado com instrução técnica melhoraram o humor e a valência afetiva durante a prática (AYDI et al., 2025; SAHLI et al., 2022, 2024), e o feedback negativo reduziu o afeto positivo (SOTO; GARCÍA-HERRERO; CARCEDO, 2020). Esses resultados indicam que a comunicação do treinador ou do professor é, por si, um determinante do estado afetivo no handebol. A ausência de efeito do feedback comparativo na primeira divisão (GARCÍA-HERRERO et al., 2022) sugere que o nível competitivo e a relação com o treinador moderam essa influência. As intervenções nutricionais produziram efeitos pequenos e inconsistentes (ASSUNÇÃO CARVALHO et al., 2018; MIRALLES-AMORÓS et al., 2023), e as intervenções psicológicas e musicais foram descritas de modo insuficiente para replicação (AL-WATTAR; AL-BADRANE, 2014; DIACHENKO; TYSHCHENKO, 2025; KHAZDOZI; BAHARI; ASHAYERI, 2017). Nenhuma intervenção testou estratégias de recuperação ou de sono, embora a literatura geral indique efeitos das intervenções de sono sobre o humor de atletas (GWYTHER et al., 2022).</w:t>
+        <w:t>As intervenções mais consistentes foram de natureza social e verbal. O encorajamento verbal individual e o encorajamento combinado com instrução técnica melhoraram o humor e a valência afetiva durante a prática (AYDI et al., 2025; SAHLI et al., 2022, 2024), e o feedback negativo reduziu o afeto positivo (SOTO; GARCÍA-HERRERO; CARCEDO, 2020). No futebol, o encorajamento verbal elevou a carga interna e o desempenho técnico na maioria dos estudos, sobretudo em jovens e amadores (SELMI et al., 2026), e, no basquetebol juvenil, aumentou o prazer e também a fadiga (YILMAZ et al., 2025). Esses resultados indicam que a comunicação do treinador ou do professor é, por si, um determinante do estado afetivo no handebol. A ausência de efeito do feedback comparativo na primeira divisão (GARCÍA-HERRERO et al., 2022) sugere que o nível competitivo e a relação com o treinador moderam essa influência, hipótese compatível com a relação atenuada entre clima motivacional e afeto em atletas de elite (LOCHBAUM; SISNEROS, 2024).</w:t>
+      </w:r>
+    </w:p>
+    <w:p>
+      <w:pPr>
+        <w:spacing w:before="0" w:after="0" w:line="360" w:lineRule="auto"/>
+        <w:ind w:left="0" w:firstLine="709"/>
+        <w:jc w:val="both"/>
+      </w:pPr>
+      <w:r>
+        <w:rPr>
+          <w:rFonts w:ascii="Times New Roman" w:hAnsi="Times New Roman"/>
+          <w:i w:val="0"/>
+          <w:sz w:val="24"/>
+        </w:rPr>
+        <w:t>As intervenções nutricionais produziram efeitos pequenos e inconsistentes (ASSUNÇÃO CARVALHO et al., 2018; MIRALLES-AMORÓS et al., 2023). Já o efeito da cafeína sobre o humor foi maior em boxeadores de elite que em atletas recreacionais (JODRA et al., 2020). As intervenções psicológicas e musicais foram descritas de modo insuficiente para replicação (AL-WATTAR; AL-BADRANE, 2014; DIACHENKO; TYSHCHENKO, 2025; KHAZDOZI; BAHARI; ASHAYERI, 2017), embora a música aumente a valência afetiva no exercício agudo (HE et al., 2025). Nenhuma intervenção testou estratégias de recuperação ou de sono, embora a literatura geral indique efeitos das intervenções de sono sobre o humor de atletas (GWYTHER et al., 2022), sobretudo sobre o afeto positivo, a ansiedade, a tensão e o vigor (WALSH et al., 2026).</w:t>
       </w:r>
     </w:p>
     <w:p>
@@ -13574,7 +13649,7 @@
                 <w:i w:val="0"/>
                 <w:sz w:val="19"/>
               </w:rPr>
-              <w:t>BRUMS ou versão abreviada validada do POMS, com relato de todas as dimensões</w:t>
+              <w:t>BRUMS ou POMS abreviado validado no idioma, com todas as dimensões (VLACHOPOULOS; LANE; TERRY, 2023)</w:t>
             </w:r>
           </w:p>
         </w:tc>
@@ -13651,7 +13726,7 @@
                 <w:i w:val="0"/>
                 <w:sz w:val="19"/>
               </w:rPr>
-              <w:t>Ensaios por equipes e estudos com medidas repetidas</w:t>
+              <w:t>Ensaios por equipes e medidas repetidas com modelos multivariados (AFONSO et al., 2025)</w:t>
             </w:r>
           </w:p>
         </w:tc>
@@ -13728,7 +13803,7 @@
                 <w:i w:val="0"/>
                 <w:sz w:val="19"/>
               </w:rPr>
-              <w:t>Análise por sexo e registro da fase do ciclo</w:t>
+              <w:t>Análise por sexo e registro preciso da fase do ciclo (MEIGNIÉ et al., 2021)</w:t>
             </w:r>
           </w:p>
         </w:tc>
@@ -13805,7 +13880,84 @@
                 <w:i w:val="0"/>
                 <w:sz w:val="19"/>
               </w:rPr>
-              <w:t>Programas de comunicação do treinador, sono e recuperação ao longo da temporada</w:t>
+              <w:t>Programas de comunicação do treinador, clima de tarefa, sono e recuperação na temporada</w:t>
+            </w:r>
+          </w:p>
+        </w:tc>
+      </w:tr>
+      <w:tr>
+        <w:tc>
+          <w:tcPr>
+            <w:tcW w:w="1927" w:type="dxa"/>
+            <w:tcBorders>
+              <w:top w:val="single" w:sz="4" w:color="000000"/>
+              <w:left w:val="nil"/>
+              <w:bottom w:val="nil"/>
+              <w:right w:val="nil"/>
+            </w:tcBorders>
+          </w:tcPr>
+          <w:p>
+            <w:pPr>
+              <w:spacing w:lineRule="exact" w:line="220" w:before="20" w:after="20"/>
+              <w:jc w:val="left"/>
+            </w:pPr>
+            <w:r>
+              <w:rPr>
+                <w:rFonts w:ascii="Times New Roman" w:hAnsi="Times New Roman"/>
+                <w:i w:val="0"/>
+                <w:sz w:val="19"/>
+              </w:rPr>
+              <w:t>Nutrição e energia</w:t>
+            </w:r>
+          </w:p>
+        </w:tc>
+        <w:tc>
+          <w:tcPr>
+            <w:tcW w:w="3175" w:type="dxa"/>
+            <w:tcBorders>
+              <w:top w:val="single" w:sz="4" w:color="000000"/>
+              <w:left w:val="nil"/>
+              <w:bottom w:val="nil"/>
+              <w:right w:val="nil"/>
+            </w:tcBorders>
+          </w:tcPr>
+          <w:p>
+            <w:pPr>
+              <w:spacing w:lineRule="exact" w:line="220" w:before="20" w:after="20"/>
+              <w:jc w:val="left"/>
+            </w:pPr>
+            <w:r>
+              <w:rPr>
+                <w:rFonts w:ascii="Times New Roman" w:hAnsi="Times New Roman"/>
+                <w:i w:val="0"/>
+                <w:sz w:val="19"/>
+              </w:rPr>
+              <w:t>Efeitos inconsistentes em amostras pequenas</w:t>
+            </w:r>
+          </w:p>
+        </w:tc>
+        <w:tc>
+          <w:tcPr>
+            <w:tcW w:w="3969" w:type="dxa"/>
+            <w:tcBorders>
+              <w:top w:val="single" w:sz="4" w:color="000000"/>
+              <w:left w:val="nil"/>
+              <w:bottom w:val="nil"/>
+              <w:right w:val="nil"/>
+            </w:tcBorders>
+          </w:tcPr>
+          <w:p>
+            <w:pPr>
+              <w:spacing w:lineRule="exact" w:line="220" w:before="20" w:after="20"/>
+              <w:jc w:val="left"/>
+            </w:pPr>
+            <w:r>
+              <w:rPr>
+                <w:rFonts w:ascii="Times New Roman" w:hAnsi="Times New Roman"/>
+                <w:i w:val="0"/>
+                <w:sz w:val="19"/>
+              </w:rPr>
+              <w:t>Considerar a relação entre saúde mental e deficiência energética relativa (MOUNTJOY et al., 2023)</w:t>
             </w:r>
           </w:p>
         </w:tc>
@@ -13882,7 +14034,7 @@
                 <w:i w:val="0"/>
                 <w:sz w:val="19"/>
               </w:rPr>
-              <w:t>Relação entre o perfil de humor e indicadores de jogo sob pressão</w:t>
+              <w:t>Humor medido por instrumento validado e indicadores de jogo sob pressão</w:t>
             </w:r>
           </w:p>
         </w:tc>
@@ -13931,7 +14083,7 @@
           <w:i w:val="0"/>
           <w:sz w:val="24"/>
         </w:rPr>
-        <w:t>Para técnicos e preparadores, as evidências sustentam o monitoramento breve e regular do humor, com instrumento validado e em horário fixo (DE MIRANDA ROHLFS et al., 2024; TERRY; PARSONS-SMITH, 2021), a atenção às dimensões de fadiga e de vigor ao longo da temporada (BRESCIANI et al., 2010; PADILHAS et al., 2018) e o uso deliberado do encorajamento verbal individual nas sessões (AYDI et al., 2025; SAHLI et al., 2022, 2024). A comunicação negativa deve ser empregada com cautela, dada sua repercussão sobre o afeto (SOTO; GARCÍA-HERRERO; CARCEDO, 2020), e as variações associadas ao horário do dia e ao ciclo menstrual devem ser consideradas no planejamento de treinos e testes (ESSID et al., 2022; LISENCHUK et al., 2019).</w:t>
+        <w:t>Para técnicos e preparadores, as evidências sustentam o monitoramento breve e regular do humor, com instrumento validado e em horário fixo (DE MIRANDA ROHLFS et al., 2024; TERRY; PARSONS-SMITH, 2021), de preferência por sessão (BUGTEN et al., 2026) ou por registros momentâneos (MAJER et al., 2026). Recomendam-se ainda a atenção às dimensões de fadiga e de vigor ao longo da temporada (BRESCIANI et al., 2010; PADILHAS et al., 2018) e o uso deliberado do encorajamento verbal individual nas sessões (AYDI et al., 2025; SAHLI et al., 2022, 2024). A comunicação negativa deve ser empregada com cautela, dada sua repercussão sobre o afeto (SOTO; GARCÍA-HERRERO; CARCEDO, 2020), e o clima orientado à tarefa merece estímulo, pois se associou a menos sintomas de ansiedade, depressão e estresse em jovens handebolistas (GREBLO JURAKIĆ; BOJIĆ-ĆAĆIĆ; LJUBIČIĆ, 2026) e a mais afeto positivo (LOCHBAUM; SISNEROS, 2024). As variações associadas ao horário do dia e ao ciclo menstrual devem ser consideradas no planejamento de treinos e testes (ESSID et al., 2022; LISENCHUK et al., 2019). A educação e a triagem do sono (WALSH et al., 2021) e a música autosselecionada antes da tarefa (DELLELI et al., 2023) têm respaldo na literatura geral, mas não foram testadas no handebol.</w:t>
       </w:r>
     </w:p>
     <w:p>
@@ -13962,7 +14114,7 @@
           <w:i w:val="0"/>
           <w:sz w:val="24"/>
         </w:rPr>
-        <w:t>A literatura sobre os estados de humor em atletas de handebol reúne 36 estudos, publicados entre 2008 e 2026 e concentrados na Espanha, na Tunísia e no Brasil, com amostras pequenas e predominantemente femininas (QP1). O POMS e suas versões dominam a medida, aplicada em momentos nem sempre declarados (QP2). O humor variou com a carga, com o resultado e o contexto do jogo, com o horário do dia e, de modo divergente, com a fase do ciclo menstrual; o prazer no treino acompanhou a carga física, e o humor associou-se às habilidades psicológicas, à autoconfiança e ao convívio social (QP3). O encorajamento verbal e o feedback modificaram o humor durante a prática, ao passo que as intervenções nutricionais produziram efeitos inconsistentes (QP4). A qualidade metodológica foi alta em menos da metade dos estudos, e a heterogeneidade de instrumentos e de momentos impediu a síntese quantitativa (QP5). Para a prática, o monitoramento regular do humor e a comunicação positiva do treinador são as condutas com maior respaldo. Para a pesquisa, a prioridade são estudos com medidas repetidas, momento declarado, análise por sexo e delineamentos experimentais conduzidos na rotina das equipes.</w:t>
+        <w:t>A literatura sobre os estados de humor em atletas de handebol reúne 36 estudos, publicados entre 2008 e 2026 e concentrados na Espanha, na Tunísia e no Brasil, com amostras pequenas e predominantemente femininas (QP1). O POMS e suas versões dominam a medida, aplicada em momentos nem sempre declarados (QP2). O humor variou com a carga, com o resultado e o contexto do jogo, com o horário do dia e, de modo divergente, com a fase do ciclo menstrual; o prazer no treino acompanhou a carga física, e o humor associou-se às habilidades psicológicas, à autoconfiança e ao convívio social (QP3). O encorajamento verbal e o feedback modificaram o humor durante a prática, ao passo que as intervenções nutricionais produziram efeitos inconsistentes (QP4). A qualidade metodológica foi alta em menos da metade dos estudos, e a heterogeneidade de instrumentos e de momentos impediu a síntese quantitativa (QP5). Esses achados convergem, em grande parte, com a literatura recente de outras modalidades coletivas. Para a prática, o monitoramento regular do humor e a comunicação positiva do treinador são as condutas com maior respaldo. Para a pesquisa, a prioridade são estudos com medidas repetidas por sessão, momento declarado, análise por sexo e delineamentos experimentais conduzidos na rotina das equipes, incluídas intervenções de sono e de clima motivacional.</w:t>
       </w:r>
     </w:p>
     <w:p>
@@ -13993,7 +14145,7 @@
           <w:i w:val="0"/>
           <w:sz w:val="24"/>
         </w:rPr>
-        <w:t xml:space="preserve">AKROUSH, S. et al. Psychological mood patterns among Jordanian handball players. </w:t>
+        <w:t xml:space="preserve">AFONSO, P. et al. Shaping Training Load, Technical–Tactical Behaviour, and Well-Being in Football: A Systematic Review. </w:t>
       </w:r>
       <w:r>
         <w:rPr>
@@ -14001,7 +14153,7 @@
           <w:b/>
           <w:sz w:val="24"/>
         </w:rPr>
-        <w:t>Retos</w:t>
+        <w:t>Sports</w:t>
       </w:r>
       <w:r>
         <w:rPr>
@@ -14009,7 +14161,7 @@
           <w:i w:val="0"/>
           <w:sz w:val="24"/>
         </w:rPr>
-        <w:t>, n. 62, p. 285-294, 2025. DOI: https://doi.org/10.47197/retos.v62.109407.</w:t>
+        <w:t>, v. 13, n. 8, e244, 2025. DOI: https://doi.org/10.3390/sports13080244.</w:t>
       </w:r>
     </w:p>
     <w:p>
@@ -14024,7 +14176,7 @@
           <w:i w:val="0"/>
           <w:sz w:val="24"/>
         </w:rPr>
-        <w:t xml:space="preserve">AL-WATTAR, N. S.; AL-BADRANE, M. M. Effect of a training program by using self-regulation strategies of mood for handball players. </w:t>
+        <w:t xml:space="preserve">AKROUSH, S. et al. Psychological mood patterns among Jordanian handball players. </w:t>
       </w:r>
       <w:r>
         <w:rPr>
@@ -14032,7 +14184,7 @@
           <w:b/>
           <w:sz w:val="24"/>
         </w:rPr>
-        <w:t>Al-Rafidain Journal for Sport Sciences</w:t>
+        <w:t>Retos</w:t>
       </w:r>
       <w:r>
         <w:rPr>
@@ -14040,7 +14192,7 @@
           <w:i w:val="0"/>
           <w:sz w:val="24"/>
         </w:rPr>
-        <w:t>, v. 20, n. 64, p. 396-444, 2014. DOI: https://doi.org/10.33899/rajsport.2014.81916.</w:t>
+        <w:t>, n. 62, p. 285-294, 2025. DOI: https://doi.org/10.47197/retos.v62.109407.</w:t>
       </w:r>
     </w:p>
     <w:p>
@@ -14055,7 +14207,7 @@
           <w:i w:val="0"/>
           <w:sz w:val="24"/>
         </w:rPr>
-        <w:t xml:space="preserve">ASSUNÇÃO CARVALHO, L. C. D. S. et al. Syzygium cumini Nectar Supplementation Reduced Biomarkers of Oxidative Stress, Muscle Damage, and Improved Psychological Response in Highly Trained Young Handball Players. </w:t>
+        <w:t xml:space="preserve">AL-WATTAR, N. S.; AL-BADRANE, M. M. Effect of a training program by using self-regulation strategies of mood for handball players. </w:t>
       </w:r>
       <w:r>
         <w:rPr>
@@ -14063,7 +14215,7 @@
           <w:b/>
           <w:sz w:val="24"/>
         </w:rPr>
-        <w:t>Frontiers in Physiology</w:t>
+        <w:t>Al-Rafidain Journal for Sport Sciences</w:t>
       </w:r>
       <w:r>
         <w:rPr>
@@ -14071,7 +14223,7 @@
           <w:i w:val="0"/>
           <w:sz w:val="24"/>
         </w:rPr>
-        <w:t>, v. 9, e1508, 2018. DOI: https://doi.org/10.3389/fphys.2018.01508.</w:t>
+        <w:t>, v. 20, n. 64, p. 396-444, 2014. DOI: https://doi.org/10.33899/rajsport.2014.81916.</w:t>
       </w:r>
     </w:p>
     <w:p>
@@ -14086,7 +14238,7 @@
           <w:i w:val="0"/>
           <w:sz w:val="24"/>
         </w:rPr>
-        <w:t xml:space="preserve">AYDI, B. et al. Empowering Obese Children in Physical Education: Exploring the Influence of Verbal Encouragement on Games Intensity, Mood States, and Physical Enjoyment during Passing Games. </w:t>
+        <w:t xml:space="preserve">ASSUNÇÃO CARVALHO, L. C. D. S. et al. Syzygium cumini Nectar Supplementation Reduced Biomarkers of Oxidative Stress, Muscle Damage, and Improved Psychological Response in Highly Trained Young Handball Players. </w:t>
       </w:r>
       <w:r>
         <w:rPr>
@@ -14094,7 +14246,7 @@
           <w:b/>
           <w:sz w:val="24"/>
         </w:rPr>
-        <w:t>PLOS ONE</w:t>
+        <w:t>Frontiers in Physiology</w:t>
       </w:r>
       <w:r>
         <w:rPr>
@@ -14102,7 +14254,7 @@
           <w:i w:val="0"/>
           <w:sz w:val="24"/>
         </w:rPr>
-        <w:t>, v. 20, n. 4, e0319414, 2025. DOI: https://doi.org/10.1371/journal.pone.0319414.</w:t>
+        <w:t>, v. 9, e1508, 2018. DOI: https://doi.org/10.3389/fphys.2018.01508.</w:t>
       </w:r>
     </w:p>
     <w:p>
@@ -14117,7 +14269,7 @@
           <w:i w:val="0"/>
           <w:sz w:val="24"/>
         </w:rPr>
-        <w:t xml:space="preserve">BATALLA-GAVALDA, A. et al. Ecological Validity of Maximal Exercise Tests to Simulate Competitive Demands in Amateur Female Handball. </w:t>
+        <w:t xml:space="preserve">AYDI, B. et al. Empowering Obese Children in Physical Education: Exploring the Influence of Verbal Encouragement on Games Intensity, Mood States, and Physical Enjoyment during Passing Games. </w:t>
       </w:r>
       <w:r>
         <w:rPr>
@@ -14125,7 +14277,7 @@
           <w:b/>
           <w:sz w:val="24"/>
         </w:rPr>
-        <w:t>Acta Kinesiologica</w:t>
+        <w:t>PLOS ONE</w:t>
       </w:r>
       <w:r>
         <w:rPr>
@@ -14133,7 +14285,7 @@
           <w:i w:val="0"/>
           <w:sz w:val="24"/>
         </w:rPr>
-        <w:t>, p. 34-42, 2026. DOI: https://doi.org/10.51371/issn.1840-2976.651.</w:t>
+        <w:t>, v. 20, n. 4, e0319414, 2025. DOI: https://doi.org/10.1371/journal.pone.0319414.</w:t>
       </w:r>
     </w:p>
     <w:p>
@@ -14148,7 +14300,7 @@
           <w:i w:val="0"/>
           <w:sz w:val="24"/>
         </w:rPr>
-        <w:t xml:space="preserve">BATALLA-GAVALDA, A. et al. Mayor validez ecológica del Game-Based Performance Test en comparación con el Yo-Yo IR1 en jugadoras de balonmano amateur. </w:t>
+        <w:t xml:space="preserve">BASTOS, V. et al. Assessing affective valence and activation in resistance training with the feeling scale and the felt arousal scale: A systematic review. </w:t>
       </w:r>
       <w:r>
         <w:rPr>
@@ -14156,7 +14308,7 @@
           <w:b/>
           <w:sz w:val="24"/>
         </w:rPr>
-        <w:t>Journal of Sport and Health Research</w:t>
+        <w:t>PLOS ONE</w:t>
       </w:r>
       <w:r>
         <w:rPr>
@@ -14164,7 +14316,7 @@
           <w:i w:val="0"/>
           <w:sz w:val="24"/>
         </w:rPr>
-        <w:t>, v. 17, n. Supl. 2, p. 178-196, 2025. DOI: https://doi.org/10.58727/jshr.118640.</w:t>
+        <w:t>, v. 18, n. 11, e0294529, 2023. DOI: https://doi.org/10.1371/journal.pone.0294529.</w:t>
       </w:r>
     </w:p>
     <w:p>
@@ -14179,7 +14331,7 @@
           <w:i w:val="0"/>
           <w:sz w:val="24"/>
         </w:rPr>
-        <w:t xml:space="preserve">BATALLA-GAVALDA, A. et al. Variations in the Mood States during the Different Phases of COVID-19’s Lockdown in Young Athletes. </w:t>
+        <w:t xml:space="preserve">BATALLA-GAVALDA, A. et al. Ecological Validity of Maximal Exercise Tests to Simulate Competitive Demands in Amateur Female Handball. </w:t>
       </w:r>
       <w:r>
         <w:rPr>
@@ -14187,7 +14339,7 @@
           <w:b/>
           <w:sz w:val="24"/>
         </w:rPr>
-        <w:t>International Journal of Environmental Research and Public Health</w:t>
+        <w:t>Acta Kinesiologica</w:t>
       </w:r>
       <w:r>
         <w:rPr>
@@ -14195,7 +14347,7 @@
           <w:i w:val="0"/>
           <w:sz w:val="24"/>
         </w:rPr>
-        <w:t>, v. 18, n. 17, e9326, 2021. DOI: https://doi.org/10.3390/ijerph18179326.</w:t>
+        <w:t>, p. 34-42, 2026. DOI: https://doi.org/10.51371/issn.1840-2976.651.</w:t>
       </w:r>
     </w:p>
     <w:p>
@@ -14210,7 +14362,7 @@
           <w:i w:val="0"/>
           <w:sz w:val="24"/>
         </w:rPr>
-        <w:t xml:space="preserve">BEEDIE, C. J.; TERRY, P. C.; LANE, A. M. The profile of mood states and athletic performance: Two meta-analyses. </w:t>
+        <w:t xml:space="preserve">BATALLA-GAVALDA, A. et al. Mayor validez ecológica del Game-Based Performance Test en comparación con el Yo-Yo IR1 en jugadoras de balonmano amateur. </w:t>
       </w:r>
       <w:r>
         <w:rPr>
@@ -14218,7 +14370,7 @@
           <w:b/>
           <w:sz w:val="24"/>
         </w:rPr>
-        <w:t>Journal of Applied Sport Psychology</w:t>
+        <w:t>Journal of Sport and Health Research</w:t>
       </w:r>
       <w:r>
         <w:rPr>
@@ -14226,7 +14378,7 @@
           <w:i w:val="0"/>
           <w:sz w:val="24"/>
         </w:rPr>
-        <w:t>, v. 12, n. 1, p. 49-68, 2000. DOI: https://doi.org/10.1080/10413200008404213.</w:t>
+        <w:t>, v. 17, n. Supl. 2, p. 178-196, 2025. DOI: https://doi.org/10.58727/jshr.118640.</w:t>
       </w:r>
     </w:p>
     <w:p>
@@ -14241,7 +14393,7 @@
           <w:i w:val="0"/>
           <w:sz w:val="24"/>
         </w:rPr>
-        <w:t xml:space="preserve">BEEDIE, C.; TERRY, P.; LANE, A. Distinctions between emotion and mood. </w:t>
+        <w:t xml:space="preserve">BATALLA-GAVALDA, A. et al. Variations in the Mood States during the Different Phases of COVID-19’s Lockdown in Young Athletes. </w:t>
       </w:r>
       <w:r>
         <w:rPr>
@@ -14249,7 +14401,7 @@
           <w:b/>
           <w:sz w:val="24"/>
         </w:rPr>
-        <w:t>Cognition and Emotion</w:t>
+        <w:t>International Journal of Environmental Research and Public Health</w:t>
       </w:r>
       <w:r>
         <w:rPr>
@@ -14257,7 +14409,7 @@
           <w:i w:val="0"/>
           <w:sz w:val="24"/>
         </w:rPr>
-        <w:t>, v. 19, n. 6, p. 847-878, 2005. DOI: https://doi.org/10.1080/02699930541000057.</w:t>
+        <w:t>, v. 18, n. 17, e9326, 2021. DOI: https://doi.org/10.3390/ijerph18179326.</w:t>
       </w:r>
     </w:p>
     <w:p>
@@ -14272,7 +14424,7 @@
           <w:i w:val="0"/>
           <w:sz w:val="24"/>
         </w:rPr>
-        <w:t xml:space="preserve">BRESCIANI, G. et al. Monitoring biological and psychological measures throughout an entire season in male handball players. </w:t>
+        <w:t xml:space="preserve">BEEDIE, C. J.; TERRY, P. C.; LANE, A. M. The profile of mood states and athletic performance: Two meta-analyses. </w:t>
       </w:r>
       <w:r>
         <w:rPr>
@@ -14280,7 +14432,7 @@
           <w:b/>
           <w:sz w:val="24"/>
         </w:rPr>
-        <w:t>European Journal of Sport Science</w:t>
+        <w:t>Journal of Applied Sport Psychology</w:t>
       </w:r>
       <w:r>
         <w:rPr>
@@ -14288,7 +14440,7 @@
           <w:i w:val="0"/>
           <w:sz w:val="24"/>
         </w:rPr>
-        <w:t>, v. 10, n. 6, p. 377-384, 2010. DOI: https://doi.org/10.1080/17461391003699070.</w:t>
+        <w:t>, v. 12, n. 1, p. 49-68, 2000. DOI: https://doi.org/10.1080/10413200008404213.</w:t>
       </w:r>
     </w:p>
     <w:p>
@@ -14303,7 +14455,7 @@
           <w:i w:val="0"/>
           <w:sz w:val="24"/>
         </w:rPr>
-        <w:t xml:space="preserve">BUCHHEIT, M. Sensitivity of monthly heart rate and psychometric measures for monitoring physical performance in highly trained young handball players. </w:t>
+        <w:t xml:space="preserve">BEEDIE, C.; TERRY, P.; LANE, A. Distinctions between emotion and mood. </w:t>
       </w:r>
       <w:r>
         <w:rPr>
@@ -14311,7 +14463,7 @@
           <w:b/>
           <w:sz w:val="24"/>
         </w:rPr>
-        <w:t>International Journal of Sports Medicine</w:t>
+        <w:t>Cognition and Emotion</w:t>
       </w:r>
       <w:r>
         <w:rPr>
@@ -14319,7 +14471,7 @@
           <w:i w:val="0"/>
           <w:sz w:val="24"/>
         </w:rPr>
-        <w:t>, v. 36, n. 5, p. 351-356, 2015. DOI: https://doi.org/10.1055/s-0034-1385882.</w:t>
+        <w:t>, v. 19, n. 6, p. 847-878, 2005. DOI: https://doi.org/10.1080/02699930541000057.</w:t>
       </w:r>
     </w:p>
     <w:p>
@@ -14334,7 +14486,7 @@
           <w:i w:val="0"/>
           <w:sz w:val="24"/>
         </w:rPr>
-        <w:t xml:space="preserve">BUGTEN, J. B. et al. Youth players basic need satisfaction, enjoyment and pleasure within daily team sport training sessions, and the relationships with physical load engagement: an intensive within-person longitudinal study. </w:t>
+        <w:t xml:space="preserve">BRESCIANI, G. et al. Monitoring biological and psychological measures throughout an entire season in male handball players. </w:t>
       </w:r>
       <w:r>
         <w:rPr>
@@ -14342,7 +14494,7 @@
           <w:b/>
           <w:sz w:val="24"/>
         </w:rPr>
-        <w:t>Research Square</w:t>
+        <w:t>European Journal of Sport Science</w:t>
       </w:r>
       <w:r>
         <w:rPr>
@@ -14350,7 +14502,7 @@
           <w:i w:val="0"/>
           <w:sz w:val="24"/>
         </w:rPr>
-        <w:t>, 2026. Preprint. DOI: https://doi.org/10.21203/rs.3.rs-8338987/v1.</w:t>
+        <w:t>, v. 10, n. 6, p. 377-384, 2010. DOI: https://doi.org/10.1080/17461391003699070.</w:t>
       </w:r>
     </w:p>
     <w:p>
@@ -14365,7 +14517,7 @@
           <w:i w:val="0"/>
           <w:sz w:val="24"/>
         </w:rPr>
-        <w:t xml:space="preserve">CAMPBELL, M. et al. Synthesis without meta-analysis (SWiM) in systematic reviews: reporting guideline. </w:t>
+        <w:t xml:space="preserve">BUCHHEIT, M. Sensitivity of monthly heart rate and psychometric measures for monitoring physical performance in highly trained young handball players. </w:t>
       </w:r>
       <w:r>
         <w:rPr>
@@ -14373,7 +14525,7 @@
           <w:b/>
           <w:sz w:val="24"/>
         </w:rPr>
-        <w:t>BMJ</w:t>
+        <w:t>International Journal of Sports Medicine</w:t>
       </w:r>
       <w:r>
         <w:rPr>
@@ -14381,7 +14533,7 @@
           <w:i w:val="0"/>
           <w:sz w:val="24"/>
         </w:rPr>
-        <w:t>, l6890, 2020. DOI: https://doi.org/10.1136/bmj.l6890.</w:t>
+        <w:t>, v. 36, n. 5, p. 351-356, 2015. DOI: https://doi.org/10.1055/s-0034-1385882.</w:t>
       </w:r>
     </w:p>
     <w:p>
@@ -14396,7 +14548,7 @@
           <w:i w:val="0"/>
           <w:sz w:val="24"/>
         </w:rPr>
-        <w:t xml:space="preserve">CLEVELAND, W. S. Robust Locally Weighted Regression and Smoothing Scatterplots. </w:t>
+        <w:t xml:space="preserve">BUGTEN, J. B. et al. Youth players basic need satisfaction, enjoyment and pleasure within daily team sport training sessions, and the relationships with physical load engagement: an intensive within-person longitudinal study. </w:t>
       </w:r>
       <w:r>
         <w:rPr>
@@ -14404,7 +14556,7 @@
           <w:b/>
           <w:sz w:val="24"/>
         </w:rPr>
-        <w:t>Journal of the American Statistical Association</w:t>
+        <w:t>Research Square</w:t>
       </w:r>
       <w:r>
         <w:rPr>
@@ -14412,7 +14564,7 @@
           <w:i w:val="0"/>
           <w:sz w:val="24"/>
         </w:rPr>
-        <w:t>, v. 74, n. 368, p. 829-836, 1979. DOI: https://doi.org/10.1080/01621459.1979.10481038.</w:t>
+        <w:t>, 2026. Preprint. DOI: https://doi.org/10.21203/rs.3.rs-8338987/v1.</w:t>
       </w:r>
     </w:p>
     <w:p>
@@ -14427,7 +14579,7 @@
           <w:i w:val="0"/>
           <w:sz w:val="24"/>
         </w:rPr>
-        <w:t xml:space="preserve">COHEN, J. A Coefficient of Agreement for Nominal Scales. </w:t>
+        <w:t xml:space="preserve">CAMPBELL, M. et al. Synthesis without meta-analysis (SWiM) in systematic reviews: reporting guideline. </w:t>
       </w:r>
       <w:r>
         <w:rPr>
@@ -14435,7 +14587,7 @@
           <w:b/>
           <w:sz w:val="24"/>
         </w:rPr>
-        <w:t>Educational and Psychological Measurement</w:t>
+        <w:t>BMJ</w:t>
       </w:r>
       <w:r>
         <w:rPr>
@@ -14443,7 +14595,7 @@
           <w:i w:val="0"/>
           <w:sz w:val="24"/>
         </w:rPr>
-        <w:t>, v. 20, n. 1, p. 37-46, 1960. DOI: https://doi.org/10.1177/001316446002000104.</w:t>
+        <w:t>, l6890, 2020. DOI: https://doi.org/10.1136/bmj.l6890.</w:t>
       </w:r>
     </w:p>
     <w:p>
@@ -14458,7 +14610,7 @@
           <w:i w:val="0"/>
           <w:sz w:val="24"/>
         </w:rPr>
-        <w:t xml:space="preserve">DE MIRANDA ROHLFS, I. C. P. et al. Prevalence of Specific Mood Profile Clusters among Elite and Youth Athletes at a Brazilian Sports Club. </w:t>
+        <w:t xml:space="preserve">CLEVELAND, W. S. Robust Locally Weighted Regression and Smoothing Scatterplots. </w:t>
       </w:r>
       <w:r>
         <w:rPr>
@@ -14466,7 +14618,7 @@
           <w:b/>
           <w:sz w:val="24"/>
         </w:rPr>
-        <w:t>Sports</w:t>
+        <w:t>Journal of the American Statistical Association</w:t>
       </w:r>
       <w:r>
         <w:rPr>
@@ -14474,7 +14626,7 @@
           <w:i w:val="0"/>
           <w:sz w:val="24"/>
         </w:rPr>
-        <w:t>, v. 12, n. 7, e195, 2024. DOI: https://doi.org/10.3390/sports12070195.</w:t>
+        <w:t>, v. 74, n. 368, p. 829-836, 1979. DOI: https://doi.org/10.1080/01621459.1979.10481038.</w:t>
       </w:r>
     </w:p>
     <w:p>
@@ -14489,7 +14641,7 @@
           <w:i w:val="0"/>
           <w:sz w:val="24"/>
         </w:rPr>
-        <w:t xml:space="preserve">DIACHENKO, M.; TYSHCHENKO, V. Psycho-emotional regulation of female handball players during training. </w:t>
+        <w:t xml:space="preserve">COHEN, J. A Coefficient of Agreement for Nominal Scales. </w:t>
       </w:r>
       <w:r>
         <w:rPr>
@@ -14497,7 +14649,7 @@
           <w:b/>
           <w:sz w:val="24"/>
         </w:rPr>
-        <w:t>Scientific Journal of National Pedagogical Dragomanov University. Series 15: Scientific and Pedagogical Problems of Physical Culture (Physical Culture and Sports)</w:t>
+        <w:t>Educational and Psychological Measurement</w:t>
       </w:r>
       <w:r>
         <w:rPr>
@@ -14505,7 +14657,7 @@
           <w:i w:val="0"/>
           <w:sz w:val="24"/>
         </w:rPr>
-        <w:t>, n. 5K(191), p. 66-70, 2025. DOI: https://doi.org/10.31392/udu-nc.series15.2025.05k(191).13.</w:t>
+        <w:t>, v. 20, n. 1, p. 37-46, 1960. DOI: https://doi.org/10.1177/001316446002000104.</w:t>
       </w:r>
     </w:p>
     <w:p>
@@ -14520,7 +14672,7 @@
           <w:i w:val="0"/>
           <w:sz w:val="24"/>
         </w:rPr>
-        <w:t xml:space="preserve">DOWNES, M. J. et al. Development of a critical appraisal tool to assess the quality of cross-sectional studies (AXIS). </w:t>
+        <w:t xml:space="preserve">CREWTHER, B. T. et al. Dose-response and time-lagged effect of daily training load on athlete well-being during an international rugby series. </w:t>
       </w:r>
       <w:r>
         <w:rPr>
@@ -14528,7 +14680,7 @@
           <w:b/>
           <w:sz w:val="24"/>
         </w:rPr>
-        <w:t>BMJ Open</w:t>
+        <w:t>Biology of Sport</w:t>
       </w:r>
       <w:r>
         <w:rPr>
@@ -14536,7 +14688,7 @@
           <w:i w:val="0"/>
           <w:sz w:val="24"/>
         </w:rPr>
-        <w:t>, v. 6, n. 12, e011458, 2016. DOI: https://doi.org/10.1136/bmjopen-2016-011458.</w:t>
+        <w:t>, v. 42, n. 1, p. 39-45, 2025. DOI: https://doi.org/10.5114/biolsport.2025.139080.</w:t>
       </w:r>
     </w:p>
     <w:p>
@@ -14551,7 +14703,7 @@
           <w:i w:val="0"/>
           <w:sz w:val="24"/>
         </w:rPr>
-        <w:t xml:space="preserve">DURAI, C.; ATHISAYARAJ, S. Comparison of mood states between handball and volleyball players. </w:t>
+        <w:t xml:space="preserve">DE MIRANDA ROHLFS, I. C. P. et al. Prevalence of Specific Mood Profile Clusters among Elite and Youth Athletes at a Brazilian Sports Club. </w:t>
       </w:r>
       <w:r>
         <w:rPr>
@@ -14559,7 +14711,7 @@
           <w:b/>
           <w:sz w:val="24"/>
         </w:rPr>
-        <w:t>International Journal of Physiology, Nutrition and Physical Education</w:t>
+        <w:t>Sports</w:t>
       </w:r>
       <w:r>
         <w:rPr>
@@ -14567,7 +14719,7 @@
           <w:i w:val="0"/>
           <w:sz w:val="24"/>
         </w:rPr>
-        <w:t>, v. 3, n. 2, p. 43-44, 2018.</w:t>
+        <w:t>, v. 12, n. 7, e195, 2024. DOI: https://doi.org/10.3390/sports12070195.</w:t>
       </w:r>
     </w:p>
     <w:p>
@@ -14582,7 +14734,7 @@
           <w:i w:val="0"/>
           <w:sz w:val="24"/>
         </w:rPr>
-        <w:t xml:space="preserve">EKKEKAKIS, P.; BRAND, R. Affective responses to and automatic affective valuations of physical activity: Fifty years of progress on the seminal question in exercise psychology. </w:t>
+        <w:t xml:space="preserve">DELLELI, S. et al. The effects of pre-task music on exercise performance and associated psycho-physiological responses: a systematic review with multilevel meta-analysis of controlled studies. </w:t>
       </w:r>
       <w:r>
         <w:rPr>
@@ -14590,7 +14742,7 @@
           <w:b/>
           <w:sz w:val="24"/>
         </w:rPr>
-        <w:t>Psychology of Sport and Exercise</w:t>
+        <w:t>Frontiers in Psychology</w:t>
       </w:r>
       <w:r>
         <w:rPr>
@@ -14598,7 +14750,7 @@
           <w:i w:val="0"/>
           <w:sz w:val="24"/>
         </w:rPr>
-        <w:t>, v. 42, p. 130-137, 2019. DOI: https://doi.org/10.1016/j.psychsport.2018.12.018.</w:t>
+        <w:t>, v. 14, e1293783, 2023. DOI: https://doi.org/10.3389/fpsyg.2023.1293783.</w:t>
       </w:r>
     </w:p>
     <w:p>
@@ -14613,7 +14765,7 @@
           <w:i w:val="0"/>
           <w:sz w:val="24"/>
         </w:rPr>
-        <w:t xml:space="preserve">ESSID, S. et al. Time-of-day effects in physical performances and psychological responses in young elite male handball players. </w:t>
+        <w:t xml:space="preserve">DIACHENKO, M.; TYSHCHENKO, V. Psycho-emotional regulation of female handball players during training. </w:t>
       </w:r>
       <w:r>
         <w:rPr>
@@ -14621,7 +14773,7 @@
           <w:b/>
           <w:sz w:val="24"/>
         </w:rPr>
-        <w:t>Biological Rhythm Research</w:t>
+        <w:t>Scientific Journal of National Pedagogical Dragomanov University. Series 15: Scientific and Pedagogical Problems of Physical Culture (Physical Culture and Sports)</w:t>
       </w:r>
       <w:r>
         <w:rPr>
@@ -14629,7 +14781,7 @@
           <w:i w:val="0"/>
           <w:sz w:val="24"/>
         </w:rPr>
-        <w:t>, v. 53, n. 8, p. 1261-1272, 2022. DOI: https://doi.org/10.1080/09291016.2021.1922212.</w:t>
+        <w:t>, n. 5K(191), p. 66-70, 2025. DOI: https://doi.org/10.31392/udu-nc.series15.2025.05k(191).13.</w:t>
       </w:r>
     </w:p>
     <w:p>
@@ -14644,7 +14796,23 @@
           <w:i w:val="0"/>
           <w:sz w:val="24"/>
         </w:rPr>
-        <w:t>FARZANEGI, P. et al. The effect of winning/losing on profiles of mood states and salivary cortisol concentration in female handball players. Tehran: Islamic Azad University, [2008?]. Disponível em: https://sanad.iau.ir/en/Article/889921. Acesso em: 21 out. 2026.</w:t>
+        <w:t xml:space="preserve">DOWNES, M. J. et al. Development of a critical appraisal tool to assess the quality of cross-sectional studies (AXIS). </w:t>
+      </w:r>
+      <w:r>
+        <w:rPr>
+          <w:rFonts w:ascii="Times New Roman" w:hAnsi="Times New Roman"/>
+          <w:b/>
+          <w:sz w:val="24"/>
+        </w:rPr>
+        <w:t>BMJ Open</w:t>
+      </w:r>
+      <w:r>
+        <w:rPr>
+          <w:rFonts w:ascii="Times New Roman" w:hAnsi="Times New Roman"/>
+          <w:i w:val="0"/>
+          <w:sz w:val="24"/>
+        </w:rPr>
+        <w:t>, v. 6, n. 12, e011458, 2016. DOI: https://doi.org/10.1136/bmjopen-2016-011458.</w:t>
       </w:r>
     </w:p>
     <w:p>
@@ -14659,7 +14827,7 @@
           <w:i w:val="0"/>
           <w:sz w:val="24"/>
         </w:rPr>
-        <w:t xml:space="preserve">GALVÃO, M. C. B.; RICARTE, I. L. M. Revisão sistemática da literatura: conceituação, produção e publicação. </w:t>
+        <w:t xml:space="preserve">DUIGNAN, C. et al. Single-Item Self-Report Measures of Team-Sport Athlete Wellbeing and Their Relationship With Training Load: A Systematic Review. </w:t>
       </w:r>
       <w:r>
         <w:rPr>
@@ -14667,7 +14835,7 @@
           <w:b/>
           <w:sz w:val="24"/>
         </w:rPr>
-        <w:t>Logeion: Filosofia da Informação</w:t>
+        <w:t>Journal of Athletic Training</w:t>
       </w:r>
       <w:r>
         <w:rPr>
@@ -14675,7 +14843,7 @@
           <w:i w:val="0"/>
           <w:sz w:val="24"/>
         </w:rPr>
-        <w:t>, v. 6, n. 1, p. 57-73, 2019. DOI: https://doi.org/10.21728/logeion.2019v6n1.p57-73.</w:t>
+        <w:t>, v. 55, n. 9, p. 944-953, 2020. DOI: https://doi.org/10.4085/1062-6050-0528.19.</w:t>
       </w:r>
     </w:p>
     <w:p>
@@ -14690,7 +14858,7 @@
           <w:i w:val="0"/>
           <w:sz w:val="24"/>
         </w:rPr>
-        <w:t xml:space="preserve">GARCÍA-HERRERO, J. A. et al. Analysis of the Relationship between Satisfaction with the Coach and the Effect of Comparative Social Feedback in Elite Female Handball Players. </w:t>
+        <w:t xml:space="preserve">DURAI, C.; ATHISAYARAJ, S. Comparison of mood states between handball and volleyball players. </w:t>
       </w:r>
       <w:r>
         <w:rPr>
@@ -14698,7 +14866,7 @@
           <w:b/>
           <w:sz w:val="24"/>
         </w:rPr>
-        <w:t>International Journal of Environmental Research and Public Health</w:t>
+        <w:t>International Journal of Physiology, Nutrition and Physical Education</w:t>
       </w:r>
       <w:r>
         <w:rPr>
@@ -14706,7 +14874,7 @@
           <w:i w:val="0"/>
           <w:sz w:val="24"/>
         </w:rPr>
-        <w:t>, v. 19, n. 13, e7680, 2022. DOI: https://doi.org/10.3390/ijerph19137680.</w:t>
+        <w:t>, v. 3, n. 2, p. 43-44, 2018.</w:t>
       </w:r>
     </w:p>
     <w:p>
@@ -14721,7 +14889,7 @@
           <w:i w:val="0"/>
           <w:sz w:val="24"/>
         </w:rPr>
-        <w:t xml:space="preserve">GARWOOD, F. (i) Fiducial Limits for the Poisson Distribution. </w:t>
+        <w:t xml:space="preserve">EKKEKAKIS, P.; BRAND, R. Affective responses to and automatic affective valuations of physical activity: Fifty years of progress on the seminal question in exercise psychology. </w:t>
       </w:r>
       <w:r>
         <w:rPr>
@@ -14729,7 +14897,7 @@
           <w:b/>
           <w:sz w:val="24"/>
         </w:rPr>
-        <w:t>Biometrika</w:t>
+        <w:t>Psychology of Sport and Exercise</w:t>
       </w:r>
       <w:r>
         <w:rPr>
@@ -14737,7 +14905,7 @@
           <w:i w:val="0"/>
           <w:sz w:val="24"/>
         </w:rPr>
-        <w:t>, v. 28, n. 3-4, p. 437-442, 1936. DOI: https://doi.org/10.1093/biomet/28.3-4.437.</w:t>
+        <w:t>, v. 42, p. 130-137, 2019. DOI: https://doi.org/10.1016/j.psychsport.2018.12.018.</w:t>
       </w:r>
     </w:p>
     <w:p>
@@ -14752,7 +14920,7 @@
           <w:i w:val="0"/>
           <w:sz w:val="24"/>
         </w:rPr>
-        <w:t xml:space="preserve">GHAZEL, N. et al. The effect of music on short-term exercise performance during the different menstrual cycle phases in female handball players. </w:t>
+        <w:t xml:space="preserve">ESSID, S. et al. Time-of-day effects in physical performances and psychological responses in young elite male handball players. </w:t>
       </w:r>
       <w:r>
         <w:rPr>
@@ -14760,7 +14928,7 @@
           <w:b/>
           <w:sz w:val="24"/>
         </w:rPr>
-        <w:t>Research in Sports Medicine</w:t>
+        <w:t>Biological Rhythm Research</w:t>
       </w:r>
       <w:r>
         <w:rPr>
@@ -14768,7 +14936,7 @@
           <w:i w:val="0"/>
           <w:sz w:val="24"/>
         </w:rPr>
-        <w:t>, v. 30, n. 1, p. 50-60, 2022. DOI: https://doi.org/10.1080/15438627.2020.1860045.</w:t>
+        <w:t>, v. 53, n. 8, p. 1261-1272, 2022. DOI: https://doi.org/10.1080/09291016.2021.1922212.</w:t>
       </w:r>
     </w:p>
     <w:p>
@@ -14783,7 +14951,7 @@
           <w:i w:val="0"/>
           <w:sz w:val="24"/>
         </w:rPr>
-        <w:t xml:space="preserve">GOUTTEBARGE, V. et al. Occurrence of mental health symptoms and disorders in current and former elite athletes: a systematic review and meta-analysis. </w:t>
+        <w:t xml:space="preserve">EVMENENKO, A.; TEIXEIRA, D. S. The circumplex model of affect in physical activity contexts: a systematic review. </w:t>
       </w:r>
       <w:r>
         <w:rPr>
@@ -14791,7 +14959,7 @@
           <w:b/>
           <w:sz w:val="24"/>
         </w:rPr>
-        <w:t>British Journal of Sports Medicine</w:t>
+        <w:t>International Journal of Sport and Exercise Psychology</w:t>
       </w:r>
       <w:r>
         <w:rPr>
@@ -14799,7 +14967,7 @@
           <w:i w:val="0"/>
           <w:sz w:val="24"/>
         </w:rPr>
-        <w:t>, v. 53, n. 11, p. 700-706, 2019. DOI: https://doi.org/10.1136/bjsports-2019-100671.</w:t>
+        <w:t>, v. 20, n. 1, p. 168-201, 2022. DOI: https://doi.org/10.1080/1612197x.2020.1854818.</w:t>
       </w:r>
     </w:p>
     <w:p>
@@ -14814,23 +14982,7 @@
           <w:i w:val="0"/>
           <w:sz w:val="24"/>
         </w:rPr>
-        <w:t xml:space="preserve">GÜMÜŞ, H.; GENÇOĞLU, C. The effects of the goalkeeper substitution rule as a new strategy in handball: Analysis of Men's European Handball Championship 2020. </w:t>
-      </w:r>
-      <w:r>
-        <w:rPr>
-          <w:rFonts w:ascii="Times New Roman" w:hAnsi="Times New Roman"/>
-          <w:b/>
-          <w:sz w:val="24"/>
-        </w:rPr>
-        <w:t>Acta Gymnica</w:t>
-      </w:r>
-      <w:r>
-        <w:rPr>
-          <w:rFonts w:ascii="Times New Roman" w:hAnsi="Times New Roman"/>
-          <w:i w:val="0"/>
-          <w:sz w:val="24"/>
-        </w:rPr>
-        <w:t>, v. 50, n. 3, p. 113-121, 2020. DOI: https://doi.org/10.5507/ag.2020.015.</w:t>
+        <w:t>FARZANEGI, P. et al. The effect of winning/losing on profiles of mood states and salivary cortisol concentration in female handball players. Tehran: Islamic Azad University, [2008?]. Disponível em: https://sanad.iau.ir/en/Article/889921. Acesso em: 21 out. 2026.</w:t>
       </w:r>
     </w:p>
     <w:p>
@@ -14845,7 +14997,7 @@
           <w:i w:val="0"/>
           <w:sz w:val="24"/>
         </w:rPr>
-        <w:t xml:space="preserve">GWYTHER, K. et al. Sleep interventions for performance, mood and sleep outcomes in athletes: A systematic review and meta-analysis. </w:t>
+        <w:t xml:space="preserve">FESSI, M. S.; MOALLA, W. Postmatch Perceived Exertion, Feeling, and Wellness in Professional Soccer Players. </w:t>
       </w:r>
       <w:r>
         <w:rPr>
@@ -14853,7 +15005,7 @@
           <w:b/>
           <w:sz w:val="24"/>
         </w:rPr>
-        <w:t>Psychology of Sport and Exercise</w:t>
+        <w:t>International Journal of Sports Physiology and Performance</w:t>
       </w:r>
       <w:r>
         <w:rPr>
@@ -14861,7 +15013,7 @@
           <w:i w:val="0"/>
           <w:sz w:val="24"/>
         </w:rPr>
-        <w:t>, v. 58, e102094, 2022. DOI: https://doi.org/10.1016/j.psychsport.2021.102094.</w:t>
+        <w:t>, v. 13, n. 5, p. 631-637, 2018. DOI: https://doi.org/10.1123/ijspp.2017-0725.</w:t>
       </w:r>
     </w:p>
     <w:p>
@@ -14876,7 +15028,7 @@
           <w:i w:val="0"/>
           <w:sz w:val="24"/>
         </w:rPr>
-        <w:t xml:space="preserve">HAN, C. S. Y.; PARSONS-SMITH, R. L.; TERRY, P. C. Mood Profiling in Singapore: Cross-Cultural Validation and Potential Applications of Mood Profile Clusters. </w:t>
+        <w:t xml:space="preserve">GALVÃO, M. C. B.; RICARTE, I. L. M. Revisão sistemática da literatura: conceituação, produção e publicação. </w:t>
       </w:r>
       <w:r>
         <w:rPr>
@@ -14884,7 +15036,7 @@
           <w:b/>
           <w:sz w:val="24"/>
         </w:rPr>
-        <w:t>Frontiers in Psychology</w:t>
+        <w:t>Logeion: Filosofia da Informação</w:t>
       </w:r>
       <w:r>
         <w:rPr>
@@ -14892,7 +15044,7 @@
           <w:i w:val="0"/>
           <w:sz w:val="24"/>
         </w:rPr>
-        <w:t>, v. 11, e665, 2020. DOI: https://doi.org/10.3389/fpsyg.2020.00665.</w:t>
+        <w:t>, v. 6, n. 1, p. 57-73, 2019. DOI: https://doi.org/10.21728/logeion.2019v6n1.p57-73.</w:t>
       </w:r>
     </w:p>
     <w:p>
@@ -14907,7 +15059,7 @@
           <w:i w:val="0"/>
           <w:sz w:val="24"/>
         </w:rPr>
-        <w:t xml:space="preserve">HARDY, C. J.; REJESKI, W. J. Not What, but How One Feels: The Measurement of Affect during Exercise. </w:t>
+        <w:t xml:space="preserve">GARCÍA-HERRERO, J. A. et al. Analysis of the Relationship between Satisfaction with the Coach and the Effect of Comparative Social Feedback in Elite Female Handball Players. </w:t>
       </w:r>
       <w:r>
         <w:rPr>
@@ -14915,7 +15067,7 @@
           <w:b/>
           <w:sz w:val="24"/>
         </w:rPr>
-        <w:t>Journal of Sport and Exercise Psychology</w:t>
+        <w:t>International Journal of Environmental Research and Public Health</w:t>
       </w:r>
       <w:r>
         <w:rPr>
@@ -14923,7 +15075,7 @@
           <w:i w:val="0"/>
           <w:sz w:val="24"/>
         </w:rPr>
-        <w:t>, v. 11, n. 3, p. 304-317, 1989. DOI: https://doi.org/10.1123/jsep.11.3.304.</w:t>
+        <w:t>, v. 19, n. 13, e7680, 2022. DOI: https://doi.org/10.3390/ijerph19137680.</w:t>
       </w:r>
     </w:p>
     <w:p>
@@ -14938,7 +15090,7 @@
           <w:i w:val="0"/>
           <w:sz w:val="24"/>
         </w:rPr>
-        <w:t xml:space="preserve">HINZ, M. et al. Differences in Decision-Making Behavior Between Elite and Amateur Team-Handball Players in a Near-Game Test Situation. </w:t>
+        <w:t xml:space="preserve">GARCÍA-SÁNCHEZ, C. et al. Physical Demands during Official Competitions in Elite Handball: A Systematic Review. </w:t>
       </w:r>
       <w:r>
         <w:rPr>
@@ -14946,7 +15098,7 @@
           <w:b/>
           <w:sz w:val="24"/>
         </w:rPr>
-        <w:t>Frontiers in Psychology</w:t>
+        <w:t>International Journal of Environmental Research and Public Health</w:t>
       </w:r>
       <w:r>
         <w:rPr>
@@ -14954,7 +15106,7 @@
           <w:i w:val="0"/>
           <w:sz w:val="24"/>
         </w:rPr>
-        <w:t>, v. 13, e854208, 2022. DOI: https://doi.org/10.3389/fpsyg.2022.854208.</w:t>
+        <w:t>, v. 20, n. 4, e3353, 2023. DOI: https://doi.org/10.3390/ijerph20043353.</w:t>
       </w:r>
     </w:p>
     <w:p>
@@ -14969,7 +15121,7 @@
           <w:i w:val="0"/>
           <w:sz w:val="24"/>
         </w:rPr>
-        <w:t xml:space="preserve">HOPKINS, W. G. et al. Progressive Statistics for Studies in Sports Medicine and Exercise Science. </w:t>
+        <w:t xml:space="preserve">GARWOOD, F. (i) Fiducial Limits for the Poisson Distribution. </w:t>
       </w:r>
       <w:r>
         <w:rPr>
@@ -14977,7 +15129,7 @@
           <w:b/>
           <w:sz w:val="24"/>
         </w:rPr>
-        <w:t>Medicine &amp; Science in Sports &amp; Exercise</w:t>
+        <w:t>Biometrika</w:t>
       </w:r>
       <w:r>
         <w:rPr>
@@ -14985,7 +15137,7 @@
           <w:i w:val="0"/>
           <w:sz w:val="24"/>
         </w:rPr>
-        <w:t>, v. 41, n. 1, p. 3-12, 2009. DOI: https://doi.org/10.1249/mss.0b013e31818cb278.</w:t>
+        <w:t>, v. 28, n. 3-4, p. 437-442, 1936. DOI: https://doi.org/10.1093/biomet/28.3-4.437.</w:t>
       </w:r>
     </w:p>
     <w:p>
@@ -15000,7 +15152,7 @@
           <w:i w:val="0"/>
           <w:sz w:val="24"/>
         </w:rPr>
-        <w:t xml:space="preserve">HYNDMAN, R. J. Moving Averages. In: </w:t>
+        <w:t xml:space="preserve">GHAZEL, N. et al. The effect of music on short-term exercise performance during the different menstrual cycle phases in female handball players. </w:t>
       </w:r>
       <w:r>
         <w:rPr>
@@ -15008,7 +15160,7 @@
           <w:b/>
           <w:sz w:val="24"/>
         </w:rPr>
-        <w:t>International Encyclopedia of Statistical Science</w:t>
+        <w:t>Research in Sports Medicine</w:t>
       </w:r>
       <w:r>
         <w:rPr>
@@ -15016,7 +15168,7 @@
           <w:i w:val="0"/>
           <w:sz w:val="24"/>
         </w:rPr>
-        <w:t>. [S. l.]: Springer Berlin Heidelberg, 2011. p. 866-869. DOI: https://doi.org/10.1007/978-3-642-04898-2_380.</w:t>
+        <w:t>, v. 30, n. 1, p. 50-60, 2022. DOI: https://doi.org/10.1080/15438627.2020.1860045.</w:t>
       </w:r>
     </w:p>
     <w:p>
@@ -15031,7 +15183,7 @@
           <w:i w:val="0"/>
           <w:sz w:val="24"/>
         </w:rPr>
-        <w:t xml:space="preserve">IVANOVIĆ, M.; IVANOVIĆ, U. Influence of health status and loneliness on satisfaction with life, emotional dimensions, and distress in junior handball players. </w:t>
+        <w:t xml:space="preserve">GOUTTEBARGE, V. et al. Occurrence of mental health symptoms and disorders in current and former elite athletes: a systematic review and meta-analysis. </w:t>
       </w:r>
       <w:r>
         <w:rPr>
@@ -15039,7 +15191,7 @@
           <w:b/>
           <w:sz w:val="24"/>
         </w:rPr>
-        <w:t>Exercise and Quality of Life</w:t>
+        <w:t>British Journal of Sports Medicine</w:t>
       </w:r>
       <w:r>
         <w:rPr>
@@ -15047,7 +15199,7 @@
           <w:i w:val="0"/>
           <w:sz w:val="24"/>
         </w:rPr>
-        <w:t>, v. 15, n. 1, p. 27-35, 2023. DOI: https://doi.org/10.31382/eqol.230604.</w:t>
+        <w:t>, v. 53, n. 11, p. 700-706, 2019. DOI: https://doi.org/10.1136/bjsports-2019-100671.</w:t>
       </w:r>
     </w:p>
     <w:p>
@@ -15062,7 +15214,7 @@
           <w:i w:val="0"/>
           <w:sz w:val="24"/>
         </w:rPr>
-        <w:t xml:space="preserve">JETZKE, M.; WINTER, C. Do we need a more flexible use of Team Timeout calling? Evidence from the Handball Bundesliga. </w:t>
+        <w:t xml:space="preserve">GOUTTEBARGE, V. et al. Supporting the IOC Consensus Statement on Mental Health in Elite Athletes: A Systematic Review and Meta-Analysis on the Prevalence of Mental Health Symptoms in Elite Sports. </w:t>
       </w:r>
       <w:r>
         <w:rPr>
@@ -15070,7 +15222,7 @@
           <w:b/>
           <w:sz w:val="24"/>
         </w:rPr>
-        <w:t>Journal of Sports Sciences</w:t>
+        <w:t>Sports</w:t>
       </w:r>
       <w:r>
         <w:rPr>
@@ -15078,7 +15230,7 @@
           <w:i w:val="0"/>
           <w:sz w:val="24"/>
         </w:rPr>
-        <w:t>, v. 40, n. 8, p. 878-885, 2022. DOI: https://doi.org/10.1080/02640414.2021.2022860.</w:t>
+        <w:t>, v. 14, n. 7, e296, 2026. DOI: https://doi.org/10.3390/sports14070296.</w:t>
       </w:r>
     </w:p>
     <w:p>
@@ -15093,7 +15245,7 @@
           <w:i w:val="0"/>
           <w:sz w:val="24"/>
         </w:rPr>
-        <w:t xml:space="preserve">KELLMANN, M. et al. Recovery and Performance in Sport: Consensus Statement. </w:t>
+        <w:t xml:space="preserve">GREBLO JURAKIĆ, Z.; BOJIĆ-ĆAĆIĆ, L.; LJUBIČIĆ, V. The relationship between perceived motivational climate and psychological well-being among adolescent handball players. </w:t>
       </w:r>
       <w:r>
         <w:rPr>
@@ -15101,7 +15253,7 @@
           <w:b/>
           <w:sz w:val="24"/>
         </w:rPr>
-        <w:t>International Journal of Sports Physiology and Performance</w:t>
+        <w:t>Frontiers in Sports and Active Living</w:t>
       </w:r>
       <w:r>
         <w:rPr>
@@ -15109,7 +15261,7 @@
           <w:i w:val="0"/>
           <w:sz w:val="24"/>
         </w:rPr>
-        <w:t>, v. 13, n. 2, p. 240-245, 2018. DOI: https://doi.org/10.1123/ijspp.2017-0759.</w:t>
+        <w:t>, v. 8, e1827113, 2026. DOI: https://doi.org/10.3389/fspor.2026.1827113.</w:t>
       </w:r>
     </w:p>
     <w:p>
@@ -15124,7 +15276,7 @@
           <w:i w:val="0"/>
           <w:sz w:val="24"/>
         </w:rPr>
-        <w:t xml:space="preserve">KHAZDOZI, G.; BAHARI, S. M.; ASHAYERI, H. Effects of Warming up with Music on Moods and Training Motivation among Athletes. </w:t>
+        <w:t xml:space="preserve">GÜMÜŞ, H.; GENÇOĞLU, C. The effects of the goalkeeper substitution rule as a new strategy in handball: Analysis of Men's European Handball Championship 2020. </w:t>
       </w:r>
       <w:r>
         <w:rPr>
@@ -15132,7 +15284,7 @@
           <w:b/>
           <w:sz w:val="24"/>
         </w:rPr>
-        <w:t>Journal of History Culture and Art Research</w:t>
+        <w:t>Acta Gymnica</w:t>
       </w:r>
       <w:r>
         <w:rPr>
@@ -15140,7 +15292,7 @@
           <w:i w:val="0"/>
           <w:sz w:val="24"/>
         </w:rPr>
-        <w:t>, v. 6, n. 1, e169, 2017. DOI: https://doi.org/10.7596/taksad.v6i1.713.</w:t>
+        <w:t>, v. 50, n. 3, p. 113-121, 2020. DOI: https://doi.org/10.5507/ag.2020.015.</w:t>
       </w:r>
     </w:p>
     <w:p>
@@ -15155,7 +15307,7 @@
           <w:i w:val="0"/>
           <w:sz w:val="24"/>
         </w:rPr>
-        <w:t xml:space="preserve">LAGNER, P. et al. Mood effects on memory and executive control in a real-life situation. </w:t>
+        <w:t xml:space="preserve">GWYTHER, K. et al. Sleep interventions for performance, mood and sleep outcomes in athletes: A systematic review and meta-analysis. </w:t>
       </w:r>
       <w:r>
         <w:rPr>
@@ -15163,7 +15315,7 @@
           <w:b/>
           <w:sz w:val="24"/>
         </w:rPr>
-        <w:t>Cognition and Emotion</w:t>
+        <w:t>Psychology of Sport and Exercise</w:t>
       </w:r>
       <w:r>
         <w:rPr>
@@ -15171,7 +15323,7 @@
           <w:i w:val="0"/>
           <w:sz w:val="24"/>
         </w:rPr>
-        <w:t>, v. 29, n. 6, p. 1107-1116, 2015. DOI: https://doi.org/10.1080/02699931.2014.962486.</w:t>
+        <w:t>, v. 58, e102094, 2022. DOI: https://doi.org/10.1016/j.psychsport.2021.102094.</w:t>
       </w:r>
     </w:p>
     <w:p>
@@ -15186,7 +15338,7 @@
           <w:i w:val="0"/>
           <w:sz w:val="24"/>
         </w:rPr>
-        <w:t xml:space="preserve">LAKICEVIC, N. et al. Rapid weight loss and mood states in judo athletes: A systematic review. </w:t>
+        <w:t xml:space="preserve">HAN, C. S. Y.; PARSONS-SMITH, R. L.; TERRY, P. C. Mood Profiling in Singapore: Cross-Cultural Validation and Potential Applications of Mood Profile Clusters. </w:t>
       </w:r>
       <w:r>
         <w:rPr>
@@ -15194,7 +15346,7 @@
           <w:b/>
           <w:sz w:val="24"/>
         </w:rPr>
-        <w:t>European Review of Applied Psychology</w:t>
+        <w:t>Frontiers in Psychology</w:t>
       </w:r>
       <w:r>
         <w:rPr>
@@ -15202,7 +15354,7 @@
           <w:i w:val="0"/>
           <w:sz w:val="24"/>
         </w:rPr>
-        <w:t>, v. 74, n. 4, e100933, 2024. DOI: https://doi.org/10.1016/j.erap.2023.100933.</w:t>
+        <w:t>, v. 11, e665, 2020. DOI: https://doi.org/10.3389/fpsyg.2020.00665.</w:t>
       </w:r>
     </w:p>
     <w:p>
@@ -15217,7 +15369,7 @@
           <w:i w:val="0"/>
           <w:sz w:val="24"/>
         </w:rPr>
-        <w:t xml:space="preserve">LANDIS, J. R.; KOCH, G. G. The Measurement of Observer Agreement for Categorical Data. </w:t>
+        <w:t xml:space="preserve">HARDY, C. J.; REJESKI, W. J. Not What, but How One Feels: The Measurement of Affect during Exercise. </w:t>
       </w:r>
       <w:r>
         <w:rPr>
@@ -15225,7 +15377,7 @@
           <w:b/>
           <w:sz w:val="24"/>
         </w:rPr>
-        <w:t>Biometrics</w:t>
+        <w:t>Journal of Sport and Exercise Psychology</w:t>
       </w:r>
       <w:r>
         <w:rPr>
@@ -15233,7 +15385,7 @@
           <w:i w:val="0"/>
           <w:sz w:val="24"/>
         </w:rPr>
-        <w:t>, v. 33, n. 1, e159, 1977. DOI: https://doi.org/10.2307/2529310.</w:t>
+        <w:t>, v. 11, n. 3, p. 304-317, 1989. DOI: https://doi.org/10.1123/jsep.11.3.304.</w:t>
       </w:r>
     </w:p>
     <w:p>
@@ -15248,7 +15400,7 @@
           <w:i w:val="0"/>
           <w:sz w:val="24"/>
         </w:rPr>
-        <w:t xml:space="preserve">LANE, A. M.; TERRY, P. C. The Nature of Mood: Development of a Conceptual Model with a Focus on Depression. </w:t>
+        <w:t xml:space="preserve">HE, X. et al. Effects of music on affective responses to acute exercise: A meta‐analytic review and multilevel meta‐analysis. </w:t>
       </w:r>
       <w:r>
         <w:rPr>
@@ -15256,7 +15408,7 @@
           <w:b/>
           <w:sz w:val="24"/>
         </w:rPr>
-        <w:t>Journal of Applied Sport Psychology</w:t>
+        <w:t>Applied Psychology: Health and Well-Being</w:t>
       </w:r>
       <w:r>
         <w:rPr>
@@ -15264,7 +15416,7 @@
           <w:i w:val="0"/>
           <w:sz w:val="24"/>
         </w:rPr>
-        <w:t>, v. 12, n. 1, p. 16-33, 2000. DOI: https://doi.org/10.1080/10413200008404211.</w:t>
+        <w:t>, v. 17, n. 6, e70092, 2025. DOI: https://doi.org/10.1111/aphw.70092.</w:t>
       </w:r>
     </w:p>
     <w:p>
@@ -15279,7 +15431,7 @@
           <w:i w:val="0"/>
           <w:sz w:val="24"/>
         </w:rPr>
-        <w:t xml:space="preserve">LAZARUS, R. S. How Emotions Influence Performance in Competitive Sports. </w:t>
+        <w:t xml:space="preserve">HENZE, A.-S. et al. Athlete Monitoring in Handball (ATHMON HB): Relationship Between Well-Being and Match Performance in Elite Male Handball Players. </w:t>
       </w:r>
       <w:r>
         <w:rPr>
@@ -15287,7 +15439,7 @@
           <w:b/>
           <w:sz w:val="24"/>
         </w:rPr>
-        <w:t>The Sport Psychologist</w:t>
+        <w:t>International Journal of Sports Physiology and Performance</w:t>
       </w:r>
       <w:r>
         <w:rPr>
@@ -15295,7 +15447,7 @@
           <w:i w:val="0"/>
           <w:sz w:val="24"/>
         </w:rPr>
-        <w:t>, v. 14, n. 3, p. 229-252, 2000. DOI: https://doi.org/10.1123/tsp.14.3.229.</w:t>
+        <w:t>, v. 21, n. 3, p. 384-391, 2026. DOI: https://doi.org/10.1123/ijspp.2025-0341.</w:t>
       </w:r>
     </w:p>
     <w:p>
@@ -15310,7 +15462,7 @@
           <w:i w:val="0"/>
           <w:sz w:val="24"/>
         </w:rPr>
-        <w:t xml:space="preserve">LISENCHUK, G. et al. Analysis of psychological state of qualified female handball players depending on the phase of the ovarian-menstrual cycle. </w:t>
+        <w:t xml:space="preserve">HINZ, M. et al. Differences in Decision-Making Behavior Between Elite and Amateur Team-Handball Players in a Near-Game Test Situation. </w:t>
       </w:r>
       <w:r>
         <w:rPr>
@@ -15318,7 +15470,7 @@
           <w:b/>
           <w:sz w:val="24"/>
         </w:rPr>
-        <w:t>Journal of Physical Education and Sport</w:t>
+        <w:t>Frontiers in Psychology</w:t>
       </w:r>
       <w:r>
         <w:rPr>
@@ -15326,7 +15478,7 @@
           <w:i w:val="0"/>
           <w:sz w:val="24"/>
         </w:rPr>
-        <w:t>, v. 19, supl. 3, art. 115, p. 808-812, 2019. DOI: https://doi.org/10.7752/jpes.2019.s3115.</w:t>
+        <w:t>, v. 13, e854208, 2022. DOI: https://doi.org/10.3389/fpsyg.2022.854208.</w:t>
       </w:r>
     </w:p>
     <w:p>
@@ -15341,7 +15493,7 @@
           <w:i w:val="0"/>
           <w:sz w:val="24"/>
         </w:rPr>
-        <w:t xml:space="preserve">LOCHBAUM, M. et al. The Profile of Moods States and Athletic Performance: A Meta-Analysis of Published Studies. </w:t>
+        <w:t xml:space="preserve">HOPKINS, W. G. et al. Progressive Statistics for Studies in Sports Medicine and Exercise Science. </w:t>
       </w:r>
       <w:r>
         <w:rPr>
@@ -15349,7 +15501,7 @@
           <w:b/>
           <w:sz w:val="24"/>
         </w:rPr>
-        <w:t>European Journal of Investigation in Health, Psychology and Education</w:t>
+        <w:t>Medicine &amp; Science in Sports &amp; Exercise</w:t>
       </w:r>
       <w:r>
         <w:rPr>
@@ -15357,7 +15509,7 @@
           <w:i w:val="0"/>
           <w:sz w:val="24"/>
         </w:rPr>
-        <w:t>, v. 11, n. 1, p. 50-70, 2021. DOI: https://doi.org/10.3390/ejihpe11010005.</w:t>
+        <w:t>, v. 41, n. 1, p. 3-12, 2009. DOI: https://doi.org/10.1249/mss.0b013e31818cb278.</w:t>
       </w:r>
     </w:p>
     <w:p>
@@ -15372,7 +15524,7 @@
           <w:i w:val="0"/>
           <w:sz w:val="24"/>
         </w:rPr>
-        <w:t xml:space="preserve">LUJIC, M.; PRSKALO, I.; BRATKO, D. difference in well-being between handball players and ones not physically active. </w:t>
+        <w:t xml:space="preserve">HU, X.; CHEN, P. Time-of-day effects of acute and regular exercise on sleep quality and mood: a three-level meta-analysis. </w:t>
       </w:r>
       <w:r>
         <w:rPr>
@@ -15380,7 +15532,7 @@
           <w:b/>
           <w:sz w:val="24"/>
         </w:rPr>
-        <w:t>Scientific Journal of Sport and Performance</w:t>
+        <w:t>Frontiers in Psychology</w:t>
       </w:r>
       <w:r>
         <w:rPr>
@@ -15388,7 +15540,7 @@
           <w:i w:val="0"/>
           <w:sz w:val="24"/>
         </w:rPr>
-        <w:t>, v. 2, n. 2, p. 144-150, 2023. DOI: https://doi.org/10.55860/fhsl7752.</w:t>
+        <w:t>, v. 17, e1933599, 2026. DOI: https://doi.org/10.3389/fpsyg.2026.1933599.</w:t>
       </w:r>
     </w:p>
     <w:p>
@@ -15403,7 +15555,7 @@
           <w:i w:val="0"/>
           <w:sz w:val="24"/>
         </w:rPr>
-        <w:t xml:space="preserve">MACEDO, L. et al. Playing without goalkeeper: the use of an empty goal in high-performance men’s handball. </w:t>
+        <w:t xml:space="preserve">HYNDMAN, R. J. Moving Averages. In: </w:t>
       </w:r>
       <w:r>
         <w:rPr>
@@ -15411,7 +15563,7 @@
           <w:b/>
           <w:sz w:val="24"/>
         </w:rPr>
-        <w:t>International Journal of Performance Analysis in Sport</w:t>
+        <w:t>International Encyclopedia of Statistical Science</w:t>
       </w:r>
       <w:r>
         <w:rPr>
@@ -15419,7 +15571,7 @@
           <w:i w:val="0"/>
           <w:sz w:val="24"/>
         </w:rPr>
-        <w:t>, v. 25, n. 6, p. 1189-1207, 2025. DOI: https://doi.org/10.1080/24748668.2024.2354109.</w:t>
+        <w:t>. [S. l.]: Springer Berlin Heidelberg, 2011. p. 866-869. DOI: https://doi.org/10.1007/978-3-642-04898-2_380.</w:t>
       </w:r>
     </w:p>
     <w:p>
@@ -15434,7 +15586,7 @@
           <w:i w:val="0"/>
           <w:sz w:val="24"/>
         </w:rPr>
-        <w:t xml:space="preserve">MCHUGH, M. L. Interrater reliability: the kappa statistic. </w:t>
+        <w:t xml:space="preserve">IANNACCONE, A. et al. Relationship Between External and Internal Load Measures in Youth Beach Handball. </w:t>
       </w:r>
       <w:r>
         <w:rPr>
@@ -15442,7 +15594,7 @@
           <w:b/>
           <w:sz w:val="24"/>
         </w:rPr>
-        <w:t>Biochemia Medica</w:t>
+        <w:t>International Journal of Sports Physiology and Performance</w:t>
       </w:r>
       <w:r>
         <w:rPr>
@@ -15450,7 +15602,7 @@
           <w:i w:val="0"/>
           <w:sz w:val="24"/>
         </w:rPr>
-        <w:t>, p. 276-282, 2012. DOI: https://doi.org/10.11613/bm.2012.031.</w:t>
+        <w:t>, v. 17, n. 2, p. 256-262, 2022. DOI: https://doi.org/10.1123/ijspp.2021-0225.</w:t>
       </w:r>
     </w:p>
     <w:p>
@@ -15465,7 +15617,7 @@
           <w:i w:val="0"/>
           <w:sz w:val="24"/>
         </w:rPr>
-        <w:t xml:space="preserve">MEYERS, S.; TAMIR, M. Emotion Regulation Versus Mood Regulation. </w:t>
+        <w:t xml:space="preserve">IVANOVIĆ, M.; IVANOVIĆ, U. Influence of health status and loneliness on satisfaction with life, emotional dimensions, and distress in junior handball players. </w:t>
       </w:r>
       <w:r>
         <w:rPr>
@@ -15473,7 +15625,7 @@
           <w:b/>
           <w:sz w:val="24"/>
         </w:rPr>
-        <w:t>Emotion Review</w:t>
+        <w:t>Exercise and Quality of Life</w:t>
       </w:r>
       <w:r>
         <w:rPr>
@@ -15481,7 +15633,7 @@
           <w:i w:val="0"/>
           <w:sz w:val="24"/>
         </w:rPr>
-        <w:t>, v. 16, n. 3, p. 151-161, 2024. DOI: https://doi.org/10.1177/17540739241259559.</w:t>
+        <w:t>, v. 15, n. 1, p. 27-35, 2023. DOI: https://doi.org/10.31382/eqol.230604.</w:t>
       </w:r>
     </w:p>
     <w:p>
@@ -15496,7 +15648,7 @@
           <w:i w:val="0"/>
           <w:sz w:val="24"/>
         </w:rPr>
-        <w:t xml:space="preserve">MICHALSIK, L.; AAGAARD, P.; MADSEN, K. Locomotion Characteristics and Match-Induced Impairments in Physical Performance in Male Elite Team Handball Players. </w:t>
+        <w:t xml:space="preserve">JEFFRIES, A. C. et al. Athlete-Reported Outcome Measures for Monitoring Training Responses: A Systematic Review of Risk of Bias and Measurement Property Quality According to the COSMIN Guidelines. </w:t>
       </w:r>
       <w:r>
         <w:rPr>
@@ -15504,7 +15656,7 @@
           <w:b/>
           <w:sz w:val="24"/>
         </w:rPr>
-        <w:t>International Journal of Sports Medicine</w:t>
+        <w:t>International Journal of Sports Physiology and Performance</w:t>
       </w:r>
       <w:r>
         <w:rPr>
@@ -15512,7 +15664,7 @@
           <w:i w:val="0"/>
           <w:sz w:val="24"/>
         </w:rPr>
-        <w:t>, v. 34, n. 07, p. 590-599, 2012. DOI: https://doi.org/10.1055/s-0032-1329989.</w:t>
+        <w:t>, v. 15, n. 9, p. 1203-1215, 2020. DOI: https://doi.org/10.1123/ijspp.2020-0386.</w:t>
       </w:r>
     </w:p>
     <w:p>
@@ -15527,7 +15679,7 @@
           <w:i w:val="0"/>
           <w:sz w:val="24"/>
         </w:rPr>
-        <w:t xml:space="preserve">MIRALLES-AMORÓS, L. et al. Study of Different Personalised Dietary Plans on Eating Behaviour, Body Image and Mood in Young Female Professional Handball Players: A Randomised Controlled Trial. </w:t>
+        <w:t xml:space="preserve">JETZKE, M.; WINTER, C. Do we need a more flexible use of Team Timeout calling? Evidence from the Handball Bundesliga. </w:t>
       </w:r>
       <w:r>
         <w:rPr>
@@ -15535,7 +15687,7 @@
           <w:b/>
           <w:sz w:val="24"/>
         </w:rPr>
-        <w:t>Children</w:t>
+        <w:t>Journal of Sports Sciences</w:t>
       </w:r>
       <w:r>
         <w:rPr>
@@ -15543,7 +15695,7 @@
           <w:i w:val="0"/>
           <w:sz w:val="24"/>
         </w:rPr>
-        <w:t>, v. 10, n. 2, e259, 2023. DOI: https://doi.org/10.3390/children10020259.</w:t>
+        <w:t>, v. 40, n. 8, p. 878-885, 2022. DOI: https://doi.org/10.1080/02640414.2021.2022860.</w:t>
       </w:r>
     </w:p>
     <w:p>
@@ -15558,7 +15710,7 @@
           <w:i w:val="0"/>
           <w:sz w:val="24"/>
         </w:rPr>
-        <w:t xml:space="preserve">MON-LÓPEZ, D. et al. The Impact of Covid-19 and the Effect of Psychological Factors on Training Conditions of Handball Players. </w:t>
+        <w:t xml:space="preserve">JIA, L. et al. The Effect of the COVID-19 Pandemic on the Mental and Emotional Health of Athletes: A Systematic Review. </w:t>
       </w:r>
       <w:r>
         <w:rPr>
@@ -15566,7 +15718,7 @@
           <w:b/>
           <w:sz w:val="24"/>
         </w:rPr>
-        <w:t>International Journal of Environmental Research and Public Health</w:t>
+        <w:t>The American Journal of Sports Medicine</w:t>
       </w:r>
       <w:r>
         <w:rPr>
@@ -15574,7 +15726,7 @@
           <w:i w:val="0"/>
           <w:sz w:val="24"/>
         </w:rPr>
-        <w:t>, v. 17, n. 18, e6471, 2020. DOI: https://doi.org/10.3390/ijerph17186471.</w:t>
+        <w:t>, v. 51, n. 8, p. 2207-2215, 2023. DOI: https://doi.org/10.1177/03635465221087473.</w:t>
       </w:r>
     </w:p>
     <w:p>
@@ -15589,7 +15741,7 @@
           <w:i w:val="0"/>
           <w:sz w:val="24"/>
         </w:rPr>
-        <w:t xml:space="preserve">MONTES, F. A.; GOMES, S. C. Correlação entre resistência anaeróbia e estados de humor ao longo de uma temporada na modalidade handebol. </w:t>
+        <w:t xml:space="preserve">JODRA, P. et al. Effects of caffeine supplementation on physical performance and mood dimensions in elite and trained-recreational athletes. </w:t>
       </w:r>
       <w:r>
         <w:rPr>
@@ -15597,7 +15749,7 @@
           <w:b/>
           <w:sz w:val="24"/>
         </w:rPr>
-        <w:t>UNOPAR Científica Ciências Biológicas e da Saúde</w:t>
+        <w:t>Journal of the International Society of Sports Nutrition</w:t>
       </w:r>
       <w:r>
         <w:rPr>
@@ -15605,7 +15757,7 @@
           <w:i w:val="0"/>
           <w:sz w:val="24"/>
         </w:rPr>
-        <w:t>, v. 16, n. 2, p. 83-86, 2014.</w:t>
+        <w:t>, v. 17, n. 1, e2, 2020. DOI: https://doi.org/10.1186/s12970-019-0332-5.</w:t>
       </w:r>
     </w:p>
     <w:p>
@@ -15620,7 +15772,7 @@
           <w:i w:val="0"/>
           <w:sz w:val="24"/>
         </w:rPr>
-        <w:t xml:space="preserve">MORENAS-AGUILAR, M. et al. The menstrual cycle does not influence vertical jump performance or throwing velocity in amateur team handball players. </w:t>
+        <w:t xml:space="preserve">KELLMANN, M. et al. Recovery and Performance in Sport: Consensus Statement. </w:t>
       </w:r>
       <w:r>
         <w:rPr>
@@ -15628,7 +15780,7 @@
           <w:b/>
           <w:sz w:val="24"/>
         </w:rPr>
-        <w:t>Science &amp; Sports</w:t>
+        <w:t>International Journal of Sports Physiology and Performance</w:t>
       </w:r>
       <w:r>
         <w:rPr>
@@ -15636,7 +15788,7 @@
           <w:i w:val="0"/>
           <w:sz w:val="24"/>
         </w:rPr>
-        <w:t>, v. 38, n. 2, p. 211-215, 2023. DOI: https://doi.org/10.1016/j.scispo.2022.02.008.</w:t>
+        <w:t>, v. 13, n. 2, p. 240-245, 2018. DOI: https://doi.org/10.1123/ijspp.2017-0759.</w:t>
       </w:r>
     </w:p>
     <w:p>
@@ -15651,7 +15803,7 @@
           <w:i w:val="0"/>
           <w:sz w:val="24"/>
         </w:rPr>
-        <w:t xml:space="preserve">MORGAN, W. P. et al. Psychological monitoring of overtraining and staleness. </w:t>
+        <w:t xml:space="preserve">KEW, M. E. et al. Sex Differences in Mental Health Symptoms in Elite Athletes: A Systematic Review and Meta-analysis. </w:t>
       </w:r>
       <w:r>
         <w:rPr>
@@ -15659,7 +15811,7 @@
           <w:b/>
           <w:sz w:val="24"/>
         </w:rPr>
-        <w:t>British Journal of Sports Medicine</w:t>
+        <w:t>Sports Health: A Multidisciplinary Approach</w:t>
       </w:r>
       <w:r>
         <w:rPr>
@@ -15667,7 +15819,7 @@
           <w:i w:val="0"/>
           <w:sz w:val="24"/>
         </w:rPr>
-        <w:t>, v. 21, n. 3, p. 107-114, 1987. DOI: https://doi.org/10.1136/bjsm.21.3.107.</w:t>
+        <w:t>, v. 17, n. 4, p. 732-743, 2025. DOI: https://doi.org/10.1177/19417381241264491.</w:t>
       </w:r>
     </w:p>
     <w:p>
@@ -15682,7 +15834,7 @@
           <w:i w:val="0"/>
           <w:sz w:val="24"/>
         </w:rPr>
-        <w:t xml:space="preserve">MUNN, Z. et al. Systematic review or scoping review? Guidance for authors when choosing between a systematic or scoping review approach. </w:t>
+        <w:t xml:space="preserve">KHAZDOZI, G.; BAHARI, S. M.; ASHAYERI, H. Effects of Warming up with Music on Moods and Training Motivation among Athletes. </w:t>
       </w:r>
       <w:r>
         <w:rPr>
@@ -15690,7 +15842,7 @@
           <w:b/>
           <w:sz w:val="24"/>
         </w:rPr>
-        <w:t>BMC Medical Research Methodology</w:t>
+        <w:t>Journal of History Culture and Art Research</w:t>
       </w:r>
       <w:r>
         <w:rPr>
@@ -15698,7 +15850,7 @@
           <w:i w:val="0"/>
           <w:sz w:val="24"/>
         </w:rPr>
-        <w:t>, v. 18, n. 1, e143, 2018a. DOI: https://doi.org/10.1186/s12874-018-0611-x.</w:t>
+        <w:t>, v. 6, n. 1, e169, 2017. DOI: https://doi.org/10.7596/taksad.v6i1.713.</w:t>
       </w:r>
     </w:p>
     <w:p>
@@ -15713,7 +15865,7 @@
           <w:i w:val="0"/>
           <w:sz w:val="24"/>
         </w:rPr>
-        <w:t xml:space="preserve">MUNN, Z. et al. What kind of systematic review should I conduct? A proposed typology and guidance for systematic reviewers in the medical and health sciences. </w:t>
+        <w:t xml:space="preserve">KUO, L.-T. et al. Exploring mental health symptoms in elite athletes during the COVID-19 pandemic: A systematic review and meta-analysis on sex differences. </w:t>
       </w:r>
       <w:r>
         <w:rPr>
@@ -15721,7 +15873,7 @@
           <w:b/>
           <w:sz w:val="24"/>
         </w:rPr>
-        <w:t>BMC Medical Research Methodology</w:t>
+        <w:t>PLOS ONE</w:t>
       </w:r>
       <w:r>
         <w:rPr>
@@ -15729,7 +15881,7 @@
           <w:i w:val="0"/>
           <w:sz w:val="24"/>
         </w:rPr>
-        <w:t>, v. 18, n. 1, e5, 2018b. DOI: https://doi.org/10.1186/s12874-017-0468-4.</w:t>
+        <w:t>, v. 20, n. 1, e0314996, 2025. DOI: https://doi.org/10.1371/journal.pone.0314996.</w:t>
       </w:r>
     </w:p>
     <w:p>
@@ -15744,15 +15896,15 @@
           <w:i w:val="0"/>
           <w:sz w:val="24"/>
         </w:rPr>
-        <w:t xml:space="preserve">NUGRAHA, E.; WIBOWO, R.; FIRMANSYAH, H. Mood states and game performance in invasion game activities: a correlation study among elementary school students. </w:t>
-      </w:r>
-      <w:r>
-        <w:rPr>
-          <w:rFonts w:ascii="Times New Roman" w:hAnsi="Times New Roman"/>
-          <w:i/>
+        <w:t xml:space="preserve">LAGNER, P. et al. Mood effects on memory and executive control in a real-life situation. </w:t>
+      </w:r>
+      <w:r>
+        <w:rPr>
+          <w:rFonts w:ascii="Times New Roman" w:hAnsi="Times New Roman"/>
+          <w:b/>
           <w:sz w:val="24"/>
         </w:rPr>
-        <w:t>In</w:t>
+        <w:t>Cognition and Emotion</w:t>
       </w:r>
       <w:r>
         <w:rPr>
@@ -15760,23 +15912,7 @@
           <w:i w:val="0"/>
           <w:sz w:val="24"/>
         </w:rPr>
-        <w:t xml:space="preserve">: INTERNATIONAL CONFERENCE ON SPORT SCIENCE, HEALTH, AND PHYSICAL EDUCATION, 4., 2019, Bandung. </w:t>
-      </w:r>
-      <w:r>
-        <w:rPr>
-          <w:rFonts w:ascii="Times New Roman" w:hAnsi="Times New Roman"/>
-          <w:b/>
-          <w:sz w:val="24"/>
-        </w:rPr>
-        <w:t>Proceedings</w:t>
-      </w:r>
-      <w:r>
-        <w:rPr>
-          <w:rFonts w:ascii="Times New Roman" w:hAnsi="Times New Roman"/>
-          <w:i w:val="0"/>
-          <w:sz w:val="24"/>
-        </w:rPr>
-        <w:t xml:space="preserve"> [...]. Paris: Atlantis Press, 2020. p. 95-98. DOI: https://doi.org/10.2991/ahsr.k.200214.027.</w:t>
+        <w:t>, v. 29, n. 6, p. 1107-1116, 2015. DOI: https://doi.org/10.1080/02699931.2014.962486.</w:t>
       </w:r>
     </w:p>
     <w:p>
@@ -15791,7 +15927,7 @@
           <w:i w:val="0"/>
           <w:sz w:val="24"/>
         </w:rPr>
-        <w:t xml:space="preserve">OBREGÓN SIBÓN, I. et al. Cambios postest en el umbral mecánico nociceptivo de la musculatura del hombro y en el estado de ánimo en jugadores de balonmano. </w:t>
+        <w:t xml:space="preserve">LAKICEVIC, N. et al. Rapid weight loss and mood states in judo athletes: A systematic review. </w:t>
       </w:r>
       <w:r>
         <w:rPr>
@@ -15799,7 +15935,7 @@
           <w:b/>
           <w:sz w:val="24"/>
         </w:rPr>
-        <w:t>Cuestiones de Fisioterapia</w:t>
+        <w:t>European Review of Applied Psychology</w:t>
       </w:r>
       <w:r>
         <w:rPr>
@@ -15807,7 +15943,7 @@
           <w:i w:val="0"/>
           <w:sz w:val="24"/>
         </w:rPr>
-        <w:t>, v. 46, n. 3, p. 183-191, 2017. Disponível em: https://dialnet.unirioja.es/servlet/articulo?codigo=6263341. Acesso em: 21 out. 2026.</w:t>
+        <w:t>, v. 74, n. 4, e100933, 2024. DOI: https://doi.org/10.1016/j.erap.2023.100933.</w:t>
       </w:r>
     </w:p>
     <w:p>
@@ -15822,7 +15958,7 @@
           <w:i w:val="0"/>
           <w:sz w:val="24"/>
         </w:rPr>
-        <w:t xml:space="preserve">OUZZANI, M. et al. Rayyan—a web and mobile app for systematic reviews. </w:t>
+        <w:t xml:space="preserve">LANDIS, J. R.; KOCH, G. G. The Measurement of Observer Agreement for Categorical Data. </w:t>
       </w:r>
       <w:r>
         <w:rPr>
@@ -15830,7 +15966,7 @@
           <w:b/>
           <w:sz w:val="24"/>
         </w:rPr>
-        <w:t>Systematic Reviews</w:t>
+        <w:t>Biometrics</w:t>
       </w:r>
       <w:r>
         <w:rPr>
@@ -15838,7 +15974,7 @@
           <w:i w:val="0"/>
           <w:sz w:val="24"/>
         </w:rPr>
-        <w:t>, v. 5, n. 1, e210, 2016. DOI: https://doi.org/10.1186/s13643-016-0384-4.</w:t>
+        <w:t>, v. 33, n. 1, e159, 1977. DOI: https://doi.org/10.2307/2529310.</w:t>
       </w:r>
     </w:p>
     <w:p>
@@ -15853,7 +15989,7 @@
           <w:i w:val="0"/>
           <w:sz w:val="24"/>
         </w:rPr>
-        <w:t xml:space="preserve">PADILHAS, O. P. et al. Inter season physiological control of the brazilian beach handball team. </w:t>
+        <w:t xml:space="preserve">LANE, A. M.; TERRY, P. C. The Nature of Mood: Development of a Conceptual Model with a Focus on Depression. </w:t>
       </w:r>
       <w:r>
         <w:rPr>
@@ -15861,7 +15997,7 @@
           <w:b/>
           <w:sz w:val="24"/>
         </w:rPr>
-        <w:t>Revista Brasileira de Medicina do Esporte</w:t>
+        <w:t>Journal of Applied Sport Psychology</w:t>
       </w:r>
       <w:r>
         <w:rPr>
@@ -15869,7 +16005,7 @@
           <w:i w:val="0"/>
           <w:sz w:val="24"/>
         </w:rPr>
-        <w:t>, v. 24, n. 6, p. 436-439, 2018. DOI: https://doi.org/10.1590/1517-869220182406153471.</w:t>
+        <w:t>, v. 12, n. 1, p. 16-33, 2000. DOI: https://doi.org/10.1080/10413200008404211.</w:t>
       </w:r>
     </w:p>
     <w:p>
@@ -15884,7 +16020,7 @@
           <w:i w:val="0"/>
           <w:sz w:val="24"/>
         </w:rPr>
-        <w:t xml:space="preserve">PAGE, M. J. et al. The PRISMA 2020 statement: an updated guideline for reporting systematic reviews. </w:t>
+        <w:t xml:space="preserve">LAZARUS, R. S. How Emotions Influence Performance in Competitive Sports. </w:t>
       </w:r>
       <w:r>
         <w:rPr>
@@ -15892,7 +16028,7 @@
           <w:b/>
           <w:sz w:val="24"/>
         </w:rPr>
-        <w:t>BMJ</w:t>
+        <w:t>The Sport Psychologist</w:t>
       </w:r>
       <w:r>
         <w:rPr>
@@ -15900,7 +16036,7 @@
           <w:i w:val="0"/>
           <w:sz w:val="24"/>
         </w:rPr>
-        <w:t>, n71, 2021. DOI: https://doi.org/10.1136/bmj.n71.</w:t>
+        <w:t>, v. 14, n. 3, p. 229-252, 2000. DOI: https://doi.org/10.1123/tsp.14.3.229.</w:t>
       </w:r>
     </w:p>
     <w:p>
@@ -15915,7 +16051,7 @@
           <w:i w:val="0"/>
           <w:sz w:val="24"/>
         </w:rPr>
-        <w:t xml:space="preserve">PARSONS-SMITH, R. L.; TERRY, P. C.; MACHIN, M. A. Identification and Description of Novel Mood Profile Clusters. </w:t>
+        <w:t xml:space="preserve">LISENCHUK, G. et al. Analysis of psychological state of qualified female handball players depending on the phase of the ovarian-menstrual cycle. </w:t>
       </w:r>
       <w:r>
         <w:rPr>
@@ -15923,7 +16059,7 @@
           <w:b/>
           <w:sz w:val="24"/>
         </w:rPr>
-        <w:t>Frontiers in Psychology</w:t>
+        <w:t>Journal of Physical Education and Sport</w:t>
       </w:r>
       <w:r>
         <w:rPr>
@@ -15931,7 +16067,7 @@
           <w:i w:val="0"/>
           <w:sz w:val="24"/>
         </w:rPr>
-        <w:t>, v. 8, e1958, 2017. DOI: https://doi.org/10.3389/fpsyg.2017.01958.</w:t>
+        <w:t>, v. 19, supl. 3, art. 115, p. 808-812, 2019. DOI: https://doi.org/10.7752/jpes.2019.s3115.</w:t>
       </w:r>
     </w:p>
     <w:p>
@@ -15946,7 +16082,7 @@
           <w:i w:val="0"/>
           <w:sz w:val="24"/>
         </w:rPr>
-        <w:t xml:space="preserve">PEREIRA, R. et al. Avaliação do Estado Fisiológico de Escolares Atletas. </w:t>
+        <w:t xml:space="preserve">LOCHBAUM, M. et al. Sport psychology and performance meta-analyses: A systematic review of the literature. </w:t>
       </w:r>
       <w:r>
         <w:rPr>
@@ -15954,7 +16090,7 @@
           <w:b/>
           <w:sz w:val="24"/>
         </w:rPr>
-        <w:t>Revista Brasileira de Ciências da Saúde</w:t>
+        <w:t>PLOS ONE</w:t>
       </w:r>
       <w:r>
         <w:rPr>
@@ -15962,7 +16098,7 @@
           <w:i w:val="0"/>
           <w:sz w:val="24"/>
         </w:rPr>
-        <w:t>, v. 18, n. S4, p. 75-82, 2014. DOI: https://doi.org/10.4034/RBCS.2014.18.S4.10.</w:t>
+        <w:t>, v. 17, n. 2, e0263408, 2022. DOI: https://doi.org/10.1371/journal.pone.0263408.</w:t>
       </w:r>
     </w:p>
     <w:p>
@@ -15977,7 +16113,7 @@
           <w:i w:val="0"/>
           <w:sz w:val="24"/>
         </w:rPr>
-        <w:t xml:space="preserve">PETERS, M. D. et al. Updated methodological guidance for the conduct of scoping reviews. </w:t>
+        <w:t xml:space="preserve">LOCHBAUM, M. et al. The Profile of Moods States and Athletic Performance: A Meta-Analysis of Published Studies. </w:t>
       </w:r>
       <w:r>
         <w:rPr>
@@ -15985,7 +16121,7 @@
           <w:b/>
           <w:sz w:val="24"/>
         </w:rPr>
-        <w:t>JBI Evidence Synthesis</w:t>
+        <w:t>European Journal of Investigation in Health, Psychology and Education</w:t>
       </w:r>
       <w:r>
         <w:rPr>
@@ -15993,7 +16129,7 @@
           <w:i w:val="0"/>
           <w:sz w:val="24"/>
         </w:rPr>
-        <w:t>, v. 18, n. 10, p. 2119-2126, 2020. DOI: https://doi.org/10.11124/jbies-20-00167.</w:t>
+        <w:t>, v. 11, n. 1, p. 50-70, 2021. DOI: https://doi.org/10.3390/ejihpe11010005.</w:t>
       </w:r>
     </w:p>
     <w:p>
@@ -16008,7 +16144,7 @@
           <w:i w:val="0"/>
           <w:sz w:val="24"/>
         </w:rPr>
-        <w:t xml:space="preserve">PÓVOAS, S. C. et al. Physical and Physiological Demands of Elite Team Handball. </w:t>
+        <w:t xml:space="preserve">LOCHBAUM, M.; SISNEROS, C. A Systematic Review with a Meta-Analysis of the Motivational Climate and Hedonic Well-Being Constructs: The Importance of the Athlete Level. </w:t>
       </w:r>
       <w:r>
         <w:rPr>
@@ -16016,7 +16152,7 @@
           <w:b/>
           <w:sz w:val="24"/>
         </w:rPr>
-        <w:t>Journal of Strength and Conditioning Research</w:t>
+        <w:t>European Journal of Investigation in Health, Psychology and Education</w:t>
       </w:r>
       <w:r>
         <w:rPr>
@@ -16024,7 +16160,7 @@
           <w:i w:val="0"/>
           <w:sz w:val="24"/>
         </w:rPr>
-        <w:t>, v. 26, n. 12, p. 3365-3375, 2012. DOI: https://doi.org/10.1519/jsc.0b013e318248aeee.</w:t>
+        <w:t>, v. 14, n. 4, p. 976-1001, 2024. DOI: https://doi.org/10.3390/ejihpe14040064.</w:t>
       </w:r>
     </w:p>
     <w:p>
@@ -16039,7 +16175,7 @@
           <w:i w:val="0"/>
           <w:sz w:val="24"/>
         </w:rPr>
-        <w:t xml:space="preserve">RAAB, M.; JOHNSON, J. G. Expertise-based differences in search and option-generation strategies. </w:t>
+        <w:t xml:space="preserve">LUJIC, M.; PRSKALO, I.; BRATKO, D. difference in well-being between handball players and ones not physically active. </w:t>
       </w:r>
       <w:r>
         <w:rPr>
@@ -16047,7 +16183,7 @@
           <w:b/>
           <w:sz w:val="24"/>
         </w:rPr>
-        <w:t>Journal of Experimental Psychology: Applied</w:t>
+        <w:t>Scientific Journal of Sport and Performance</w:t>
       </w:r>
       <w:r>
         <w:rPr>
@@ -16055,7 +16191,7 @@
           <w:i w:val="0"/>
           <w:sz w:val="24"/>
         </w:rPr>
-        <w:t>, v. 13, n. 3, p. 158-170, 2007. DOI: https://doi.org/10.1037/1076-898x.13.3.158.</w:t>
+        <w:t>, v. 2, n. 2, p. 144-150, 2023. DOI: https://doi.org/10.55860/fhsl7752.</w:t>
       </w:r>
     </w:p>
     <w:p>
@@ -16070,7 +16206,7 @@
           <w:i w:val="0"/>
           <w:sz w:val="24"/>
         </w:rPr>
-        <w:t xml:space="preserve">RAGLIN, J. S. Psychological Factors in Sport Performance. </w:t>
+        <w:t xml:space="preserve">LUO, J. et al. The relationship between social support and mental health in athletes: a systematic review and meta-analysis. </w:t>
       </w:r>
       <w:r>
         <w:rPr>
@@ -16078,7 +16214,7 @@
           <w:b/>
           <w:sz w:val="24"/>
         </w:rPr>
-        <w:t>Sports Medicine</w:t>
+        <w:t>Frontiers in Psychology</w:t>
       </w:r>
       <w:r>
         <w:rPr>
@@ -16086,7 +16222,7 @@
           <w:i w:val="0"/>
           <w:sz w:val="24"/>
         </w:rPr>
-        <w:t>, v. 31, n. 12, p. 875-890, 2001. DOI: https://doi.org/10.2165/00007256-200131120-00004.</w:t>
+        <w:t>, v. 16, e1642886, 2025. DOI: https://doi.org/10.3389/fpsyg.2025.1642886.</w:t>
       </w:r>
     </w:p>
     <w:p>
@@ -16101,7 +16237,7 @@
           <w:i w:val="0"/>
           <w:sz w:val="24"/>
         </w:rPr>
-        <w:t xml:space="preserve">RATZ-SULYOK, F. Z. et al. Associations Between Endocrine Status and Stress, Mood and Psychosomatic Status in Elite Handball Players. </w:t>
+        <w:t xml:space="preserve">MACEDO, L. et al. Playing without goalkeeper: the use of an empty goal in high-performance men’s handball. </w:t>
       </w:r>
       <w:r>
         <w:rPr>
@@ -16109,7 +16245,7 @@
           <w:b/>
           <w:sz w:val="24"/>
         </w:rPr>
-        <w:t>Sports</w:t>
+        <w:t>International Journal of Performance Analysis in Sport</w:t>
       </w:r>
       <w:r>
         <w:rPr>
@@ -16117,7 +16253,7 @@
           <w:i w:val="0"/>
           <w:sz w:val="24"/>
         </w:rPr>
-        <w:t>, v. 14, n. 7, e289, 2026b. DOI: https://doi.org/10.3390/sports14070289.</w:t>
+        <w:t>, v. 25, n. 6, p. 1189-1207, 2025. DOI: https://doi.org/10.1080/24748668.2024.2354109.</w:t>
       </w:r>
     </w:p>
     <w:p>
@@ -16132,7 +16268,7 @@
           <w:i w:val="0"/>
           <w:sz w:val="24"/>
         </w:rPr>
-        <w:t xml:space="preserve">RATZ-SULYOK, F. Z. et al. Stress and sex hormone changes of young elite handball players in relation to their mood profiles. </w:t>
+        <w:t xml:space="preserve">MAJER, M. L. L. et al. Examining the use of experience sampling methods in sport psychology research: a scoping review. </w:t>
       </w:r>
       <w:r>
         <w:rPr>
@@ -16140,7 +16276,7 @@
           <w:b/>
           <w:sz w:val="24"/>
         </w:rPr>
-        <w:t>Anthropologiai Közlemények</w:t>
+        <w:t>Frontiers in Psychology</w:t>
       </w:r>
       <w:r>
         <w:rPr>
@@ -16148,7 +16284,7 @@
           <w:i w:val="0"/>
           <w:sz w:val="24"/>
         </w:rPr>
-        <w:t>, n. 67, supl., p. 108, 2026. Resumo. DOI: https://doi.org/10.20330/anthropkozl.2026.67s.108.</w:t>
+        <w:t>, v. 17, e1860704, 2026. DOI: https://doi.org/10.3389/fpsyg.2026.1860704.</w:t>
       </w:r>
     </w:p>
     <w:p>
@@ -16163,7 +16299,7 @@
           <w:i w:val="0"/>
           <w:sz w:val="24"/>
         </w:rPr>
-        <w:t xml:space="preserve">REARDON, C. L. et al. Mental health in elite athletes: International Olympic Committee consensus statement (2019). </w:t>
+        <w:t xml:space="preserve">MARTIN-LÓPEZ, J. et al. Influence of time-of-day on neuromuscular performance in team sport athletes: a systematic review and meta-analysis. </w:t>
       </w:r>
       <w:r>
         <w:rPr>
@@ -16171,7 +16307,7 @@
           <w:b/>
           <w:sz w:val="24"/>
         </w:rPr>
-        <w:t>British Journal of Sports Medicine</w:t>
+        <w:t>Frontiers in Sports and Active Living</w:t>
       </w:r>
       <w:r>
         <w:rPr>
@@ -16179,7 +16315,7 @@
           <w:i w:val="0"/>
           <w:sz w:val="24"/>
         </w:rPr>
-        <w:t>, v. 53, n. 11, p. 667-699, 2019. DOI: https://doi.org/10.1136/bjsports-2019-100715.</w:t>
+        <w:t>, v. 6, e1466050, 2025. DOI: https://doi.org/10.3389/fspor.2024.1466050.</w:t>
       </w:r>
     </w:p>
     <w:p>
@@ -16194,7 +16330,7 @@
           <w:i w:val="0"/>
           <w:sz w:val="24"/>
         </w:rPr>
-        <w:t xml:space="preserve">REIGAL, R. E. et al. Psychological Profile, Competitive Anxiety, Moods and Self-Efficacy in Beach Handball Players. </w:t>
+        <w:t xml:space="preserve">MCHUGH, M. L. Interrater reliability: the kappa statistic. </w:t>
       </w:r>
       <w:r>
         <w:rPr>
@@ -16202,7 +16338,7 @@
           <w:b/>
           <w:sz w:val="24"/>
         </w:rPr>
-        <w:t>International Journal of Environmental Research and Public Health</w:t>
+        <w:t>Biochemia Medica</w:t>
       </w:r>
       <w:r>
         <w:rPr>
@@ -16210,7 +16346,7 @@
           <w:i w:val="0"/>
           <w:sz w:val="24"/>
         </w:rPr>
-        <w:t>, v. 17, n. 1, e241, 2020. DOI: https://doi.org/10.3390/ijerph17010241.</w:t>
+        <w:t>, p. 276-282, 2012. DOI: https://doi.org/10.11613/bm.2012.031.</w:t>
       </w:r>
     </w:p>
     <w:p>
@@ -16225,7 +16361,7 @@
           <w:i w:val="0"/>
           <w:sz w:val="24"/>
         </w:rPr>
-        <w:t xml:space="preserve">ROBAZZA, C. et al. Perceived motivational climate influences athletes’ emotion regulation strategies, emotions, and psychobiosocial experiences. </w:t>
+        <w:t xml:space="preserve">MEIGNIÉ, A. et al. The Effects of Menstrual Cycle Phase on Elite Athlete Performance: A Critical and Systematic Review. </w:t>
       </w:r>
       <w:r>
         <w:rPr>
@@ -16233,7 +16369,7 @@
           <w:b/>
           <w:sz w:val="24"/>
         </w:rPr>
-        <w:t>Psychology of Sport and Exercise</w:t>
+        <w:t>Frontiers in Physiology</w:t>
       </w:r>
       <w:r>
         <w:rPr>
@@ -16241,7 +16377,7 @@
           <w:i w:val="0"/>
           <w:sz w:val="24"/>
         </w:rPr>
-        <w:t>, v. 59, e102110, 2022. DOI: https://doi.org/10.1016/j.psychsport.2021.102110.</w:t>
+        <w:t>, v. 12, e654585, 2021. DOI: https://doi.org/10.3389/fphys.2021.654585.</w:t>
       </w:r>
     </w:p>
     <w:p>
@@ -16256,7 +16392,7 @@
           <w:i w:val="0"/>
           <w:sz w:val="24"/>
         </w:rPr>
-        <w:t xml:space="preserve">ROCHA, P. G. M. D.; LOPES, J. L.; MORAES, S. M. F. D. Efeito da alteração ambiental sobre componentes psicológicos e parâmetros fisiológicos durante corrida em atletas. </w:t>
+        <w:t xml:space="preserve">MEYERS, S.; TAMIR, M. Emotion Regulation Versus Mood Regulation. </w:t>
       </w:r>
       <w:r>
         <w:rPr>
@@ -16264,7 +16400,7 @@
           <w:b/>
           <w:sz w:val="24"/>
         </w:rPr>
-        <w:t>Psicologia: Teoria e Pesquisa</w:t>
+        <w:t>Emotion Review</w:t>
       </w:r>
       <w:r>
         <w:rPr>
@@ -16272,7 +16408,7 @@
           <w:i w:val="0"/>
           <w:sz w:val="24"/>
         </w:rPr>
-        <w:t>, v. 26, n. 2, p. 381-386, 2010. DOI: https://doi.org/10.1590/S0102-37722010000200020.</w:t>
+        <w:t>, v. 16, n. 3, p. 151-161, 2024. DOI: https://doi.org/10.1177/17540739241259559.</w:t>
       </w:r>
     </w:p>
     <w:p>
@@ -16287,7 +16423,7 @@
           <w:i w:val="0"/>
           <w:sz w:val="24"/>
         </w:rPr>
-        <w:t xml:space="preserve">ROHLFS, I. C. P. D. M. et al. A Escala de Humor de Brunel (Brums): instrumento para detecção precoce da síndrome do excesso de treinamento. </w:t>
+        <w:t xml:space="preserve">MICHALSIK, L.; AAGAARD, P.; MADSEN, K. Locomotion Characteristics and Match-Induced Impairments in Physical Performance in Male Elite Team Handball Players. </w:t>
       </w:r>
       <w:r>
         <w:rPr>
@@ -16295,7 +16431,7 @@
           <w:b/>
           <w:sz w:val="24"/>
         </w:rPr>
-        <w:t>Revista Brasileira de Medicina do Esporte</w:t>
+        <w:t>International Journal of Sports Medicine</w:t>
       </w:r>
       <w:r>
         <w:rPr>
@@ -16303,7 +16439,7 @@
           <w:i w:val="0"/>
           <w:sz w:val="24"/>
         </w:rPr>
-        <w:t>, v. 14, n. 3, p. 176-181, 2008. DOI: https://doi.org/10.1590/S1517-86922008000300003.</w:t>
+        <w:t>, v. 34, n. 07, p. 590-599, 2012. DOI: https://doi.org/10.1055/s-0032-1329989.</w:t>
       </w:r>
     </w:p>
     <w:p>
@@ -16318,7 +16454,7 @@
           <w:i w:val="0"/>
           <w:sz w:val="24"/>
         </w:rPr>
-        <w:t xml:space="preserve">SAAL, C. et al. How different defensive formations affect physical match demands in the German Handball-Bundesliga: a comparison of the attacking and defending team. </w:t>
+        <w:t xml:space="preserve">MIRALLES-AMORÓS, L. et al. Study of Different Personalised Dietary Plans on Eating Behaviour, Body Image and Mood in Young Female Professional Handball Players: A Randomised Controlled Trial. </w:t>
       </w:r>
       <w:r>
         <w:rPr>
@@ -16326,7 +16462,7 @@
           <w:b/>
           <w:sz w:val="24"/>
         </w:rPr>
-        <w:t>Frontiers in Sports and Active Living</w:t>
+        <w:t>Children</w:t>
       </w:r>
       <w:r>
         <w:rPr>
@@ -16334,7 +16470,7 @@
           <w:i w:val="0"/>
           <w:sz w:val="24"/>
         </w:rPr>
-        <w:t>, v. 8, e1811523, 2026. DOI: https://doi.org/10.3389/fspor.2026.1811523.</w:t>
+        <w:t>, v. 10, n. 2, e259, 2023. DOI: https://doi.org/10.3390/children10020259.</w:t>
       </w:r>
     </w:p>
     <w:p>
@@ -16349,7 +16485,7 @@
           <w:i w:val="0"/>
           <w:sz w:val="24"/>
         </w:rPr>
-        <w:t xml:space="preserve">SAHLI, F. et al. Enhancing Skills, Mood, and Performance in Overweight Handball Players: Exploring Individual vs. Collective Verbal Encouragement Strategies. </w:t>
+        <w:t xml:space="preserve">MON-LÓPEZ, D. et al. The Impact of Covid-19 and the Effect of Psychological Factors on Training Conditions of Handball Players. </w:t>
       </w:r>
       <w:r>
         <w:rPr>
@@ -16357,7 +16493,7 @@
           <w:b/>
           <w:sz w:val="24"/>
         </w:rPr>
-        <w:t>Children</w:t>
+        <w:t>International Journal of Environmental Research and Public Health</w:t>
       </w:r>
       <w:r>
         <w:rPr>
@@ -16365,7 +16501,7 @@
           <w:i w:val="0"/>
           <w:sz w:val="24"/>
         </w:rPr>
-        <w:t>, v. 11, n. 4, e432, 2024. DOI: https://doi.org/10.3390/children11040432.</w:t>
+        <w:t>, v. 17, n. 18, e6471, 2020. DOI: https://doi.org/10.3390/ijerph17186471.</w:t>
       </w:r>
     </w:p>
     <w:p>
@@ -16380,7 +16516,7 @@
           <w:i w:val="0"/>
           <w:sz w:val="24"/>
         </w:rPr>
-        <w:t xml:space="preserve">SAHLI, F. et al. The Effects of Combined Verbal Encouragement and Technical Instruction on Technical Skills and Psychophysiological Responses During Small-Sided Handball Games Exercise in Physical Education. </w:t>
+        <w:t xml:space="preserve">MONTES, F. A.; GOMES, S. C. Correlação entre resistência anaeróbia e estados de humor ao longo de uma temporada na modalidade handebol. </w:t>
       </w:r>
       <w:r>
         <w:rPr>
@@ -16388,7 +16524,7 @@
           <w:b/>
           <w:sz w:val="24"/>
         </w:rPr>
-        <w:t>Frontiers in Psychology</w:t>
+        <w:t>UNOPAR Científica Ciências Biológicas e da Saúde</w:t>
       </w:r>
       <w:r>
         <w:rPr>
@@ -16396,7 +16532,7 @@
           <w:i w:val="0"/>
           <w:sz w:val="24"/>
         </w:rPr>
-        <w:t>, v. 13, e902088, 2022. DOI: https://doi.org/10.3389/fpsyg.2022.902088.</w:t>
+        <w:t>, v. 16, n. 2, p. 83-86, 2014.</w:t>
       </w:r>
     </w:p>
     <w:p>
@@ -16411,7 +16547,7 @@
           <w:i w:val="0"/>
           <w:sz w:val="24"/>
         </w:rPr>
-        <w:t xml:space="preserve">SAVITZKY, A.; GOLAY, M. J. E. Smoothing and Differentiation of Data by Simplified Least Squares Procedures. </w:t>
+        <w:t xml:space="preserve">MORENAS-AGUILAR, M. et al. The menstrual cycle does not influence vertical jump performance or throwing velocity in amateur team handball players. </w:t>
       </w:r>
       <w:r>
         <w:rPr>
@@ -16419,7 +16555,7 @@
           <w:b/>
           <w:sz w:val="24"/>
         </w:rPr>
-        <w:t>Analytical Chemistry</w:t>
+        <w:t>Science &amp; Sports</w:t>
       </w:r>
       <w:r>
         <w:rPr>
@@ -16427,7 +16563,7 @@
           <w:i w:val="0"/>
           <w:sz w:val="24"/>
         </w:rPr>
-        <w:t>, v. 36, n. 8, p. 1627-1639, 1964. DOI: https://doi.org/10.1021/ac60214a047.</w:t>
+        <w:t>, v. 38, n. 2, p. 211-215, 2023. DOI: https://doi.org/10.1016/j.scispo.2022.02.008.</w:t>
       </w:r>
     </w:p>
     <w:p>
@@ -16442,7 +16578,7 @@
           <w:i w:val="0"/>
           <w:sz w:val="24"/>
         </w:rPr>
-        <w:t xml:space="preserve">SAW, A. E.; MAIN, L. C.; GASTIN, P. B. Monitoring the athlete training response: subjective self-reported measures trump commonly used objective measures: a systematic review. </w:t>
+        <w:t xml:space="preserve">MORGAN, W. P. et al. Psychological monitoring of overtraining and staleness. </w:t>
       </w:r>
       <w:r>
         <w:rPr>
@@ -16458,7 +16594,7 @@
           <w:i w:val="0"/>
           <w:sz w:val="24"/>
         </w:rPr>
-        <w:t>, v. 50, n. 5, p. 281-291, 2016. DOI: https://doi.org/10.1136/bjsports-2015-094758.</w:t>
+        <w:t>, v. 21, n. 3, p. 107-114, 1987. DOI: https://doi.org/10.1136/bjsm.21.3.107.</w:t>
       </w:r>
     </w:p>
     <w:p>
@@ -16473,7 +16609,7 @@
           <w:i w:val="0"/>
           <w:sz w:val="24"/>
         </w:rPr>
-        <w:t xml:space="preserve">SCHIAVINI, C.; ARENA, R. Influence of the semi-final stage on mood in female handball athletes at Unisinos Championship 2008. </w:t>
+        <w:t xml:space="preserve">MOUNTJOY, M. et al. 2023 International Olympic Committee’s (IOC) consensus statement on Relative Energy Deficiency in Sport (REDs). </w:t>
       </w:r>
       <w:r>
         <w:rPr>
@@ -16481,7 +16617,7 @@
           <w:b/>
           <w:sz w:val="24"/>
         </w:rPr>
-        <w:t>FIEP Bulletin</w:t>
+        <w:t>British Journal of Sports Medicine</w:t>
       </w:r>
       <w:r>
         <w:rPr>
@@ -16489,7 +16625,7 @@
           <w:i w:val="0"/>
           <w:sz w:val="24"/>
         </w:rPr>
-        <w:t>, v. 80, edição especial, p. 625-628, 2010.</w:t>
+        <w:t>, v. 57, n. 17, p. 1073-1098, 2023. DOI: https://doi.org/10.1136/bjsports-2023-106994.</w:t>
       </w:r>
     </w:p>
     <w:p>
@@ -16504,7 +16640,7 @@
           <w:i w:val="0"/>
           <w:sz w:val="24"/>
         </w:rPr>
-        <w:t xml:space="preserve">SOTO, D.; GARCÍA-HERRERO, J. A.; CARCEDO, R. J. Well-Being and Throwing Speed of Women Handball Players Affected by Feedback. </w:t>
+        <w:t xml:space="preserve">MUNN, Z. et al. Systematic review or scoping review? Guidance for authors when choosing between a systematic or scoping review approach. </w:t>
       </w:r>
       <w:r>
         <w:rPr>
@@ -16512,7 +16648,7 @@
           <w:b/>
           <w:sz w:val="24"/>
         </w:rPr>
-        <w:t>International Journal of Environmental Research and Public Health</w:t>
+        <w:t>BMC Medical Research Methodology</w:t>
       </w:r>
       <w:r>
         <w:rPr>
@@ -16520,7 +16656,7 @@
           <w:i w:val="0"/>
           <w:sz w:val="24"/>
         </w:rPr>
-        <w:t>, v. 17, n. 17, e6064, 2020. DOI: https://doi.org/10.3390/ijerph17176064.</w:t>
+        <w:t>, v. 18, n. 1, e143, 2018a. DOI: https://doi.org/10.1186/s12874-018-0611-x.</w:t>
       </w:r>
     </w:p>
     <w:p>
@@ -16535,7 +16671,7 @@
           <w:i w:val="0"/>
           <w:sz w:val="24"/>
         </w:rPr>
-        <w:t xml:space="preserve">TAMMINEN, K. A. et al. A daily diary study of interpersonal emotion regulation, the social environment, and team performance among university athletes. </w:t>
+        <w:t xml:space="preserve">MUNN, Z. et al. What kind of systematic review should I conduct? A proposed typology and guidance for systematic reviewers in the medical and health sciences. </w:t>
       </w:r>
       <w:r>
         <w:rPr>
@@ -16543,7 +16679,7 @@
           <w:b/>
           <w:sz w:val="24"/>
         </w:rPr>
-        <w:t>Psychology of Sport and Exercise</w:t>
+        <w:t>BMC Medical Research Methodology</w:t>
       </w:r>
       <w:r>
         <w:rPr>
@@ -16551,7 +16687,7 @@
           <w:i w:val="0"/>
           <w:sz w:val="24"/>
         </w:rPr>
-        <w:t>, v. 45, e101566, 2019. DOI: https://doi.org/10.1016/j.psychsport.2019.101566.</w:t>
+        <w:t>, v. 18, n. 1, e5, 2018b. DOI: https://doi.org/10.1186/s12874-017-0468-4.</w:t>
       </w:r>
     </w:p>
     <w:p>
@@ -16566,7 +16702,23 @@
           <w:i w:val="0"/>
           <w:sz w:val="24"/>
         </w:rPr>
-        <w:t xml:space="preserve">TERRY, P. C. et al. Validation of a Lithuanian-Language Version of the Brunel Mood Scale: The BRUMS-LTU. </w:t>
+        <w:t xml:space="preserve">NUGRAHA, E.; WIBOWO, R.; FIRMANSYAH, H. Mood states and game performance in invasion game activities: a correlation study among elementary school students. </w:t>
+      </w:r>
+      <w:r>
+        <w:rPr>
+          <w:rFonts w:ascii="Times New Roman" w:hAnsi="Times New Roman"/>
+          <w:i/>
+          <w:sz w:val="24"/>
+        </w:rPr>
+        <w:t>In</w:t>
+      </w:r>
+      <w:r>
+        <w:rPr>
+          <w:rFonts w:ascii="Times New Roman" w:hAnsi="Times New Roman"/>
+          <w:i w:val="0"/>
+          <w:sz w:val="24"/>
+        </w:rPr>
+        <w:t xml:space="preserve">: INTERNATIONAL CONFERENCE ON SPORT SCIENCE, HEALTH, AND PHYSICAL EDUCATION, 4., 2019, Bandung. </w:t>
       </w:r>
       <w:r>
         <w:rPr>
@@ -16574,7 +16726,7 @@
           <w:b/>
           <w:sz w:val="24"/>
         </w:rPr>
-        <w:t>International Journal of Environmental Research and Public Health</w:t>
+        <w:t>Proceedings</w:t>
       </w:r>
       <w:r>
         <w:rPr>
@@ -16582,7 +16734,7 @@
           <w:i w:val="0"/>
           <w:sz w:val="24"/>
         </w:rPr>
-        <w:t>, v. 19, n. 8, e4867, 2022. DOI: https://doi.org/10.3390/ijerph19084867.</w:t>
+        <w:t xml:space="preserve"> [...]. Paris: Atlantis Press, 2020. p. 95-98. DOI: https://doi.org/10.2991/ahsr.k.200214.027.</w:t>
       </w:r>
     </w:p>
     <w:p>
@@ -16597,7 +16749,7 @@
           <w:i w:val="0"/>
           <w:sz w:val="24"/>
         </w:rPr>
-        <w:t xml:space="preserve">TERRY, P. C.; LANE, A. M. Normative values for the profile of mood states for use with athletic samples. </w:t>
+        <w:t xml:space="preserve">OBREGÓN SIBÓN, I. et al. Cambios postest en el umbral mecánico nociceptivo de la musculatura del hombro y en el estado de ánimo en jugadores de balonmano. </w:t>
       </w:r>
       <w:r>
         <w:rPr>
@@ -16605,7 +16757,7 @@
           <w:b/>
           <w:sz w:val="24"/>
         </w:rPr>
-        <w:t>Journal of Applied Sport Psychology</w:t>
+        <w:t>Cuestiones de Fisioterapia</w:t>
       </w:r>
       <w:r>
         <w:rPr>
@@ -16613,7 +16765,7 @@
           <w:i w:val="0"/>
           <w:sz w:val="24"/>
         </w:rPr>
-        <w:t>, v. 12, n. 1, p. 93-109, 2000. DOI: https://doi.org/10.1080/10413200008404215.</w:t>
+        <w:t>, v. 46, n. 3, p. 183-191, 2017. Disponível em: https://dialnet.unirioja.es/servlet/articulo?codigo=6263341. Acesso em: 21 out. 2026.</w:t>
       </w:r>
     </w:p>
     <w:p>
@@ -16628,7 +16780,7 @@
           <w:i w:val="0"/>
           <w:sz w:val="24"/>
         </w:rPr>
-        <w:t xml:space="preserve">TERRY, P. C.; PARSONS-SMITH, R. L. Mood Profiling for Sustainable Mental Health among Athletes. </w:t>
+        <w:t xml:space="preserve">OUZZANI, M. et al. Rayyan—a web and mobile app for systematic reviews. </w:t>
       </w:r>
       <w:r>
         <w:rPr>
@@ -16636,7 +16788,7 @@
           <w:b/>
           <w:sz w:val="24"/>
         </w:rPr>
-        <w:t>Sustainability</w:t>
+        <w:t>Systematic Reviews</w:t>
       </w:r>
       <w:r>
         <w:rPr>
@@ -16644,7 +16796,7 @@
           <w:i w:val="0"/>
           <w:sz w:val="24"/>
         </w:rPr>
-        <w:t>, v. 13, n. 11, e6116, 2021. DOI: https://doi.org/10.3390/su13116116.</w:t>
+        <w:t>, v. 5, n. 1, e210, 2016. DOI: https://doi.org/10.1186/s13643-016-0384-4.</w:t>
       </w:r>
     </w:p>
     <w:p>
@@ -16659,7 +16811,7 @@
           <w:i w:val="0"/>
           <w:sz w:val="24"/>
         </w:rPr>
-        <w:t xml:space="preserve">TERRY, P.; LANE, A.; FOGARTY, G. Construct validity of the Profile of Mood States — Adolescents for use with adults. </w:t>
+        <w:t xml:space="preserve">PACEWICZ, C. E.; SMITH, A. L.; FRANK, K. Teammate communication, loneliness, and contagion of athlete burnout. </w:t>
       </w:r>
       <w:r>
         <w:rPr>
@@ -16675,7 +16827,7 @@
           <w:i w:val="0"/>
           <w:sz w:val="24"/>
         </w:rPr>
-        <w:t>, v. 4, n. 2, p. 125-139, 2003. DOI: https://doi.org/10.1016/S1469-0292(01)00035-8.</w:t>
+        <w:t>, v. 78, e102807, 2025. DOI: https://doi.org/10.1016/j.psychsport.2025.102807.</w:t>
       </w:r>
     </w:p>
     <w:p>
@@ -16690,7 +16842,7 @@
           <w:i w:val="0"/>
           <w:sz w:val="24"/>
         </w:rPr>
-        <w:t xml:space="preserve">TREJO-SILVA, A. et al. Attacking performance analysis during 2-minute suspensions in female handball games at the Rio 2016 Olympic Games. </w:t>
+        <w:t xml:space="preserve">PADILHAS, O. P. et al. Inter season physiological control of the brazilian beach handball team. </w:t>
       </w:r>
       <w:r>
         <w:rPr>
@@ -16698,7 +16850,7 @@
           <w:b/>
           <w:sz w:val="24"/>
         </w:rPr>
-        <w:t>Kinesiology</w:t>
+        <w:t>Revista Brasileira de Medicina do Esporte</w:t>
       </w:r>
       <w:r>
         <w:rPr>
@@ -16706,7 +16858,7 @@
           <w:i w:val="0"/>
           <w:sz w:val="24"/>
         </w:rPr>
-        <w:t>, v. 57, n. 1, p. 3-14, 2025. DOI: https://doi.org/10.26582/k.57.1.1.</w:t>
+        <w:t>, v. 24, n. 6, p. 436-439, 2018. DOI: https://doi.org/10.1590/1517-869220182406153471.</w:t>
       </w:r>
     </w:p>
     <w:p>
@@ -16721,7 +16873,7 @@
           <w:i w:val="0"/>
           <w:sz w:val="24"/>
         </w:rPr>
-        <w:t xml:space="preserve">TRUONG, C.; OUDRE, L.; VAYATIS, N. Selective review of offline change point detection methods. </w:t>
+        <w:t xml:space="preserve">PAGE, M. J. et al. The PRISMA 2020 statement: an updated guideline for reporting systematic reviews. </w:t>
       </w:r>
       <w:r>
         <w:rPr>
@@ -16729,7 +16881,7 @@
           <w:b/>
           <w:sz w:val="24"/>
         </w:rPr>
-        <w:t>Signal Processing</w:t>
+        <w:t>BMJ</w:t>
       </w:r>
       <w:r>
         <w:rPr>
@@ -16737,7 +16889,7 @@
           <w:i w:val="0"/>
           <w:sz w:val="24"/>
         </w:rPr>
-        <w:t>, v. 167, e107299, 2020. DOI: https://doi.org/10.1016/j.sigpro.2019.107299.</w:t>
+        <w:t>, n71, 2021. DOI: https://doi.org/10.1136/bmj.n71.</w:t>
       </w:r>
     </w:p>
     <w:p>
@@ -16752,7 +16904,7 @@
           <w:i w:val="0"/>
           <w:sz w:val="24"/>
         </w:rPr>
-        <w:t xml:space="preserve">WAGNER, H.; RADIC, V.; HINZ, M. Differences in game-based performance by playing position in young elite male team handball players. </w:t>
+        <w:t xml:space="preserve">PALUDO, A. C. et al. The Effect of Menstrual Cycle on Perceptual Responses in Athletes: A Systematic Review With Meta-Analysis. </w:t>
       </w:r>
       <w:r>
         <w:rPr>
@@ -16760,7 +16912,7 @@
           <w:b/>
           <w:sz w:val="24"/>
         </w:rPr>
-        <w:t>Frontiers in Sports and Active Living</w:t>
+        <w:t>Frontiers in Psychology</w:t>
       </w:r>
       <w:r>
         <w:rPr>
@@ -16768,7 +16920,7 @@
           <w:i w:val="0"/>
           <w:sz w:val="24"/>
         </w:rPr>
-        <w:t>, v. 7, e1688078, 2025. DOI: https://doi.org/10.3389/fspor.2025.1688078.</w:t>
+        <w:t>, v. 13, e926854, 2022. DOI: https://doi.org/10.3389/fpsyg.2022.926854.</w:t>
       </w:r>
     </w:p>
     <w:p>
@@ -16783,7 +16935,7 @@
           <w:i w:val="0"/>
           <w:sz w:val="24"/>
         </w:rPr>
-        <w:t xml:space="preserve">WATSON, D.; CLARK, L. A.; TELLEGEN, A. Development and validation of brief measures of positive and negative affect: The PANAS scales. </w:t>
+        <w:t xml:space="preserve">PARSONS-SMITH, R. L.; TERRY, P. C.; MACHIN, M. A. Identification and Description of Novel Mood Profile Clusters. </w:t>
       </w:r>
       <w:r>
         <w:rPr>
@@ -16791,7 +16943,7 @@
           <w:b/>
           <w:sz w:val="24"/>
         </w:rPr>
-        <w:t>Journal of Personality and Social Psychology</w:t>
+        <w:t>Frontiers in Psychology</w:t>
       </w:r>
       <w:r>
         <w:rPr>
@@ -16799,7 +16951,1340 @@
           <w:i w:val="0"/>
           <w:sz w:val="24"/>
         </w:rPr>
+        <w:t>, v. 8, e1958, 2017. DOI: https://doi.org/10.3389/fpsyg.2017.01958.</w:t>
+      </w:r>
+    </w:p>
+    <w:p>
+      <w:pPr>
+        <w:spacing w:before="0" w:after="120" w:line="240" w:lineRule="auto"/>
+        <w:ind w:left="0" w:firstLine="0"/>
+        <w:jc w:val="left"/>
+      </w:pPr>
+      <w:r>
+        <w:rPr>
+          <w:rFonts w:ascii="Times New Roman" w:hAnsi="Times New Roman"/>
+          <w:i w:val="0"/>
+          <w:sz w:val="24"/>
+        </w:rPr>
+        <w:t xml:space="preserve">PEREIRA, R. et al. Avaliação do Estado Fisiológico de Escolares Atletas. </w:t>
+      </w:r>
+      <w:r>
+        <w:rPr>
+          <w:rFonts w:ascii="Times New Roman" w:hAnsi="Times New Roman"/>
+          <w:b/>
+          <w:sz w:val="24"/>
+        </w:rPr>
+        <w:t>Revista Brasileira de Ciências da Saúde</w:t>
+      </w:r>
+      <w:r>
+        <w:rPr>
+          <w:rFonts w:ascii="Times New Roman" w:hAnsi="Times New Roman"/>
+          <w:i w:val="0"/>
+          <w:sz w:val="24"/>
+        </w:rPr>
+        <w:t>, v. 18, n. S4, p. 75-82, 2014. DOI: https://doi.org/10.4034/RBCS.2014.18.S4.10.</w:t>
+      </w:r>
+    </w:p>
+    <w:p>
+      <w:pPr>
+        <w:spacing w:before="0" w:after="120" w:line="240" w:lineRule="auto"/>
+        <w:ind w:left="0" w:firstLine="0"/>
+        <w:jc w:val="left"/>
+      </w:pPr>
+      <w:r>
+        <w:rPr>
+          <w:rFonts w:ascii="Times New Roman" w:hAnsi="Times New Roman"/>
+          <w:i w:val="0"/>
+          <w:sz w:val="24"/>
+        </w:rPr>
+        <w:t xml:space="preserve">PETERS, M. D. et al. Updated methodological guidance for the conduct of scoping reviews. </w:t>
+      </w:r>
+      <w:r>
+        <w:rPr>
+          <w:rFonts w:ascii="Times New Roman" w:hAnsi="Times New Roman"/>
+          <w:b/>
+          <w:sz w:val="24"/>
+        </w:rPr>
+        <w:t>JBI Evidence Synthesis</w:t>
+      </w:r>
+      <w:r>
+        <w:rPr>
+          <w:rFonts w:ascii="Times New Roman" w:hAnsi="Times New Roman"/>
+          <w:i w:val="0"/>
+          <w:sz w:val="24"/>
+        </w:rPr>
+        <w:t>, v. 18, n. 10, p. 2119-2126, 2020. DOI: https://doi.org/10.11124/jbies-20-00167.</w:t>
+      </w:r>
+    </w:p>
+    <w:p>
+      <w:pPr>
+        <w:spacing w:before="0" w:after="120" w:line="240" w:lineRule="auto"/>
+        <w:ind w:left="0" w:firstLine="0"/>
+        <w:jc w:val="left"/>
+      </w:pPr>
+      <w:r>
+        <w:rPr>
+          <w:rFonts w:ascii="Times New Roman" w:hAnsi="Times New Roman"/>
+          <w:i w:val="0"/>
+          <w:sz w:val="24"/>
+        </w:rPr>
+        <w:t xml:space="preserve">PÓVOAS, S. C. et al. Physical and Physiological Demands of Elite Team Handball. </w:t>
+      </w:r>
+      <w:r>
+        <w:rPr>
+          <w:rFonts w:ascii="Times New Roman" w:hAnsi="Times New Roman"/>
+          <w:b/>
+          <w:sz w:val="24"/>
+        </w:rPr>
+        <w:t>Journal of Strength and Conditioning Research</w:t>
+      </w:r>
+      <w:r>
+        <w:rPr>
+          <w:rFonts w:ascii="Times New Roman" w:hAnsi="Times New Roman"/>
+          <w:i w:val="0"/>
+          <w:sz w:val="24"/>
+        </w:rPr>
+        <w:t>, v. 26, n. 12, p. 3365-3375, 2012. DOI: https://doi.org/10.1519/jsc.0b013e318248aeee.</w:t>
+      </w:r>
+    </w:p>
+    <w:p>
+      <w:pPr>
+        <w:spacing w:before="0" w:after="120" w:line="240" w:lineRule="auto"/>
+        <w:ind w:left="0" w:firstLine="0"/>
+        <w:jc w:val="left"/>
+      </w:pPr>
+      <w:r>
+        <w:rPr>
+          <w:rFonts w:ascii="Times New Roman" w:hAnsi="Times New Roman"/>
+          <w:i w:val="0"/>
+          <w:sz w:val="24"/>
+        </w:rPr>
+        <w:t xml:space="preserve">PRUDENTE, J. N. et al. Evolution of attack in handball when playing 7 vs. 6 with empty goal between 2020 and 2023: coaches’ perception vs. observational results. </w:t>
+      </w:r>
+      <w:r>
+        <w:rPr>
+          <w:rFonts w:ascii="Times New Roman" w:hAnsi="Times New Roman"/>
+          <w:b/>
+          <w:sz w:val="24"/>
+        </w:rPr>
+        <w:t>Frontiers in Sports and Active Living</w:t>
+      </w:r>
+      <w:r>
+        <w:rPr>
+          <w:rFonts w:ascii="Times New Roman" w:hAnsi="Times New Roman"/>
+          <w:i w:val="0"/>
+          <w:sz w:val="24"/>
+        </w:rPr>
+        <w:t>, v. 6, e1354623, 2024. DOI: https://doi.org/10.3389/fspor.2024.1354623.</w:t>
+      </w:r>
+    </w:p>
+    <w:p>
+      <w:pPr>
+        <w:spacing w:before="0" w:after="120" w:line="240" w:lineRule="auto"/>
+        <w:ind w:left="0" w:firstLine="0"/>
+        <w:jc w:val="left"/>
+      </w:pPr>
+      <w:r>
+        <w:rPr>
+          <w:rFonts w:ascii="Times New Roman" w:hAnsi="Times New Roman"/>
+          <w:i w:val="0"/>
+          <w:sz w:val="24"/>
+        </w:rPr>
+        <w:t xml:space="preserve">RAAB, M.; JOHNSON, J. G. Expertise-based differences in search and option-generation strategies. </w:t>
+      </w:r>
+      <w:r>
+        <w:rPr>
+          <w:rFonts w:ascii="Times New Roman" w:hAnsi="Times New Roman"/>
+          <w:b/>
+          <w:sz w:val="24"/>
+        </w:rPr>
+        <w:t>Journal of Experimental Psychology: Applied</w:t>
+      </w:r>
+      <w:r>
+        <w:rPr>
+          <w:rFonts w:ascii="Times New Roman" w:hAnsi="Times New Roman"/>
+          <w:i w:val="0"/>
+          <w:sz w:val="24"/>
+        </w:rPr>
+        <w:t>, v. 13, n. 3, p. 158-170, 2007. DOI: https://doi.org/10.1037/1076-898x.13.3.158.</w:t>
+      </w:r>
+    </w:p>
+    <w:p>
+      <w:pPr>
+        <w:spacing w:before="0" w:after="120" w:line="240" w:lineRule="auto"/>
+        <w:ind w:left="0" w:firstLine="0"/>
+        <w:jc w:val="left"/>
+      </w:pPr>
+      <w:r>
+        <w:rPr>
+          <w:rFonts w:ascii="Times New Roman" w:hAnsi="Times New Roman"/>
+          <w:i w:val="0"/>
+          <w:sz w:val="24"/>
+        </w:rPr>
+        <w:t xml:space="preserve">RAGLIN, J. S. Psychological Factors in Sport Performance. </w:t>
+      </w:r>
+      <w:r>
+        <w:rPr>
+          <w:rFonts w:ascii="Times New Roman" w:hAnsi="Times New Roman"/>
+          <w:b/>
+          <w:sz w:val="24"/>
+        </w:rPr>
+        <w:t>Sports Medicine</w:t>
+      </w:r>
+      <w:r>
+        <w:rPr>
+          <w:rFonts w:ascii="Times New Roman" w:hAnsi="Times New Roman"/>
+          <w:i w:val="0"/>
+          <w:sz w:val="24"/>
+        </w:rPr>
+        <w:t>, v. 31, n. 12, p. 875-890, 2001. DOI: https://doi.org/10.2165/00007256-200131120-00004.</w:t>
+      </w:r>
+    </w:p>
+    <w:p>
+      <w:pPr>
+        <w:spacing w:before="0" w:after="120" w:line="240" w:lineRule="auto"/>
+        <w:ind w:left="0" w:firstLine="0"/>
+        <w:jc w:val="left"/>
+      </w:pPr>
+      <w:r>
+        <w:rPr>
+          <w:rFonts w:ascii="Times New Roman" w:hAnsi="Times New Roman"/>
+          <w:i w:val="0"/>
+          <w:sz w:val="24"/>
+        </w:rPr>
+        <w:t xml:space="preserve">RATZ-SULYOK, F. Z. et al. Associations Between Endocrine Status and Stress, Mood and Psychosomatic Status in Elite Handball Players. </w:t>
+      </w:r>
+      <w:r>
+        <w:rPr>
+          <w:rFonts w:ascii="Times New Roman" w:hAnsi="Times New Roman"/>
+          <w:b/>
+          <w:sz w:val="24"/>
+        </w:rPr>
+        <w:t>Sports</w:t>
+      </w:r>
+      <w:r>
+        <w:rPr>
+          <w:rFonts w:ascii="Times New Roman" w:hAnsi="Times New Roman"/>
+          <w:i w:val="0"/>
+          <w:sz w:val="24"/>
+        </w:rPr>
+        <w:t>, v. 14, n. 7, e289, 2026b. DOI: https://doi.org/10.3390/sports14070289.</w:t>
+      </w:r>
+    </w:p>
+    <w:p>
+      <w:pPr>
+        <w:spacing w:before="0" w:after="120" w:line="240" w:lineRule="auto"/>
+        <w:ind w:left="0" w:firstLine="0"/>
+        <w:jc w:val="left"/>
+      </w:pPr>
+      <w:r>
+        <w:rPr>
+          <w:rFonts w:ascii="Times New Roman" w:hAnsi="Times New Roman"/>
+          <w:i w:val="0"/>
+          <w:sz w:val="24"/>
+        </w:rPr>
+        <w:t xml:space="preserve">RATZ-SULYOK, F. Z. et al. Stress and sex hormone changes of young elite handball players in relation to their mood profiles. </w:t>
+      </w:r>
+      <w:r>
+        <w:rPr>
+          <w:rFonts w:ascii="Times New Roman" w:hAnsi="Times New Roman"/>
+          <w:b/>
+          <w:sz w:val="24"/>
+        </w:rPr>
+        <w:t>Anthropologiai Közlemények</w:t>
+      </w:r>
+      <w:r>
+        <w:rPr>
+          <w:rFonts w:ascii="Times New Roman" w:hAnsi="Times New Roman"/>
+          <w:i w:val="0"/>
+          <w:sz w:val="24"/>
+        </w:rPr>
+        <w:t>, n. 67, supl., p. 108, 2026. Resumo. DOI: https://doi.org/10.20330/anthropkozl.2026.67s.108.</w:t>
+      </w:r>
+    </w:p>
+    <w:p>
+      <w:pPr>
+        <w:spacing w:before="0" w:after="120" w:line="240" w:lineRule="auto"/>
+        <w:ind w:left="0" w:firstLine="0"/>
+        <w:jc w:val="left"/>
+      </w:pPr>
+      <w:r>
+        <w:rPr>
+          <w:rFonts w:ascii="Times New Roman" w:hAnsi="Times New Roman"/>
+          <w:i w:val="0"/>
+          <w:sz w:val="24"/>
+        </w:rPr>
+        <w:t xml:space="preserve">REARDON, C. L. et al. Mental health in elite athletes: International Olympic Committee consensus statement (2019). </w:t>
+      </w:r>
+      <w:r>
+        <w:rPr>
+          <w:rFonts w:ascii="Times New Roman" w:hAnsi="Times New Roman"/>
+          <w:b/>
+          <w:sz w:val="24"/>
+        </w:rPr>
+        <w:t>British Journal of Sports Medicine</w:t>
+      </w:r>
+      <w:r>
+        <w:rPr>
+          <w:rFonts w:ascii="Times New Roman" w:hAnsi="Times New Roman"/>
+          <w:i w:val="0"/>
+          <w:sz w:val="24"/>
+        </w:rPr>
+        <w:t>, v. 53, n. 11, p. 667-699, 2019. DOI: https://doi.org/10.1136/bjsports-2019-100715.</w:t>
+      </w:r>
+    </w:p>
+    <w:p>
+      <w:pPr>
+        <w:spacing w:before="0" w:after="120" w:line="240" w:lineRule="auto"/>
+        <w:ind w:left="0" w:firstLine="0"/>
+        <w:jc w:val="left"/>
+      </w:pPr>
+      <w:r>
+        <w:rPr>
+          <w:rFonts w:ascii="Times New Roman" w:hAnsi="Times New Roman"/>
+          <w:i w:val="0"/>
+          <w:sz w:val="24"/>
+        </w:rPr>
+        <w:t xml:space="preserve">REARDON, C. L. et al. Mental health in elite athletes: International Olympic Committee consensus statement (2026). </w:t>
+      </w:r>
+      <w:r>
+        <w:rPr>
+          <w:rFonts w:ascii="Times New Roman" w:hAnsi="Times New Roman"/>
+          <w:b/>
+          <w:sz w:val="24"/>
+        </w:rPr>
+        <w:t>British Journal of Sports Medicine</w:t>
+      </w:r>
+      <w:r>
+        <w:rPr>
+          <w:rFonts w:ascii="Times New Roman" w:hAnsi="Times New Roman"/>
+          <w:i w:val="0"/>
+          <w:sz w:val="24"/>
+        </w:rPr>
+        <w:t>, v. 60, n. 15, p. 1083-1130, 2026. DOI: https://doi.org/10.1136/bjsports-2025-111514.</w:t>
+      </w:r>
+    </w:p>
+    <w:p>
+      <w:pPr>
+        <w:spacing w:before="0" w:after="120" w:line="240" w:lineRule="auto"/>
+        <w:ind w:left="0" w:firstLine="0"/>
+        <w:jc w:val="left"/>
+      </w:pPr>
+      <w:r>
+        <w:rPr>
+          <w:rFonts w:ascii="Times New Roman" w:hAnsi="Times New Roman"/>
+          <w:i w:val="0"/>
+          <w:sz w:val="24"/>
+        </w:rPr>
+        <w:t xml:space="preserve">REIGAL, R. E. et al. Psychological Profile, Competitive Anxiety, Moods and Self-Efficacy in Beach Handball Players. </w:t>
+      </w:r>
+      <w:r>
+        <w:rPr>
+          <w:rFonts w:ascii="Times New Roman" w:hAnsi="Times New Roman"/>
+          <w:b/>
+          <w:sz w:val="24"/>
+        </w:rPr>
+        <w:t>International Journal of Environmental Research and Public Health</w:t>
+      </w:r>
+      <w:r>
+        <w:rPr>
+          <w:rFonts w:ascii="Times New Roman" w:hAnsi="Times New Roman"/>
+          <w:i w:val="0"/>
+          <w:sz w:val="24"/>
+        </w:rPr>
+        <w:t>, v. 17, n. 1, e241, 2020. DOI: https://doi.org/10.3390/ijerph17010241.</w:t>
+      </w:r>
+    </w:p>
+    <w:p>
+      <w:pPr>
+        <w:spacing w:before="0" w:after="120" w:line="240" w:lineRule="auto"/>
+        <w:ind w:left="0" w:firstLine="0"/>
+        <w:jc w:val="left"/>
+      </w:pPr>
+      <w:r>
+        <w:rPr>
+          <w:rFonts w:ascii="Times New Roman" w:hAnsi="Times New Roman"/>
+          <w:i w:val="0"/>
+          <w:sz w:val="24"/>
+        </w:rPr>
+        <w:t xml:space="preserve">ROBAZZA, C. et al. Perceived motivational climate influences athletes’ emotion regulation strategies, emotions, and psychobiosocial experiences. </w:t>
+      </w:r>
+      <w:r>
+        <w:rPr>
+          <w:rFonts w:ascii="Times New Roman" w:hAnsi="Times New Roman"/>
+          <w:b/>
+          <w:sz w:val="24"/>
+        </w:rPr>
+        <w:t>Psychology of Sport and Exercise</w:t>
+      </w:r>
+      <w:r>
+        <w:rPr>
+          <w:rFonts w:ascii="Times New Roman" w:hAnsi="Times New Roman"/>
+          <w:i w:val="0"/>
+          <w:sz w:val="24"/>
+        </w:rPr>
+        <w:t>, v. 59, e102110, 2022. DOI: https://doi.org/10.1016/j.psychsport.2021.102110.</w:t>
+      </w:r>
+    </w:p>
+    <w:p>
+      <w:pPr>
+        <w:spacing w:before="0" w:after="120" w:line="240" w:lineRule="auto"/>
+        <w:ind w:left="0" w:firstLine="0"/>
+        <w:jc w:val="left"/>
+      </w:pPr>
+      <w:r>
+        <w:rPr>
+          <w:rFonts w:ascii="Times New Roman" w:hAnsi="Times New Roman"/>
+          <w:i w:val="0"/>
+          <w:sz w:val="24"/>
+        </w:rPr>
+        <w:t xml:space="preserve">ROCHA, P. G. M. D.; LOPES, J. L.; MORAES, S. M. F. D. Efeito da alteração ambiental sobre componentes psicológicos e parâmetros fisiológicos durante corrida em atletas. </w:t>
+      </w:r>
+      <w:r>
+        <w:rPr>
+          <w:rFonts w:ascii="Times New Roman" w:hAnsi="Times New Roman"/>
+          <w:b/>
+          <w:sz w:val="24"/>
+        </w:rPr>
+        <w:t>Psicologia: Teoria e Pesquisa</w:t>
+      </w:r>
+      <w:r>
+        <w:rPr>
+          <w:rFonts w:ascii="Times New Roman" w:hAnsi="Times New Roman"/>
+          <w:i w:val="0"/>
+          <w:sz w:val="24"/>
+        </w:rPr>
+        <w:t>, v. 26, n. 2, p. 381-386, 2010. DOI: https://doi.org/10.1590/S0102-37722010000200020.</w:t>
+      </w:r>
+    </w:p>
+    <w:p>
+      <w:pPr>
+        <w:spacing w:before="0" w:after="120" w:line="240" w:lineRule="auto"/>
+        <w:ind w:left="0" w:firstLine="0"/>
+        <w:jc w:val="left"/>
+      </w:pPr>
+      <w:r>
+        <w:rPr>
+          <w:rFonts w:ascii="Times New Roman" w:hAnsi="Times New Roman"/>
+          <w:i w:val="0"/>
+          <w:sz w:val="24"/>
+        </w:rPr>
+        <w:t xml:space="preserve">ROHLFS, I. C. P. D. M. et al. A Escala de Humor de Brunel (Brums): instrumento para detecção precoce da síndrome do excesso de treinamento. </w:t>
+      </w:r>
+      <w:r>
+        <w:rPr>
+          <w:rFonts w:ascii="Times New Roman" w:hAnsi="Times New Roman"/>
+          <w:b/>
+          <w:sz w:val="24"/>
+        </w:rPr>
+        <w:t>Revista Brasileira de Medicina do Esporte</w:t>
+      </w:r>
+      <w:r>
+        <w:rPr>
+          <w:rFonts w:ascii="Times New Roman" w:hAnsi="Times New Roman"/>
+          <w:i w:val="0"/>
+          <w:sz w:val="24"/>
+        </w:rPr>
+        <w:t>, v. 14, n. 3, p. 176-181, 2008. DOI: https://doi.org/10.1590/S1517-86922008000300003.</w:t>
+      </w:r>
+    </w:p>
+    <w:p>
+      <w:pPr>
+        <w:spacing w:before="0" w:after="120" w:line="240" w:lineRule="auto"/>
+        <w:ind w:left="0" w:firstLine="0"/>
+        <w:jc w:val="left"/>
+      </w:pPr>
+      <w:r>
+        <w:rPr>
+          <w:rFonts w:ascii="Times New Roman" w:hAnsi="Times New Roman"/>
+          <w:i w:val="0"/>
+          <w:sz w:val="24"/>
+        </w:rPr>
+        <w:t xml:space="preserve">SAAL, C. et al. How different defensive formations affect physical match demands in the German Handball-Bundesliga: a comparison of the attacking and defending team. </w:t>
+      </w:r>
+      <w:r>
+        <w:rPr>
+          <w:rFonts w:ascii="Times New Roman" w:hAnsi="Times New Roman"/>
+          <w:b/>
+          <w:sz w:val="24"/>
+        </w:rPr>
+        <w:t>Frontiers in Sports and Active Living</w:t>
+      </w:r>
+      <w:r>
+        <w:rPr>
+          <w:rFonts w:ascii="Times New Roman" w:hAnsi="Times New Roman"/>
+          <w:i w:val="0"/>
+          <w:sz w:val="24"/>
+        </w:rPr>
+        <w:t>, v. 8, e1811523, 2026. DOI: https://doi.org/10.3389/fspor.2026.1811523.</w:t>
+      </w:r>
+    </w:p>
+    <w:p>
+      <w:pPr>
+        <w:spacing w:before="0" w:after="120" w:line="240" w:lineRule="auto"/>
+        <w:ind w:left="0" w:firstLine="0"/>
+        <w:jc w:val="left"/>
+      </w:pPr>
+      <w:r>
+        <w:rPr>
+          <w:rFonts w:ascii="Times New Roman" w:hAnsi="Times New Roman"/>
+          <w:i w:val="0"/>
+          <w:sz w:val="24"/>
+        </w:rPr>
+        <w:t xml:space="preserve">SAHLI, F. et al. Enhancing Skills, Mood, and Performance in Overweight Handball Players: Exploring Individual vs. Collective Verbal Encouragement Strategies. </w:t>
+      </w:r>
+      <w:r>
+        <w:rPr>
+          <w:rFonts w:ascii="Times New Roman" w:hAnsi="Times New Roman"/>
+          <w:b/>
+          <w:sz w:val="24"/>
+        </w:rPr>
+        <w:t>Children</w:t>
+      </w:r>
+      <w:r>
+        <w:rPr>
+          <w:rFonts w:ascii="Times New Roman" w:hAnsi="Times New Roman"/>
+          <w:i w:val="0"/>
+          <w:sz w:val="24"/>
+        </w:rPr>
+        <w:t>, v. 11, n. 4, e432, 2024. DOI: https://doi.org/10.3390/children11040432.</w:t>
+      </w:r>
+    </w:p>
+    <w:p>
+      <w:pPr>
+        <w:spacing w:before="0" w:after="120" w:line="240" w:lineRule="auto"/>
+        <w:ind w:left="0" w:firstLine="0"/>
+        <w:jc w:val="left"/>
+      </w:pPr>
+      <w:r>
+        <w:rPr>
+          <w:rFonts w:ascii="Times New Roman" w:hAnsi="Times New Roman"/>
+          <w:i w:val="0"/>
+          <w:sz w:val="24"/>
+        </w:rPr>
+        <w:t xml:space="preserve">SAHLI, F. et al. The Effects of Combined Verbal Encouragement and Technical Instruction on Technical Skills and Psychophysiological Responses During Small-Sided Handball Games Exercise in Physical Education. </w:t>
+      </w:r>
+      <w:r>
+        <w:rPr>
+          <w:rFonts w:ascii="Times New Roman" w:hAnsi="Times New Roman"/>
+          <w:b/>
+          <w:sz w:val="24"/>
+        </w:rPr>
+        <w:t>Frontiers in Psychology</w:t>
+      </w:r>
+      <w:r>
+        <w:rPr>
+          <w:rFonts w:ascii="Times New Roman" w:hAnsi="Times New Roman"/>
+          <w:i w:val="0"/>
+          <w:sz w:val="24"/>
+        </w:rPr>
+        <w:t>, v. 13, e902088, 2022. DOI: https://doi.org/10.3389/fpsyg.2022.902088.</w:t>
+      </w:r>
+    </w:p>
+    <w:p>
+      <w:pPr>
+        <w:spacing w:before="0" w:after="120" w:line="240" w:lineRule="auto"/>
+        <w:ind w:left="0" w:firstLine="0"/>
+        <w:jc w:val="left"/>
+      </w:pPr>
+      <w:r>
+        <w:rPr>
+          <w:rFonts w:ascii="Times New Roman" w:hAnsi="Times New Roman"/>
+          <w:i w:val="0"/>
+          <w:sz w:val="24"/>
+        </w:rPr>
+        <w:t xml:space="preserve">SANSONE, P. et al. Breaking Down the 3 × 3 Basketball Game: How Tournament Phase, Game Outcome, and Final Score Margin Impact Physiological, Perceptual, and Mental Demands. </w:t>
+      </w:r>
+      <w:r>
+        <w:rPr>
+          <w:rFonts w:ascii="Times New Roman" w:hAnsi="Times New Roman"/>
+          <w:b/>
+          <w:sz w:val="24"/>
+        </w:rPr>
+        <w:t>International Journal of Sports Physiology and Performance</w:t>
+      </w:r>
+      <w:r>
+        <w:rPr>
+          <w:rFonts w:ascii="Times New Roman" w:hAnsi="Times New Roman"/>
+          <w:i w:val="0"/>
+          <w:sz w:val="24"/>
+        </w:rPr>
+        <w:t>, v. 20, n. 6, p. 834-839, 2025. DOI: https://doi.org/10.1123/ijspp.2024-0516.</w:t>
+      </w:r>
+    </w:p>
+    <w:p>
+      <w:pPr>
+        <w:spacing w:before="0" w:after="120" w:line="240" w:lineRule="auto"/>
+        <w:ind w:left="0" w:firstLine="0"/>
+        <w:jc w:val="left"/>
+      </w:pPr>
+      <w:r>
+        <w:rPr>
+          <w:rFonts w:ascii="Times New Roman" w:hAnsi="Times New Roman"/>
+          <w:i w:val="0"/>
+          <w:sz w:val="24"/>
+        </w:rPr>
+        <w:t xml:space="preserve">SAVITZKY, A.; GOLAY, M. J. E. Smoothing and Differentiation of Data by Simplified Least Squares Procedures. </w:t>
+      </w:r>
+      <w:r>
+        <w:rPr>
+          <w:rFonts w:ascii="Times New Roman" w:hAnsi="Times New Roman"/>
+          <w:b/>
+          <w:sz w:val="24"/>
+        </w:rPr>
+        <w:t>Analytical Chemistry</w:t>
+      </w:r>
+      <w:r>
+        <w:rPr>
+          <w:rFonts w:ascii="Times New Roman" w:hAnsi="Times New Roman"/>
+          <w:i w:val="0"/>
+          <w:sz w:val="24"/>
+        </w:rPr>
+        <w:t>, v. 36, n. 8, p. 1627-1639, 1964. DOI: https://doi.org/10.1021/ac60214a047.</w:t>
+      </w:r>
+    </w:p>
+    <w:p>
+      <w:pPr>
+        <w:spacing w:before="0" w:after="120" w:line="240" w:lineRule="auto"/>
+        <w:ind w:left="0" w:firstLine="0"/>
+        <w:jc w:val="left"/>
+      </w:pPr>
+      <w:r>
+        <w:rPr>
+          <w:rFonts w:ascii="Times New Roman" w:hAnsi="Times New Roman"/>
+          <w:i w:val="0"/>
+          <w:sz w:val="24"/>
+        </w:rPr>
+        <w:t xml:space="preserve">SAW, A. E.; MAIN, L. C.; GASTIN, P. B. Monitoring the athlete training response: subjective self-reported measures trump commonly used objective measures: a systematic review. </w:t>
+      </w:r>
+      <w:r>
+        <w:rPr>
+          <w:rFonts w:ascii="Times New Roman" w:hAnsi="Times New Roman"/>
+          <w:b/>
+          <w:sz w:val="24"/>
+        </w:rPr>
+        <w:t>British Journal of Sports Medicine</w:t>
+      </w:r>
+      <w:r>
+        <w:rPr>
+          <w:rFonts w:ascii="Times New Roman" w:hAnsi="Times New Roman"/>
+          <w:i w:val="0"/>
+          <w:sz w:val="24"/>
+        </w:rPr>
+        <w:t>, v. 50, n. 5, p. 281-291, 2016. DOI: https://doi.org/10.1136/bjsports-2015-094758.</w:t>
+      </w:r>
+    </w:p>
+    <w:p>
+      <w:pPr>
+        <w:spacing w:before="0" w:after="120" w:line="240" w:lineRule="auto"/>
+        <w:ind w:left="0" w:firstLine="0"/>
+        <w:jc w:val="left"/>
+      </w:pPr>
+      <w:r>
+        <w:rPr>
+          <w:rFonts w:ascii="Times New Roman" w:hAnsi="Times New Roman"/>
+          <w:i w:val="0"/>
+          <w:sz w:val="24"/>
+        </w:rPr>
+        <w:t xml:space="preserve">SCHIAVINI, C.; ARENA, R. Influence of the semi-final stage on mood in female handball athletes at Unisinos Championship 2008. </w:t>
+      </w:r>
+      <w:r>
+        <w:rPr>
+          <w:rFonts w:ascii="Times New Roman" w:hAnsi="Times New Roman"/>
+          <w:b/>
+          <w:sz w:val="24"/>
+        </w:rPr>
+        <w:t>FIEP Bulletin</w:t>
+      </w:r>
+      <w:r>
+        <w:rPr>
+          <w:rFonts w:ascii="Times New Roman" w:hAnsi="Times New Roman"/>
+          <w:i w:val="0"/>
+          <w:sz w:val="24"/>
+        </w:rPr>
+        <w:t>, v. 80, edição especial, p. 625-628, 2010.</w:t>
+      </w:r>
+    </w:p>
+    <w:p>
+      <w:pPr>
+        <w:spacing w:before="0" w:after="120" w:line="240" w:lineRule="auto"/>
+        <w:ind w:left="0" w:firstLine="0"/>
+        <w:jc w:val="left"/>
+      </w:pPr>
+      <w:r>
+        <w:rPr>
+          <w:rFonts w:ascii="Times New Roman" w:hAnsi="Times New Roman"/>
+          <w:i w:val="0"/>
+          <w:sz w:val="24"/>
+        </w:rPr>
+        <w:t xml:space="preserve">SELMI, O. et al. Coaches’ verbal encouragement in soccer: A systematic review of its effects on internal training load, physical and time-motion performance, and technical skills. </w:t>
+      </w:r>
+      <w:r>
+        <w:rPr>
+          <w:rFonts w:ascii="Times New Roman" w:hAnsi="Times New Roman"/>
+          <w:b/>
+          <w:sz w:val="24"/>
+        </w:rPr>
+        <w:t>Journal of Sports Sciences</w:t>
+      </w:r>
+      <w:r>
+        <w:rPr>
+          <w:rFonts w:ascii="Times New Roman" w:hAnsi="Times New Roman"/>
+          <w:i w:val="0"/>
+          <w:sz w:val="24"/>
+        </w:rPr>
+        <w:t>, p. 1-15, 2026. DOI: https://doi.org/10.1080/02640414.2026.2735708.</w:t>
+      </w:r>
+    </w:p>
+    <w:p>
+      <w:pPr>
+        <w:spacing w:before="0" w:after="120" w:line="240" w:lineRule="auto"/>
+        <w:ind w:left="0" w:firstLine="0"/>
+        <w:jc w:val="left"/>
+      </w:pPr>
+      <w:r>
+        <w:rPr>
+          <w:rFonts w:ascii="Times New Roman" w:hAnsi="Times New Roman"/>
+          <w:i w:val="0"/>
+          <w:sz w:val="24"/>
+        </w:rPr>
+        <w:t xml:space="preserve">SELMI, O. et al. Monitoring mood state to improve performance in soccer players: A brief review. </w:t>
+      </w:r>
+      <w:r>
+        <w:rPr>
+          <w:rFonts w:ascii="Times New Roman" w:hAnsi="Times New Roman"/>
+          <w:b/>
+          <w:sz w:val="24"/>
+        </w:rPr>
+        <w:t>Frontiers in Psychology</w:t>
+      </w:r>
+      <w:r>
+        <w:rPr>
+          <w:rFonts w:ascii="Times New Roman" w:hAnsi="Times New Roman"/>
+          <w:i w:val="0"/>
+          <w:sz w:val="24"/>
+        </w:rPr>
+        <w:t>, v. 14, e1095238, 2023. DOI: https://doi.org/10.3389/fpsyg.2023.1095238.</w:t>
+      </w:r>
+    </w:p>
+    <w:p>
+      <w:pPr>
+        <w:spacing w:before="0" w:after="120" w:line="240" w:lineRule="auto"/>
+        <w:ind w:left="0" w:firstLine="0"/>
+        <w:jc w:val="left"/>
+      </w:pPr>
+      <w:r>
+        <w:rPr>
+          <w:rFonts w:ascii="Times New Roman" w:hAnsi="Times New Roman"/>
+          <w:i w:val="0"/>
+          <w:sz w:val="24"/>
+        </w:rPr>
+        <w:t xml:space="preserve">SOTO, D.; GARCÍA-HERRERO, J. A.; CARCEDO, R. J. Well-Being and Throwing Speed of Women Handball Players Affected by Feedback. </w:t>
+      </w:r>
+      <w:r>
+        <w:rPr>
+          <w:rFonts w:ascii="Times New Roman" w:hAnsi="Times New Roman"/>
+          <w:b/>
+          <w:sz w:val="24"/>
+        </w:rPr>
+        <w:t>International Journal of Environmental Research and Public Health</w:t>
+      </w:r>
+      <w:r>
+        <w:rPr>
+          <w:rFonts w:ascii="Times New Roman" w:hAnsi="Times New Roman"/>
+          <w:i w:val="0"/>
+          <w:sz w:val="24"/>
+        </w:rPr>
+        <w:t>, v. 17, n. 17, e6064, 2020. DOI: https://doi.org/10.3390/ijerph17176064.</w:t>
+      </w:r>
+    </w:p>
+    <w:p>
+      <w:pPr>
+        <w:spacing w:before="0" w:after="120" w:line="240" w:lineRule="auto"/>
+        <w:ind w:left="0" w:firstLine="0"/>
+        <w:jc w:val="left"/>
+      </w:pPr>
+      <w:r>
+        <w:rPr>
+          <w:rFonts w:ascii="Times New Roman" w:hAnsi="Times New Roman"/>
+          <w:i w:val="0"/>
+          <w:sz w:val="24"/>
+        </w:rPr>
+        <w:t xml:space="preserve">STAIANO, W. et al. Overcoming mental fatigue through mindfulness: Improving physical and cognitive performance in elite handball players. </w:t>
+      </w:r>
+      <w:r>
+        <w:rPr>
+          <w:rFonts w:ascii="Times New Roman" w:hAnsi="Times New Roman"/>
+          <w:b/>
+          <w:sz w:val="24"/>
+        </w:rPr>
+        <w:t>Journal of Science and Medicine in Sport</w:t>
+      </w:r>
+      <w:r>
+        <w:rPr>
+          <w:rFonts w:ascii="Times New Roman" w:hAnsi="Times New Roman"/>
+          <w:i w:val="0"/>
+          <w:sz w:val="24"/>
+        </w:rPr>
+        <w:t>, v. 29, n. 1, p. 91-99, 2026. DOI: https://doi.org/10.1016/j.jsams.2025.08.004.</w:t>
+      </w:r>
+    </w:p>
+    <w:p>
+      <w:pPr>
+        <w:spacing w:before="0" w:after="120" w:line="240" w:lineRule="auto"/>
+        <w:ind w:left="0" w:firstLine="0"/>
+        <w:jc w:val="left"/>
+      </w:pPr>
+      <w:r>
+        <w:rPr>
+          <w:rFonts w:ascii="Times New Roman" w:hAnsi="Times New Roman"/>
+          <w:i w:val="0"/>
+          <w:sz w:val="24"/>
+        </w:rPr>
+        <w:t xml:space="preserve">STEVENS, C. J. et al. Affective Determinants of Physical Activity: A Conceptual Framework and Narrative Review. </w:t>
+      </w:r>
+      <w:r>
+        <w:rPr>
+          <w:rFonts w:ascii="Times New Roman" w:hAnsi="Times New Roman"/>
+          <w:b/>
+          <w:sz w:val="24"/>
+        </w:rPr>
+        <w:t>Frontiers in Psychology</w:t>
+      </w:r>
+      <w:r>
+        <w:rPr>
+          <w:rFonts w:ascii="Times New Roman" w:hAnsi="Times New Roman"/>
+          <w:i w:val="0"/>
+          <w:sz w:val="24"/>
+        </w:rPr>
+        <w:t>, v. 11, e568331, 2020. DOI: https://doi.org/10.3389/fpsyg.2020.568331.</w:t>
+      </w:r>
+    </w:p>
+    <w:p>
+      <w:pPr>
+        <w:spacing w:before="0" w:after="120" w:line="240" w:lineRule="auto"/>
+        <w:ind w:left="0" w:firstLine="0"/>
+        <w:jc w:val="left"/>
+      </w:pPr>
+      <w:r>
+        <w:rPr>
+          <w:rFonts w:ascii="Times New Roman" w:hAnsi="Times New Roman"/>
+          <w:i w:val="0"/>
+          <w:sz w:val="24"/>
+        </w:rPr>
+        <w:t xml:space="preserve">TAMMINEN, K. A. et al. A daily diary study of interpersonal emotion regulation, the social environment, and team performance among university athletes. </w:t>
+      </w:r>
+      <w:r>
+        <w:rPr>
+          <w:rFonts w:ascii="Times New Roman" w:hAnsi="Times New Roman"/>
+          <w:b/>
+          <w:sz w:val="24"/>
+        </w:rPr>
+        <w:t>Psychology of Sport and Exercise</w:t>
+      </w:r>
+      <w:r>
+        <w:rPr>
+          <w:rFonts w:ascii="Times New Roman" w:hAnsi="Times New Roman"/>
+          <w:i w:val="0"/>
+          <w:sz w:val="24"/>
+        </w:rPr>
+        <w:t>, v. 45, e101566, 2019. DOI: https://doi.org/10.1016/j.psychsport.2019.101566.</w:t>
+      </w:r>
+    </w:p>
+    <w:p>
+      <w:pPr>
+        <w:spacing w:before="0" w:after="120" w:line="240" w:lineRule="auto"/>
+        <w:ind w:left="0" w:firstLine="0"/>
+        <w:jc w:val="left"/>
+      </w:pPr>
+      <w:r>
+        <w:rPr>
+          <w:rFonts w:ascii="Times New Roman" w:hAnsi="Times New Roman"/>
+          <w:i w:val="0"/>
+          <w:sz w:val="24"/>
+        </w:rPr>
+        <w:t xml:space="preserve">TAN, C. et al. The structural validity and latent profile characteristics of the Abbreviated Profile of Mood States among Chinese athletes. </w:t>
+      </w:r>
+      <w:r>
+        <w:rPr>
+          <w:rFonts w:ascii="Times New Roman" w:hAnsi="Times New Roman"/>
+          <w:b/>
+          <w:sz w:val="24"/>
+        </w:rPr>
+        <w:t>BMC Psychiatry</w:t>
+      </w:r>
+      <w:r>
+        <w:rPr>
+          <w:rFonts w:ascii="Times New Roman" w:hAnsi="Times New Roman"/>
+          <w:i w:val="0"/>
+          <w:sz w:val="24"/>
+        </w:rPr>
+        <w:t>, v. 24, n. 1, e636, 2024. DOI: https://doi.org/10.1186/s12888-024-06092-5.</w:t>
+      </w:r>
+    </w:p>
+    <w:p>
+      <w:pPr>
+        <w:spacing w:before="0" w:after="120" w:line="240" w:lineRule="auto"/>
+        <w:ind w:left="0" w:firstLine="0"/>
+        <w:jc w:val="left"/>
+      </w:pPr>
+      <w:r>
+        <w:rPr>
+          <w:rFonts w:ascii="Times New Roman" w:hAnsi="Times New Roman"/>
+          <w:i w:val="0"/>
+          <w:sz w:val="24"/>
+        </w:rPr>
+        <w:t xml:space="preserve">TERRY, P. C. et al. Validation of a Lithuanian-Language Version of the Brunel Mood Scale: The BRUMS-LTU. </w:t>
+      </w:r>
+      <w:r>
+        <w:rPr>
+          <w:rFonts w:ascii="Times New Roman" w:hAnsi="Times New Roman"/>
+          <w:b/>
+          <w:sz w:val="24"/>
+        </w:rPr>
+        <w:t>International Journal of Environmental Research and Public Health</w:t>
+      </w:r>
+      <w:r>
+        <w:rPr>
+          <w:rFonts w:ascii="Times New Roman" w:hAnsi="Times New Roman"/>
+          <w:i w:val="0"/>
+          <w:sz w:val="24"/>
+        </w:rPr>
+        <w:t>, v. 19, n. 8, e4867, 2022. DOI: https://doi.org/10.3390/ijerph19084867.</w:t>
+      </w:r>
+    </w:p>
+    <w:p>
+      <w:pPr>
+        <w:spacing w:before="0" w:after="120" w:line="240" w:lineRule="auto"/>
+        <w:ind w:left="0" w:firstLine="0"/>
+        <w:jc w:val="left"/>
+      </w:pPr>
+      <w:r>
+        <w:rPr>
+          <w:rFonts w:ascii="Times New Roman" w:hAnsi="Times New Roman"/>
+          <w:i w:val="0"/>
+          <w:sz w:val="24"/>
+        </w:rPr>
+        <w:t xml:space="preserve">TERRY, P. C.; LANE, A. M. Normative values for the profile of mood states for use with athletic samples. </w:t>
+      </w:r>
+      <w:r>
+        <w:rPr>
+          <w:rFonts w:ascii="Times New Roman" w:hAnsi="Times New Roman"/>
+          <w:b/>
+          <w:sz w:val="24"/>
+        </w:rPr>
+        <w:t>Journal of Applied Sport Psychology</w:t>
+      </w:r>
+      <w:r>
+        <w:rPr>
+          <w:rFonts w:ascii="Times New Roman" w:hAnsi="Times New Roman"/>
+          <w:i w:val="0"/>
+          <w:sz w:val="24"/>
+        </w:rPr>
+        <w:t>, v. 12, n. 1, p. 93-109, 2000. DOI: https://doi.org/10.1080/10413200008404215.</w:t>
+      </w:r>
+    </w:p>
+    <w:p>
+      <w:pPr>
+        <w:spacing w:before="0" w:after="120" w:line="240" w:lineRule="auto"/>
+        <w:ind w:left="0" w:firstLine="0"/>
+        <w:jc w:val="left"/>
+      </w:pPr>
+      <w:r>
+        <w:rPr>
+          <w:rFonts w:ascii="Times New Roman" w:hAnsi="Times New Roman"/>
+          <w:i w:val="0"/>
+          <w:sz w:val="24"/>
+        </w:rPr>
+        <w:t xml:space="preserve">TERRY, P. C.; PARSONS-SMITH, R. L. Mood Profiling for Sustainable Mental Health among Athletes. </w:t>
+      </w:r>
+      <w:r>
+        <w:rPr>
+          <w:rFonts w:ascii="Times New Roman" w:hAnsi="Times New Roman"/>
+          <w:b/>
+          <w:sz w:val="24"/>
+        </w:rPr>
+        <w:t>Sustainability</w:t>
+      </w:r>
+      <w:r>
+        <w:rPr>
+          <w:rFonts w:ascii="Times New Roman" w:hAnsi="Times New Roman"/>
+          <w:i w:val="0"/>
+          <w:sz w:val="24"/>
+        </w:rPr>
+        <w:t>, v. 13, n. 11, e6116, 2021. DOI: https://doi.org/10.3390/su13116116.</w:t>
+      </w:r>
+    </w:p>
+    <w:p>
+      <w:pPr>
+        <w:spacing w:before="0" w:after="120" w:line="240" w:lineRule="auto"/>
+        <w:ind w:left="0" w:firstLine="0"/>
+        <w:jc w:val="left"/>
+      </w:pPr>
+      <w:r>
+        <w:rPr>
+          <w:rFonts w:ascii="Times New Roman" w:hAnsi="Times New Roman"/>
+          <w:i w:val="0"/>
+          <w:sz w:val="24"/>
+        </w:rPr>
+        <w:t xml:space="preserve">TERRY, P.; LANE, A.; FOGARTY, G. Construct validity of the Profile of Mood States — Adolescents for use with adults. </w:t>
+      </w:r>
+      <w:r>
+        <w:rPr>
+          <w:rFonts w:ascii="Times New Roman" w:hAnsi="Times New Roman"/>
+          <w:b/>
+          <w:sz w:val="24"/>
+        </w:rPr>
+        <w:t>Psychology of Sport and Exercise</w:t>
+      </w:r>
+      <w:r>
+        <w:rPr>
+          <w:rFonts w:ascii="Times New Roman" w:hAnsi="Times New Roman"/>
+          <w:i w:val="0"/>
+          <w:sz w:val="24"/>
+        </w:rPr>
+        <w:t>, v. 4, n. 2, p. 125-139, 2003. DOI: https://doi.org/10.1016/S1469-0292(01)00035-8.</w:t>
+      </w:r>
+    </w:p>
+    <w:p>
+      <w:pPr>
+        <w:spacing w:before="0" w:after="120" w:line="240" w:lineRule="auto"/>
+        <w:ind w:left="0" w:firstLine="0"/>
+        <w:jc w:val="left"/>
+      </w:pPr>
+      <w:r>
+        <w:rPr>
+          <w:rFonts w:ascii="Times New Roman" w:hAnsi="Times New Roman"/>
+          <w:i w:val="0"/>
+          <w:sz w:val="24"/>
+        </w:rPr>
+        <w:t xml:space="preserve">TREJO-SILVA, A. et al. Attacking performance analysis during 2-minute suspensions in female handball games at the Rio 2016 Olympic Games. </w:t>
+      </w:r>
+      <w:r>
+        <w:rPr>
+          <w:rFonts w:ascii="Times New Roman" w:hAnsi="Times New Roman"/>
+          <w:b/>
+          <w:sz w:val="24"/>
+        </w:rPr>
+        <w:t>Kinesiology</w:t>
+      </w:r>
+      <w:r>
+        <w:rPr>
+          <w:rFonts w:ascii="Times New Roman" w:hAnsi="Times New Roman"/>
+          <w:i w:val="0"/>
+          <w:sz w:val="24"/>
+        </w:rPr>
+        <w:t>, v. 57, n. 1, p. 3-14, 2025. DOI: https://doi.org/10.26582/k.57.1.1.</w:t>
+      </w:r>
+    </w:p>
+    <w:p>
+      <w:pPr>
+        <w:spacing w:before="0" w:after="120" w:line="240" w:lineRule="auto"/>
+        <w:ind w:left="0" w:firstLine="0"/>
+        <w:jc w:val="left"/>
+      </w:pPr>
+      <w:r>
+        <w:rPr>
+          <w:rFonts w:ascii="Times New Roman" w:hAnsi="Times New Roman"/>
+          <w:i w:val="0"/>
+          <w:sz w:val="24"/>
+        </w:rPr>
+        <w:t xml:space="preserve">TRUONG, C.; OUDRE, L.; VAYATIS, N. Selective review of offline change point detection methods. </w:t>
+      </w:r>
+      <w:r>
+        <w:rPr>
+          <w:rFonts w:ascii="Times New Roman" w:hAnsi="Times New Roman"/>
+          <w:b/>
+          <w:sz w:val="24"/>
+        </w:rPr>
+        <w:t>Signal Processing</w:t>
+      </w:r>
+      <w:r>
+        <w:rPr>
+          <w:rFonts w:ascii="Times New Roman" w:hAnsi="Times New Roman"/>
+          <w:i w:val="0"/>
+          <w:sz w:val="24"/>
+        </w:rPr>
+        <w:t>, v. 167, e107299, 2020. DOI: https://doi.org/10.1016/j.sigpro.2019.107299.</w:t>
+      </w:r>
+    </w:p>
+    <w:p>
+      <w:pPr>
+        <w:spacing w:before="0" w:after="120" w:line="240" w:lineRule="auto"/>
+        <w:ind w:left="0" w:firstLine="0"/>
+        <w:jc w:val="left"/>
+      </w:pPr>
+      <w:r>
+        <w:rPr>
+          <w:rFonts w:ascii="Times New Roman" w:hAnsi="Times New Roman"/>
+          <w:i w:val="0"/>
+          <w:sz w:val="24"/>
+        </w:rPr>
+        <w:t xml:space="preserve">VALDESALICI, A. et al. Effects of non-functional overreaching and overtraining syndrome on psychological and cognitive functioning in elite athletes: A systematic review. </w:t>
+      </w:r>
+      <w:r>
+        <w:rPr>
+          <w:rFonts w:ascii="Times New Roman" w:hAnsi="Times New Roman"/>
+          <w:b/>
+          <w:sz w:val="24"/>
+        </w:rPr>
+        <w:t>Psychology of Sport and Exercise</w:t>
+      </w:r>
+      <w:r>
+        <w:rPr>
+          <w:rFonts w:ascii="Times New Roman" w:hAnsi="Times New Roman"/>
+          <w:i w:val="0"/>
+          <w:sz w:val="24"/>
+        </w:rPr>
+        <w:t>, v. 84, e103079, 2026. DOI: https://doi.org/10.1016/j.psychsport.2026.103079.</w:t>
+      </w:r>
+    </w:p>
+    <w:p>
+      <w:pPr>
+        <w:spacing w:before="0" w:after="120" w:line="240" w:lineRule="auto"/>
+        <w:ind w:left="0" w:firstLine="0"/>
+        <w:jc w:val="left"/>
+      </w:pPr>
+      <w:r>
+        <w:rPr>
+          <w:rFonts w:ascii="Times New Roman" w:hAnsi="Times New Roman"/>
+          <w:i w:val="0"/>
+          <w:sz w:val="24"/>
+        </w:rPr>
+        <w:t xml:space="preserve">VLACHOPOULOS, S. P.; LANE, A. M.; TERRY, P. C. A Greek Translation of the Brunel Mood Scale: Initial Validation among Exercise Participants and Inactive Adults. </w:t>
+      </w:r>
+      <w:r>
+        <w:rPr>
+          <w:rFonts w:ascii="Times New Roman" w:hAnsi="Times New Roman"/>
+          <w:b/>
+          <w:sz w:val="24"/>
+        </w:rPr>
+        <w:t>Sports</w:t>
+      </w:r>
+      <w:r>
+        <w:rPr>
+          <w:rFonts w:ascii="Times New Roman" w:hAnsi="Times New Roman"/>
+          <w:i w:val="0"/>
+          <w:sz w:val="24"/>
+        </w:rPr>
+        <w:t>, v. 11, n. 12, e234, 2023. DOI: https://doi.org/10.3390/sports11120234.</w:t>
+      </w:r>
+    </w:p>
+    <w:p>
+      <w:pPr>
+        <w:spacing w:before="0" w:after="120" w:line="240" w:lineRule="auto"/>
+        <w:ind w:left="0" w:firstLine="0"/>
+        <w:jc w:val="left"/>
+      </w:pPr>
+      <w:r>
+        <w:rPr>
+          <w:rFonts w:ascii="Times New Roman" w:hAnsi="Times New Roman"/>
+          <w:i w:val="0"/>
+          <w:sz w:val="24"/>
+        </w:rPr>
+        <w:t xml:space="preserve">WAGNER, H.; RADIC, V.; HINZ, M. Differences in game-based performance by playing position in young elite male team handball players. </w:t>
+      </w:r>
+      <w:r>
+        <w:rPr>
+          <w:rFonts w:ascii="Times New Roman" w:hAnsi="Times New Roman"/>
+          <w:b/>
+          <w:sz w:val="24"/>
+        </w:rPr>
+        <w:t>Frontiers in Sports and Active Living</w:t>
+      </w:r>
+      <w:r>
+        <w:rPr>
+          <w:rFonts w:ascii="Times New Roman" w:hAnsi="Times New Roman"/>
+          <w:i w:val="0"/>
+          <w:sz w:val="24"/>
+        </w:rPr>
+        <w:t>, v. 7, e1688078, 2025. DOI: https://doi.org/10.3389/fspor.2025.1688078.</w:t>
+      </w:r>
+    </w:p>
+    <w:p>
+      <w:pPr>
+        <w:spacing w:before="0" w:after="120" w:line="240" w:lineRule="auto"/>
+        <w:ind w:left="0" w:firstLine="0"/>
+        <w:jc w:val="left"/>
+      </w:pPr>
+      <w:r>
+        <w:rPr>
+          <w:rFonts w:ascii="Times New Roman" w:hAnsi="Times New Roman"/>
+          <w:i w:val="0"/>
+          <w:sz w:val="24"/>
+        </w:rPr>
+        <w:t xml:space="preserve">WALSH, E. et al. Sleep and Circadian Interventions to Improve Athletes’ Mental Health, Mood and Well-Being: A Systematic Review and Meta-Analysis. </w:t>
+      </w:r>
+      <w:r>
+        <w:rPr>
+          <w:rFonts w:ascii="Times New Roman" w:hAnsi="Times New Roman"/>
+          <w:b/>
+          <w:sz w:val="24"/>
+        </w:rPr>
+        <w:t>Sports Medicine</w:t>
+      </w:r>
+      <w:r>
+        <w:rPr>
+          <w:rFonts w:ascii="Times New Roman" w:hAnsi="Times New Roman"/>
+          <w:i w:val="0"/>
+          <w:sz w:val="24"/>
+        </w:rPr>
+        <w:t>, v. 56, n. 4, p. 997-1011, 2026. DOI: https://doi.org/10.1007/s40279-025-02387-z.</w:t>
+      </w:r>
+    </w:p>
+    <w:p>
+      <w:pPr>
+        <w:spacing w:before="0" w:after="120" w:line="240" w:lineRule="auto"/>
+        <w:ind w:left="0" w:firstLine="0"/>
+        <w:jc w:val="left"/>
+      </w:pPr>
+      <w:r>
+        <w:rPr>
+          <w:rFonts w:ascii="Times New Roman" w:hAnsi="Times New Roman"/>
+          <w:i w:val="0"/>
+          <w:sz w:val="24"/>
+        </w:rPr>
+        <w:t xml:space="preserve">WALSH, N. P. et al. Sleep and the athlete: narrative review and 2021 expert consensus recommendations. </w:t>
+      </w:r>
+      <w:r>
+        <w:rPr>
+          <w:rFonts w:ascii="Times New Roman" w:hAnsi="Times New Roman"/>
+          <w:b/>
+          <w:sz w:val="24"/>
+        </w:rPr>
+        <w:t>British Journal of Sports Medicine</w:t>
+      </w:r>
+      <w:r>
+        <w:rPr>
+          <w:rFonts w:ascii="Times New Roman" w:hAnsi="Times New Roman"/>
+          <w:i w:val="0"/>
+          <w:sz w:val="24"/>
+        </w:rPr>
+        <w:t>, v. 55, n. 7, p. 356-368, 2021. DOI: https://doi.org/10.1136/bjsports-2020-102025.</w:t>
+      </w:r>
+    </w:p>
+    <w:p>
+      <w:pPr>
+        <w:spacing w:before="0" w:after="120" w:line="240" w:lineRule="auto"/>
+        <w:ind w:left="0" w:firstLine="0"/>
+        <w:jc w:val="left"/>
+      </w:pPr>
+      <w:r>
+        <w:rPr>
+          <w:rFonts w:ascii="Times New Roman" w:hAnsi="Times New Roman"/>
+          <w:i w:val="0"/>
+          <w:sz w:val="24"/>
+        </w:rPr>
+        <w:t xml:space="preserve">WANG, X. et al. The association between team behaviors and competitive anxiety among team-handball players: the mediating role of achievement goals. </w:t>
+      </w:r>
+      <w:r>
+        <w:rPr>
+          <w:rFonts w:ascii="Times New Roman" w:hAnsi="Times New Roman"/>
+          <w:b/>
+          <w:sz w:val="24"/>
+        </w:rPr>
+        <w:t>Frontiers in Psychology</w:t>
+      </w:r>
+      <w:r>
+        <w:rPr>
+          <w:rFonts w:ascii="Times New Roman" w:hAnsi="Times New Roman"/>
+          <w:i w:val="0"/>
+          <w:sz w:val="24"/>
+        </w:rPr>
+        <w:t>, v. 15, e1417562, 2024. DOI: https://doi.org/10.3389/fpsyg.2024.1417562.</w:t>
+      </w:r>
+    </w:p>
+    <w:p>
+      <w:pPr>
+        <w:spacing w:before="0" w:after="120" w:line="240" w:lineRule="auto"/>
+        <w:ind w:left="0" w:firstLine="0"/>
+        <w:jc w:val="left"/>
+      </w:pPr>
+      <w:r>
+        <w:rPr>
+          <w:rFonts w:ascii="Times New Roman" w:hAnsi="Times New Roman"/>
+          <w:i w:val="0"/>
+          <w:sz w:val="24"/>
+        </w:rPr>
+        <w:t xml:space="preserve">WATSON, D.; CLARK, L. A.; TELLEGEN, A. Development and validation of brief measures of positive and negative affect: The PANAS scales. </w:t>
+      </w:r>
+      <w:r>
+        <w:rPr>
+          <w:rFonts w:ascii="Times New Roman" w:hAnsi="Times New Roman"/>
+          <w:b/>
+          <w:sz w:val="24"/>
+        </w:rPr>
+        <w:t>Journal of Personality and Social Psychology</w:t>
+      </w:r>
+      <w:r>
+        <w:rPr>
+          <w:rFonts w:ascii="Times New Roman" w:hAnsi="Times New Roman"/>
+          <w:i w:val="0"/>
+          <w:sz w:val="24"/>
+        </w:rPr>
         <w:t>, v. 54, n. 6, p. 1063-1070, 1988. DOI: https://doi.org/10.1037/0022-3514.54.6.1063.</w:t>
+      </w:r>
+    </w:p>
+    <w:p>
+      <w:pPr>
+        <w:spacing w:before="0" w:after="120" w:line="240" w:lineRule="auto"/>
+        <w:ind w:left="0" w:firstLine="0"/>
+        <w:jc w:val="left"/>
+      </w:pPr>
+      <w:r>
+        <w:rPr>
+          <w:rFonts w:ascii="Times New Roman" w:hAnsi="Times New Roman"/>
+          <w:i w:val="0"/>
+          <w:sz w:val="24"/>
+        </w:rPr>
+        <w:t xml:space="preserve">WEAKLEY, J.; HALSON, S. L.; MUJIKA, I. Overtraining Syndrome Symptoms and Diagnosis in Athletes: Where Is the Research? A Systematic Review. </w:t>
+      </w:r>
+      <w:r>
+        <w:rPr>
+          <w:rFonts w:ascii="Times New Roman" w:hAnsi="Times New Roman"/>
+          <w:b/>
+          <w:sz w:val="24"/>
+        </w:rPr>
+        <w:t>International Journal of Sports Physiology and Performance</w:t>
+      </w:r>
+      <w:r>
+        <w:rPr>
+          <w:rFonts w:ascii="Times New Roman" w:hAnsi="Times New Roman"/>
+          <w:i w:val="0"/>
+          <w:sz w:val="24"/>
+        </w:rPr>
+        <w:t>, v. 17, n. 5, p. 675-681, 2022. DOI: https://doi.org/10.1123/ijspp.2021-0448.</w:t>
+      </w:r>
+    </w:p>
+    <w:p>
+      <w:pPr>
+        <w:spacing w:before="0" w:after="120" w:line="240" w:lineRule="auto"/>
+        <w:ind w:left="0" w:firstLine="0"/>
+        <w:jc w:val="left"/>
+      </w:pPr>
+      <w:r>
+        <w:rPr>
+          <w:rFonts w:ascii="Times New Roman" w:hAnsi="Times New Roman"/>
+          <w:i w:val="0"/>
+          <w:sz w:val="24"/>
+        </w:rPr>
+        <w:t xml:space="preserve">YILMAZ, O. et al. Verbal encouragement in coaching: enhancing small-sided game performance in youth basketball players. </w:t>
+      </w:r>
+      <w:r>
+        <w:rPr>
+          <w:rFonts w:ascii="Times New Roman" w:hAnsi="Times New Roman"/>
+          <w:b/>
+          <w:sz w:val="24"/>
+        </w:rPr>
+        <w:t>Frontiers in Psychology</w:t>
+      </w:r>
+      <w:r>
+        <w:rPr>
+          <w:rFonts w:ascii="Times New Roman" w:hAnsi="Times New Roman"/>
+          <w:i w:val="0"/>
+          <w:sz w:val="24"/>
+        </w:rPr>
+        <w:t>, v. 16, e1512803, 2025. DOI: https://doi.org/10.3389/fpsyg.2025.1512803.</w:t>
       </w:r>
     </w:p>
     <w:p>

</xml_diff>